<commit_message>
Updated the docx file by opening it from Word and saving again.
</commit_message>
<xml_diff>
--- a/assets/files/ein26-program.docx
+++ b/assets/files/ein26-program.docx
@@ -1,8 +1,8 @@
 
 <file path=word/document.xml><?xml version="1.0" encoding="utf-8"?>
-<w:document xmlns:ns1="http://schemas.openxmlformats.org/markup-compatibility/2006" xmlns:ns2="http://schemas.microsoft.com/office/word/2010/wordml" xmlns:w="http://schemas.openxmlformats.org/wordprocessingml/2006/main" ns1:Ignorable="w14 w15 w16se w16cid w16 w16cex w16sdtdh w16sdtfl w16du wp14">
+<w:document xmlns:wpc="http://schemas.microsoft.com/office/word/2010/wordprocessingCanvas" xmlns:cx="http://schemas.microsoft.com/office/drawing/2014/chartex" xmlns:cx1="http://schemas.microsoft.com/office/drawing/2015/9/8/chartex" xmlns:cx2="http://schemas.microsoft.com/office/drawing/2015/10/21/chartex" xmlns:cx3="http://schemas.microsoft.com/office/drawing/2016/5/9/chartex" xmlns:cx4="http://schemas.microsoft.com/office/drawing/2016/5/10/chartex" xmlns:cx5="http://schemas.microsoft.com/office/drawing/2016/5/11/chartex" xmlns:cx6="http://schemas.microsoft.com/office/drawing/2016/5/12/chartex" xmlns:cx7="http://schemas.microsoft.com/office/drawing/2016/5/13/chartex" xmlns:cx8="http://schemas.microsoft.com/office/drawing/2016/5/14/chartex" xmlns:mc="http://schemas.openxmlformats.org/markup-compatibility/2006" xmlns:aink="http://schemas.microsoft.com/office/drawing/2016/ink" xmlns:am3d="http://schemas.microsoft.com/office/drawing/2017/model3d" xmlns:o="urn:schemas-microsoft-com:office:office" xmlns:oel="http://schemas.microsoft.com/office/2019/extlst" xmlns:r="http://schemas.openxmlformats.org/officeDocument/2006/relationships" xmlns:m="http://schemas.openxmlformats.org/officeDocument/2006/math" xmlns:v="urn:schemas-microsoft-com:vml" xmlns:wp14="http://schemas.microsoft.com/office/word/2010/wordprocessingDrawing" xmlns:wp="http://schemas.openxmlformats.org/drawingml/2006/wordprocessingDrawing" xmlns:w10="urn:schemas-microsoft-com:office:word" xmlns:w="http://schemas.openxmlformats.org/wordprocessingml/2006/main" xmlns:w14="http://schemas.microsoft.com/office/word/2010/wordml" xmlns:w15="http://schemas.microsoft.com/office/word/2012/wordml" xmlns:w16cex="http://schemas.microsoft.com/office/word/2018/wordml/cex" xmlns:w16cid="http://schemas.microsoft.com/office/word/2016/wordml/cid" xmlns:w16="http://schemas.microsoft.com/office/word/2018/wordml" xmlns:w16du="http://schemas.microsoft.com/office/word/2023/wordml/word16du" xmlns:w16sdtdh="http://schemas.microsoft.com/office/word/2020/wordml/sdtdatahash" xmlns:w16sdtfl="http://schemas.microsoft.com/office/word/2024/wordml/sdtformatlock" xmlns:w16se="http://schemas.microsoft.com/office/word/2015/wordml/symex" xmlns:wpg="http://schemas.microsoft.com/office/word/2010/wordprocessingGroup" xmlns:wpi="http://schemas.microsoft.com/office/word/2010/wordprocessingInk" xmlns:wne="http://schemas.microsoft.com/office/word/2006/wordml" xmlns:wps="http://schemas.microsoft.com/office/word/2010/wordprocessingShape" mc:Ignorable="w14 w15 w16se w16cid w16 w16cex w16sdtdh w16sdtfl w16du wp14">
   <w:body>
-    <w:p ns2:paraId="00000001" ns2:textId="16B9ACF3">
+    <w:p>
       <w:pPr>
         <w:widowControl/>
         <w:pBdr>
@@ -32,26 +32,26 @@
         <w:t>INFOCOM 2026 Workshop on Embodied Intelligence Networks (EIN)</w:t>
       </w:r>
     </w:p>
-    <w:p ns2:paraId="00000002" ns2:textId="77777777">
-      <w:pPr>
-        <w:widowControl/>
-        <w:pBdr>
-          <w:top w:val="nil"/>
-          <w:left w:val="nil"/>
-          <w:bottom w:val="nil"/>
-          <w:right w:val="nil"/>
-          <w:between w:val="nil"/>
-        </w:pBdr>
-        <w:jc w:val="left"/>
-        <w:rPr>
-          <w:rFonts w:ascii="Arial" w:eastAsia="Arial" w:hAnsi="Arial" w:cs="Arial"/>
-          <w:color w:val="000000"/>
-          <w:sz w:val="22"/>
-          <w:szCs w:val="22"/>
-        </w:rPr>
-      </w:pPr>
-    </w:p>
-    <w:p ns2:paraId="00000003" ns2:textId="6F8E2F02">
+    <w:p>
+      <w:pPr>
+        <w:widowControl/>
+        <w:pBdr>
+          <w:top w:val="nil"/>
+          <w:left w:val="nil"/>
+          <w:bottom w:val="nil"/>
+          <w:right w:val="nil"/>
+          <w:between w:val="nil"/>
+        </w:pBdr>
+        <w:jc w:val="left"/>
+        <w:rPr>
+          <w:rFonts w:ascii="Arial" w:eastAsia="Arial" w:hAnsi="Arial" w:cs="Arial"/>
+          <w:color w:val="000000"/>
+          <w:sz w:val="22"/>
+          <w:szCs w:val="22"/>
+        </w:rPr>
+      </w:pPr>
+    </w:p>
+    <w:p>
       <w:pPr>
         <w:jc w:val="center"/>
         <w:rPr>
@@ -60,10 +60,6 @@
           <w:szCs w:val="22"/>
         </w:rPr>
       </w:pPr>
-      <w:proofErr w:type="gramStart"/>
-      <w:proofErr w:type="gramEnd"/>
-      <w:proofErr w:type="gramStart"/>
-      <w:proofErr w:type="gramEnd"/>
       <w:r>
         <w:rPr>
           <w:rFonts w:ascii="Arial" w:eastAsia="Arial" w:hAnsi="Arial" w:cs="Arial"/>
@@ -73,7 +69,7 @@
         <w:t>Monday, May 18, 2026 ● 14:00 – 18:00 ● Room: Fuyo ● IEEE INFOCOM 2026, Tokyo, Japan</w:t>
       </w:r>
     </w:p>
-    <w:p ns2:paraId="00000005" ns2:textId="5320E81A">
+    <w:p>
       <w:pPr>
         <w:widowControl/>
         <w:spacing w:before="280" w:after="280"/>
@@ -92,7 +88,7 @@
         <w:t>A half-day workshop on networking for embodied and agentic intelligence, bringing together researchers working on perception, reasoning, and action across virtual and physical environments.</w:t>
       </w:r>
     </w:p>
-    <w:p ns2:paraId="00000006" ns2:textId="0C2C310E">
+    <w:p>
       <w:pPr>
         <w:widowControl/>
         <w:pBdr>
@@ -122,7 +118,7 @@
         <w:t>Committee</w:t>
       </w:r>
     </w:p>
-    <w:p ns2:paraId="00000007" ns2:textId="6AC48496">
+    <w:p>
       <w:pPr>
         <w:widowControl/>
         <w:pBdr>
@@ -150,7 +146,7 @@
         <w:t>Yusheng Ji (National Institute of Informatics, Japan)</w:t>
       </w:r>
     </w:p>
-    <w:p ns2:paraId="3729399B" ns2:textId="77777777">
+    <w:p>
       <w:pPr>
         <w:widowControl/>
         <w:pBdr>
@@ -178,7 +174,7 @@
         <w:t>Baochun Li (University of Toronto)</w:t>
       </w:r>
     </w:p>
-    <w:p ns2:paraId="00000014" ns2:textId="5B626318">
+    <w:p>
       <w:pPr>
         <w:widowControl/>
         <w:pBdr>
@@ -208,7 +204,7 @@
         <w:t>Ruidong Li (Kanazawa University, Japan)</w:t>
       </w:r>
     </w:p>
-    <w:p ns2:paraId="00000014" ns2:textId="5B626318">
+    <w:p>
       <w:pPr>
         <w:widowControl/>
         <w:pBdr>
@@ -238,7 +234,7 @@
         <w:t>Min Song (Stevens Institute of Technology)</w:t>
       </w:r>
     </w:p>
-    <w:p ns2:paraId="00000014" ns2:textId="5B626318">
+    <w:p>
       <w:pPr>
         <w:widowControl/>
         <w:pBdr>
@@ -268,7 +264,7 @@
         <w:t>Teruo Higashino (Kyoto Tachibana University)</w:t>
       </w:r>
     </w:p>
-    <w:p ns2:paraId="00000014" ns2:textId="5B626318">
+    <w:p>
       <w:pPr>
         <w:widowControl/>
         <w:pBdr>
@@ -298,7 +294,7 @@
         <w:t>Krishna Kant (Temple University)</w:t>
       </w:r>
     </w:p>
-    <w:p ns2:paraId="00000014" ns2:textId="5B626318">
+    <w:p>
       <w:pPr>
         <w:widowControl/>
         <w:pBdr>
@@ -328,7 +324,7 @@
         <w:t>Zhenjiang Li (City University of Hong Kong)</w:t>
       </w:r>
     </w:p>
-    <w:p ns2:paraId="00000014" ns2:textId="5B626318">
+    <w:p>
       <w:pPr>
         <w:widowControl/>
         <w:pBdr>
@@ -358,7 +354,7 @@
         <w:t>Seung-Jong Park (Missouri University of Science &amp; Technology)</w:t>
       </w:r>
     </w:p>
-    <w:p ns2:paraId="00000014" ns2:textId="5B626318">
+    <w:p>
       <w:pPr>
         <w:widowControl/>
         <w:pBdr>
@@ -388,7 +384,7 @@
         <w:t>Corrado Puligheddu (Politecnico di Torino)</w:t>
       </w:r>
     </w:p>
-    <w:p ns2:paraId="00000014" ns2:textId="5B626318">
+    <w:p>
       <w:pPr>
         <w:widowControl/>
         <w:pBdr>
@@ -418,7 +414,7 @@
         <w:t>Siping Shi (The Hong Kong Polytechnic University)</w:t>
       </w:r>
     </w:p>
-    <w:p ns2:paraId="00000014" ns2:textId="5B626318">
+    <w:p>
       <w:pPr>
         <w:widowControl/>
         <w:pBdr>
@@ -448,7 +444,7 @@
         <w:t>JaeSeung Song (Sejong University)</w:t>
       </w:r>
     </w:p>
-    <w:p ns2:paraId="00000014" ns2:textId="5B626318">
+    <w:p>
       <w:pPr>
         <w:widowControl/>
         <w:pBdr>
@@ -478,7 +474,7 @@
         <w:t>Tao Song (Shanghai Jiao Tong University)</w:t>
       </w:r>
     </w:p>
-    <w:p ns2:paraId="00000014" ns2:textId="5B626318">
+    <w:p>
       <w:pPr>
         <w:widowControl/>
         <w:pBdr>
@@ -508,7 +504,7 @@
         <w:t>Feng Wang (University of Mississippi)</w:t>
       </w:r>
     </w:p>
-    <w:p ns2:paraId="00000014" ns2:textId="5B626318">
+    <w:p>
       <w:pPr>
         <w:widowControl/>
         <w:pBdr>
@@ -538,7 +534,7 @@
         <w:t>Guiling Wang (New Jersey Institute of Technology)</w:t>
       </w:r>
     </w:p>
-    <w:p ns2:paraId="00000014" ns2:textId="5B626318">
+    <w:p>
       <w:pPr>
         <w:widowControl/>
         <w:pBdr>
@@ -568,7 +564,7 @@
         <w:t>Poonam Yadav (University of York)</w:t>
       </w:r>
     </w:p>
-    <w:p ns2:paraId="00000014" ns2:textId="5B626318">
+    <w:p>
       <w:pPr>
         <w:widowControl/>
         <w:pBdr>
@@ -598,7 +594,7 @@
         <w:t>Rongfei Zeng (Northeastern University)</w:t>
       </w:r>
     </w:p>
-    <w:p ns2:paraId="00000014" ns2:textId="5B626318">
+    <w:p>
       <w:pPr>
         <w:widowControl/>
         <w:pBdr>
@@ -628,7 +624,7 @@
         <w:t>Sai Qian Zhang (New York University)</w:t>
       </w:r>
     </w:p>
-    <w:p ns2:paraId="00000014" ns2:textId="5B626318">
+    <w:p>
       <w:pPr>
         <w:widowControl/>
         <w:pBdr>
@@ -658,7 +654,7 @@
         <w:t>Xiaoxi Zhang (Sun Yat-sen University)</w:t>
       </w:r>
     </w:p>
-    <w:p ns2:paraId="00000014" ns2:textId="5B626318">
+    <w:p>
       <w:pPr>
         <w:widowControl/>
         <w:pBdr>
@@ -688,26 +684,26 @@
         <w:t>Yuanqing Zheng (Hong Kong Polytechnic University)</w:t>
       </w:r>
     </w:p>
-    <w:p ns2:paraId="00000002" ns2:textId="77777777">
-      <w:pPr>
-        <w:widowControl/>
-        <w:pBdr>
-          <w:top w:val="nil"/>
-          <w:left w:val="nil"/>
-          <w:bottom w:val="nil"/>
-          <w:right w:val="nil"/>
-          <w:between w:val="nil"/>
-        </w:pBdr>
-        <w:jc w:val="left"/>
-        <w:rPr>
-          <w:rFonts w:ascii="Arial" w:eastAsia="Arial" w:hAnsi="Arial" w:cs="Arial"/>
-          <w:color w:val="000000"/>
-          <w:sz w:val="22"/>
-          <w:szCs w:val="22"/>
-        </w:rPr>
-      </w:pPr>
-    </w:p>
-    <w:p ns2:paraId="0000001D" ns2:textId="1CC8D5F9">
+    <w:p>
+      <w:pPr>
+        <w:widowControl/>
+        <w:pBdr>
+          <w:top w:val="nil"/>
+          <w:left w:val="nil"/>
+          <w:bottom w:val="nil"/>
+          <w:right w:val="nil"/>
+          <w:between w:val="nil"/>
+        </w:pBdr>
+        <w:jc w:val="left"/>
+        <w:rPr>
+          <w:rFonts w:ascii="Arial" w:eastAsia="Arial" w:hAnsi="Arial" w:cs="Arial"/>
+          <w:color w:val="000000"/>
+          <w:sz w:val="22"/>
+          <w:szCs w:val="22"/>
+        </w:rPr>
+      </w:pPr>
+    </w:p>
+    <w:p>
       <w:pPr>
         <w:widowControl/>
         <w:pBdr>
@@ -737,7 +733,7 @@
         <w:t>Chairs:</w:t>
       </w:r>
     </w:p>
-    <w:p ns2:paraId="3F6BB205" ns2:textId="77777777">
+    <w:p>
       <w:pPr>
         <w:widowControl/>
         <w:pBdr>
@@ -765,7 +761,7 @@
         <w:t>Baochun Li (University of Toronto)</w:t>
       </w:r>
     </w:p>
-    <w:p ns2:paraId="3F6BB205" ns2:textId="77777777">
+    <w:p>
       <w:pPr>
         <w:widowControl/>
         <w:pBdr>
@@ -793,7 +789,7 @@
         <w:t>Edith C. H. Ngai (University of Hong Kong)</w:t>
       </w:r>
     </w:p>
-    <w:p ns2:paraId="3F6BB205" ns2:textId="77777777">
+    <w:p>
       <w:pPr>
         <w:widowControl/>
         <w:pBdr>
@@ -821,7 +817,7 @@
         <w:t>Ningxin Su (The Hong Kong University of Science and Technology (Guangzhou))</w:t>
       </w:r>
     </w:p>
-    <w:p ns2:paraId="3F6BB205" ns2:textId="77777777">
+    <w:p>
       <w:pPr>
         <w:widowControl/>
         <w:pBdr>
@@ -849,45 +845,45 @@
         <w:t>Hao Wang (Stevens Institute of Technology)</w:t>
       </w:r>
     </w:p>
-    <w:p ns2:paraId="00000002" ns2:textId="77777777">
-      <w:pPr>
-        <w:widowControl/>
-        <w:pBdr>
-          <w:top w:val="nil"/>
-          <w:left w:val="nil"/>
-          <w:bottom w:val="nil"/>
-          <w:right w:val="nil"/>
-          <w:between w:val="nil"/>
-        </w:pBdr>
-        <w:jc w:val="left"/>
-        <w:rPr>
-          <w:rFonts w:ascii="Arial" w:eastAsia="Arial" w:hAnsi="Arial" w:cs="Arial"/>
-          <w:color w:val="000000"/>
-          <w:sz w:val="22"/>
-          <w:szCs w:val="22"/>
-        </w:rPr>
-      </w:pPr>
-    </w:p>
-    <w:p ns2:paraId="00000002" ns2:textId="77777777">
-      <w:pPr>
-        <w:widowControl/>
-        <w:pBdr>
-          <w:top w:val="nil"/>
-          <w:left w:val="nil"/>
-          <w:bottom w:val="nil"/>
-          <w:right w:val="nil"/>
-          <w:between w:val="nil"/>
-        </w:pBdr>
-        <w:jc w:val="left"/>
-        <w:rPr>
-          <w:rFonts w:ascii="Arial" w:eastAsia="Arial" w:hAnsi="Arial" w:cs="Arial"/>
-          <w:color w:val="000000"/>
-          <w:sz w:val="22"/>
-          <w:szCs w:val="22"/>
-        </w:rPr>
-      </w:pPr>
-    </w:p>
-    <w:p ns2:paraId="00000035" ns2:textId="601DE829">
+    <w:p>
+      <w:pPr>
+        <w:widowControl/>
+        <w:pBdr>
+          <w:top w:val="nil"/>
+          <w:left w:val="nil"/>
+          <w:bottom w:val="nil"/>
+          <w:right w:val="nil"/>
+          <w:between w:val="nil"/>
+        </w:pBdr>
+        <w:jc w:val="left"/>
+        <w:rPr>
+          <w:rFonts w:ascii="Arial" w:eastAsia="Arial" w:hAnsi="Arial" w:cs="Arial"/>
+          <w:color w:val="000000"/>
+          <w:sz w:val="22"/>
+          <w:szCs w:val="22"/>
+        </w:rPr>
+      </w:pPr>
+    </w:p>
+    <w:p>
+      <w:pPr>
+        <w:widowControl/>
+        <w:pBdr>
+          <w:top w:val="nil"/>
+          <w:left w:val="nil"/>
+          <w:bottom w:val="nil"/>
+          <w:right w:val="nil"/>
+          <w:between w:val="nil"/>
+        </w:pBdr>
+        <w:jc w:val="left"/>
+        <w:rPr>
+          <w:rFonts w:ascii="Arial" w:eastAsia="Arial" w:hAnsi="Arial" w:cs="Arial"/>
+          <w:color w:val="000000"/>
+          <w:sz w:val="22"/>
+          <w:szCs w:val="22"/>
+        </w:rPr>
+      </w:pPr>
+    </w:p>
+    <w:p>
       <w:pPr>
         <w:widowControl/>
         <w:pBdr>
@@ -917,7 +913,7 @@
         <w:t>2:00 p.m. - 2:10 p.m.</w:t>
       </w:r>
     </w:p>
-    <w:p ns2:paraId="00000036" ns2:textId="77777777">
+    <w:p>
       <w:pPr>
         <w:widowControl/>
         <w:pBdr>
@@ -947,7 +943,7 @@
         <w:t>Welcome and workshop introduction</w:t>
       </w:r>
     </w:p>
-    <w:p ns2:paraId="00000005" ns2:textId="5320E81A">
+    <w:p>
       <w:pPr>
         <w:widowControl/>
         <w:spacing w:before="280" w:after="280"/>
@@ -966,26 +962,26 @@
         <w:t>Baochun Li, General Chair, together with Program Co-Chairs Edith C. H. Ngai, Ningxin Su, and Hao Wang, will introduce the workshop and the day’s program.</w:t>
       </w:r>
     </w:p>
-    <w:p ns2:paraId="00000002" ns2:textId="77777777">
-      <w:pPr>
-        <w:widowControl/>
-        <w:pBdr>
-          <w:top w:val="nil"/>
-          <w:left w:val="nil"/>
-          <w:bottom w:val="nil"/>
-          <w:right w:val="nil"/>
-          <w:between w:val="nil"/>
-        </w:pBdr>
-        <w:jc w:val="left"/>
-        <w:rPr>
-          <w:rFonts w:ascii="Arial" w:eastAsia="Arial" w:hAnsi="Arial" w:cs="Arial"/>
-          <w:color w:val="000000"/>
-          <w:sz w:val="22"/>
-          <w:szCs w:val="22"/>
-        </w:rPr>
-      </w:pPr>
-    </w:p>
-    <w:p ns2:paraId="00000035" ns2:textId="601DE829">
+    <w:p>
+      <w:pPr>
+        <w:widowControl/>
+        <w:pBdr>
+          <w:top w:val="nil"/>
+          <w:left w:val="nil"/>
+          <w:bottom w:val="nil"/>
+          <w:right w:val="nil"/>
+          <w:between w:val="nil"/>
+        </w:pBdr>
+        <w:jc w:val="left"/>
+        <w:rPr>
+          <w:rFonts w:ascii="Arial" w:eastAsia="Arial" w:hAnsi="Arial" w:cs="Arial"/>
+          <w:color w:val="000000"/>
+          <w:sz w:val="22"/>
+          <w:szCs w:val="22"/>
+        </w:rPr>
+      </w:pPr>
+    </w:p>
+    <w:p>
       <w:pPr>
         <w:widowControl/>
         <w:pBdr>
@@ -1015,7 +1011,7 @@
         <w:t>2:10 p.m. - 3:10 p.m.</w:t>
       </w:r>
     </w:p>
-    <w:p ns2:paraId="272B3ADD" ns2:textId="3BD4AEDE">
+    <w:p>
       <w:pPr>
         <w:rPr>
           <w:rFonts w:ascii="Arial" w:eastAsia="Arial" w:hAnsi="Arial" w:cs="Arial"/>
@@ -1036,7 +1032,7 @@
         <w:t>Keynote: Keynote talk</w:t>
       </w:r>
     </w:p>
-    <w:p ns2:paraId="0D3E61B0" ns2:textId="55EA08C1">
+    <w:p>
       <w:pPr>
         <w:rPr>
           <w:rFonts w:ascii="Arial" w:eastAsia="Arial" w:hAnsi="Arial" w:cs="Arial"/>
@@ -1055,26 +1051,26 @@
         <w:t>Speaker: TBD | Title: TBD</w:t>
       </w:r>
     </w:p>
-    <w:p ns2:paraId="00000002" ns2:textId="77777777">
-      <w:pPr>
-        <w:widowControl/>
-        <w:pBdr>
-          <w:top w:val="nil"/>
-          <w:left w:val="nil"/>
-          <w:bottom w:val="nil"/>
-          <w:right w:val="nil"/>
-          <w:between w:val="nil"/>
-        </w:pBdr>
-        <w:jc w:val="left"/>
-        <w:rPr>
-          <w:rFonts w:ascii="Arial" w:eastAsia="Arial" w:hAnsi="Arial" w:cs="Arial"/>
-          <w:color w:val="000000"/>
-          <w:sz w:val="22"/>
-          <w:szCs w:val="22"/>
-        </w:rPr>
-      </w:pPr>
-    </w:p>
-    <w:p ns2:paraId="00000035" ns2:textId="601DE829">
+    <w:p>
+      <w:pPr>
+        <w:widowControl/>
+        <w:pBdr>
+          <w:top w:val="nil"/>
+          <w:left w:val="nil"/>
+          <w:bottom w:val="nil"/>
+          <w:right w:val="nil"/>
+          <w:between w:val="nil"/>
+        </w:pBdr>
+        <w:jc w:val="left"/>
+        <w:rPr>
+          <w:rFonts w:ascii="Arial" w:eastAsia="Arial" w:hAnsi="Arial" w:cs="Arial"/>
+          <w:color w:val="000000"/>
+          <w:sz w:val="22"/>
+          <w:szCs w:val="22"/>
+        </w:rPr>
+      </w:pPr>
+    </w:p>
+    <w:p>
       <w:pPr>
         <w:widowControl/>
         <w:pBdr>
@@ -1104,7 +1100,7 @@
         <w:t>3:10 p.m. - 3:25 p.m.</w:t>
       </w:r>
     </w:p>
-    <w:p ns2:paraId="00000036" ns2:textId="77777777">
+    <w:p>
       <w:pPr>
         <w:widowControl/>
         <w:pBdr>
@@ -1134,26 +1130,26 @@
         <w:t>Short coffee break</w:t>
       </w:r>
     </w:p>
-    <w:p ns2:paraId="00000002" ns2:textId="77777777">
-      <w:pPr>
-        <w:widowControl/>
-        <w:pBdr>
-          <w:top w:val="nil"/>
-          <w:left w:val="nil"/>
-          <w:bottom w:val="nil"/>
-          <w:right w:val="nil"/>
-          <w:between w:val="nil"/>
-        </w:pBdr>
-        <w:jc w:val="left"/>
-        <w:rPr>
-          <w:rFonts w:ascii="Arial" w:eastAsia="Arial" w:hAnsi="Arial" w:cs="Arial"/>
-          <w:color w:val="000000"/>
-          <w:sz w:val="22"/>
-          <w:szCs w:val="22"/>
-        </w:rPr>
-      </w:pPr>
-    </w:p>
-    <w:p ns2:paraId="00000035" ns2:textId="601DE829">
+    <w:p>
+      <w:pPr>
+        <w:widowControl/>
+        <w:pBdr>
+          <w:top w:val="nil"/>
+          <w:left w:val="nil"/>
+          <w:bottom w:val="nil"/>
+          <w:right w:val="nil"/>
+          <w:between w:val="nil"/>
+        </w:pBdr>
+        <w:jc w:val="left"/>
+        <w:rPr>
+          <w:rFonts w:ascii="Arial" w:eastAsia="Arial" w:hAnsi="Arial" w:cs="Arial"/>
+          <w:color w:val="000000"/>
+          <w:sz w:val="22"/>
+          <w:szCs w:val="22"/>
+        </w:rPr>
+      </w:pPr>
+    </w:p>
+    <w:p>
       <w:pPr>
         <w:widowControl/>
         <w:pBdr>
@@ -1183,7 +1179,7 @@
         <w:t>3:25 p.m. - 4:55 p.m.</w:t>
       </w:r>
     </w:p>
-    <w:p ns2:paraId="0000003A" ns2:textId="7E66E165">
+    <w:p>
       <w:pPr>
         <w:widowControl/>
         <w:pBdr>
@@ -1213,26 +1209,26 @@
         <w:t>Session I: Adaptive and Collaborative Embodied Intelligence</w:t>
       </w:r>
     </w:p>
-    <w:p ns2:paraId="00000002" ns2:textId="77777777">
-      <w:pPr>
-        <w:widowControl/>
-        <w:pBdr>
-          <w:top w:val="nil"/>
-          <w:left w:val="nil"/>
-          <w:bottom w:val="nil"/>
-          <w:right w:val="nil"/>
-          <w:between w:val="nil"/>
-        </w:pBdr>
-        <w:jc w:val="left"/>
-        <w:rPr>
-          <w:rFonts w:ascii="Arial" w:eastAsia="Arial" w:hAnsi="Arial" w:cs="Arial"/>
-          <w:color w:val="000000"/>
-          <w:sz w:val="22"/>
-          <w:szCs w:val="22"/>
-        </w:rPr>
-      </w:pPr>
-    </w:p>
-    <w:p ns2:paraId="0000003C" ns2:textId="52C06159">
+    <w:p>
+      <w:pPr>
+        <w:widowControl/>
+        <w:pBdr>
+          <w:top w:val="nil"/>
+          <w:left w:val="nil"/>
+          <w:bottom w:val="nil"/>
+          <w:right w:val="nil"/>
+          <w:between w:val="nil"/>
+        </w:pBdr>
+        <w:jc w:val="left"/>
+        <w:rPr>
+          <w:rFonts w:ascii="Arial" w:eastAsia="Arial" w:hAnsi="Arial" w:cs="Arial"/>
+          <w:color w:val="000000"/>
+          <w:sz w:val="22"/>
+          <w:szCs w:val="22"/>
+        </w:rPr>
+      </w:pPr>
+    </w:p>
+    <w:p>
       <w:pPr>
         <w:rPr>
           <w:rFonts w:ascii="Arial" w:eastAsia="Arial" w:hAnsi="Arial" w:cs="Arial"/>
@@ -1250,10 +1246,11 @@
           <w:sz w:val="22"/>
           <w:szCs w:val="22"/>
         </w:rPr>
+        <w:lastRenderedPageBreak/>
         <w:t>pFedNavi: Structure-Aware Personalized Federated Vision-Language Navigation for Embodied AI</w:t>
       </w:r>
     </w:p>
-    <w:p ns2:paraId="0000003E" ns2:textId="3BCD884C">
+    <w:p>
       <w:pPr>
         <w:rPr>
           <w:rFonts w:ascii="Arial" w:eastAsia="Arial" w:hAnsi="Arial" w:cs="Arial"/>
@@ -1270,26 +1267,26 @@
         <w:t>Qingqian Yang and Hao Wang (Stevens Institute of Technology, USA); Sai Qian Zhang (Meta/New York University, USA); Jian Li (Stony Brook University, USA); Yang Hua (Queen's University Belfast, United Kingdom (Great Britain)); Miao Pan (University of Houston, USA); Tao Song, Zhengwei Qi and Haibing Guan (Shanghai Jiao Tong University, China)</w:t>
       </w:r>
     </w:p>
-    <w:p ns2:paraId="00000002" ns2:textId="77777777">
-      <w:pPr>
-        <w:widowControl/>
-        <w:pBdr>
-          <w:top w:val="nil"/>
-          <w:left w:val="nil"/>
-          <w:bottom w:val="nil"/>
-          <w:right w:val="nil"/>
-          <w:between w:val="nil"/>
-        </w:pBdr>
-        <w:jc w:val="left"/>
-        <w:rPr>
-          <w:rFonts w:ascii="Arial" w:eastAsia="Arial" w:hAnsi="Arial" w:cs="Arial"/>
-          <w:color w:val="000000"/>
-          <w:sz w:val="22"/>
-          <w:szCs w:val="22"/>
-        </w:rPr>
-      </w:pPr>
-    </w:p>
-    <w:p ns2:paraId="0000003C" ns2:textId="52C06159">
+    <w:p>
+      <w:pPr>
+        <w:widowControl/>
+        <w:pBdr>
+          <w:top w:val="nil"/>
+          <w:left w:val="nil"/>
+          <w:bottom w:val="nil"/>
+          <w:right w:val="nil"/>
+          <w:between w:val="nil"/>
+        </w:pBdr>
+        <w:jc w:val="left"/>
+        <w:rPr>
+          <w:rFonts w:ascii="Arial" w:eastAsia="Arial" w:hAnsi="Arial" w:cs="Arial"/>
+          <w:color w:val="000000"/>
+          <w:sz w:val="22"/>
+          <w:szCs w:val="22"/>
+        </w:rPr>
+      </w:pPr>
+    </w:p>
+    <w:p>
       <w:pPr>
         <w:rPr>
           <w:rFonts w:ascii="Arial" w:eastAsia="Arial" w:hAnsi="Arial" w:cs="Arial"/>
@@ -1310,7 +1307,7 @@
         <w:t>Federated Self-Evolving Embodied AI Agents</w:t>
       </w:r>
     </w:p>
-    <w:p ns2:paraId="0000003E" ns2:textId="3BCD884C">
+    <w:p>
       <w:pPr>
         <w:rPr>
           <w:rFonts w:ascii="Arial" w:eastAsia="Arial" w:hAnsi="Arial" w:cs="Arial"/>
@@ -1327,26 +1324,26 @@
         <w:t>Leming Shen and Yuanqing Zheng (The Hong Kong Polytechnic University, Hong Kong)</w:t>
       </w:r>
     </w:p>
-    <w:p ns2:paraId="00000002" ns2:textId="77777777">
-      <w:pPr>
-        <w:widowControl/>
-        <w:pBdr>
-          <w:top w:val="nil"/>
-          <w:left w:val="nil"/>
-          <w:bottom w:val="nil"/>
-          <w:right w:val="nil"/>
-          <w:between w:val="nil"/>
-        </w:pBdr>
-        <w:jc w:val="left"/>
-        <w:rPr>
-          <w:rFonts w:ascii="Arial" w:eastAsia="Arial" w:hAnsi="Arial" w:cs="Arial"/>
-          <w:color w:val="000000"/>
-          <w:sz w:val="22"/>
-          <w:szCs w:val="22"/>
-        </w:rPr>
-      </w:pPr>
-    </w:p>
-    <w:p ns2:paraId="0000003C" ns2:textId="52C06159">
+    <w:p>
+      <w:pPr>
+        <w:widowControl/>
+        <w:pBdr>
+          <w:top w:val="nil"/>
+          <w:left w:val="nil"/>
+          <w:bottom w:val="nil"/>
+          <w:right w:val="nil"/>
+          <w:between w:val="nil"/>
+        </w:pBdr>
+        <w:jc w:val="left"/>
+        <w:rPr>
+          <w:rFonts w:ascii="Arial" w:eastAsia="Arial" w:hAnsi="Arial" w:cs="Arial"/>
+          <w:color w:val="000000"/>
+          <w:sz w:val="22"/>
+          <w:szCs w:val="22"/>
+        </w:rPr>
+      </w:pPr>
+    </w:p>
+    <w:p>
       <w:pPr>
         <w:rPr>
           <w:rFonts w:ascii="Arial" w:eastAsia="Arial" w:hAnsi="Arial" w:cs="Arial"/>
@@ -1367,7 +1364,7 @@
         <w:t>E-RECAP: Embodied REplanning with Cost-Aware Pruning</w:t>
       </w:r>
     </w:p>
-    <w:p ns2:paraId="0000003E" ns2:textId="3BCD884C">
+    <w:p>
       <w:pPr>
         <w:rPr>
           <w:rFonts w:ascii="Arial" w:eastAsia="Arial" w:hAnsi="Arial" w:cs="Arial"/>
@@ -1384,26 +1381,26 @@
         <w:t>Shuaijun Liu and Ningxin Su (The Hong Kong University of Science and Technology (Guangzhou), China)</w:t>
       </w:r>
     </w:p>
-    <w:p ns2:paraId="00000002" ns2:textId="77777777">
-      <w:pPr>
-        <w:widowControl/>
-        <w:pBdr>
-          <w:top w:val="nil"/>
-          <w:left w:val="nil"/>
-          <w:bottom w:val="nil"/>
-          <w:right w:val="nil"/>
-          <w:between w:val="nil"/>
-        </w:pBdr>
-        <w:jc w:val="left"/>
-        <w:rPr>
-          <w:rFonts w:ascii="Arial" w:eastAsia="Arial" w:hAnsi="Arial" w:cs="Arial"/>
-          <w:color w:val="000000"/>
-          <w:sz w:val="22"/>
-          <w:szCs w:val="22"/>
-        </w:rPr>
-      </w:pPr>
-    </w:p>
-    <w:p ns2:paraId="0000003C" ns2:textId="52C06159">
+    <w:p>
+      <w:pPr>
+        <w:widowControl/>
+        <w:pBdr>
+          <w:top w:val="nil"/>
+          <w:left w:val="nil"/>
+          <w:bottom w:val="nil"/>
+          <w:right w:val="nil"/>
+          <w:between w:val="nil"/>
+        </w:pBdr>
+        <w:jc w:val="left"/>
+        <w:rPr>
+          <w:rFonts w:ascii="Arial" w:eastAsia="Arial" w:hAnsi="Arial" w:cs="Arial"/>
+          <w:color w:val="000000"/>
+          <w:sz w:val="22"/>
+          <w:szCs w:val="22"/>
+        </w:rPr>
+      </w:pPr>
+    </w:p>
+    <w:p>
       <w:pPr>
         <w:rPr>
           <w:rFonts w:ascii="Arial" w:eastAsia="Arial" w:hAnsi="Arial" w:cs="Arial"/>
@@ -1424,7 +1421,7 @@
         <w:t>VULCAN: Vision-Language-Model Enhanced Multi-Agent Cooperative Navigation for Indoor Fire-Disaster Response</w:t>
       </w:r>
     </w:p>
-    <w:p ns2:paraId="0000003E" ns2:textId="3BCD884C">
+    <w:p>
       <w:pPr>
         <w:rPr>
           <w:rFonts w:ascii="Arial" w:eastAsia="Arial" w:hAnsi="Arial" w:cs="Arial"/>
@@ -1441,26 +1438,26 @@
         <w:t>Shengding Liu and Qiben Yan (Michigan State University, USA)</w:t>
       </w:r>
     </w:p>
-    <w:p ns2:paraId="00000002" ns2:textId="77777777">
-      <w:pPr>
-        <w:widowControl/>
-        <w:pBdr>
-          <w:top w:val="nil"/>
-          <w:left w:val="nil"/>
-          <w:bottom w:val="nil"/>
-          <w:right w:val="nil"/>
-          <w:between w:val="nil"/>
-        </w:pBdr>
-        <w:jc w:val="left"/>
-        <w:rPr>
-          <w:rFonts w:ascii="Arial" w:eastAsia="Arial" w:hAnsi="Arial" w:cs="Arial"/>
-          <w:color w:val="000000"/>
-          <w:sz w:val="22"/>
-          <w:szCs w:val="22"/>
-        </w:rPr>
-      </w:pPr>
-    </w:p>
-    <w:p ns2:paraId="0000003C" ns2:textId="52C06159">
+    <w:p>
+      <w:pPr>
+        <w:widowControl/>
+        <w:pBdr>
+          <w:top w:val="nil"/>
+          <w:left w:val="nil"/>
+          <w:bottom w:val="nil"/>
+          <w:right w:val="nil"/>
+          <w:between w:val="nil"/>
+        </w:pBdr>
+        <w:jc w:val="left"/>
+        <w:rPr>
+          <w:rFonts w:ascii="Arial" w:eastAsia="Arial" w:hAnsi="Arial" w:cs="Arial"/>
+          <w:color w:val="000000"/>
+          <w:sz w:val="22"/>
+          <w:szCs w:val="22"/>
+        </w:rPr>
+      </w:pPr>
+    </w:p>
+    <w:p>
       <w:pPr>
         <w:rPr>
           <w:rFonts w:ascii="Arial" w:eastAsia="Arial" w:hAnsi="Arial" w:cs="Arial"/>
@@ -1481,7 +1478,7 @@
         <w:t>Rethinking IoT for Embodied AI: From Data Infrastructure to Intelligence Infrastructure</w:t>
       </w:r>
     </w:p>
-    <w:p ns2:paraId="0000003E" ns2:textId="3BCD884C">
+    <w:p>
       <w:pPr>
         <w:rPr>
           <w:rFonts w:ascii="Arial" w:eastAsia="Arial" w:hAnsi="Arial" w:cs="Arial"/>
@@ -1498,26 +1495,26 @@
         <w:t>Shuai Tong and Jiliang Wang (Tsinghua University, China)</w:t>
       </w:r>
     </w:p>
-    <w:p ns2:paraId="00000002" ns2:textId="77777777">
-      <w:pPr>
-        <w:widowControl/>
-        <w:pBdr>
-          <w:top w:val="nil"/>
-          <w:left w:val="nil"/>
-          <w:bottom w:val="nil"/>
-          <w:right w:val="nil"/>
-          <w:between w:val="nil"/>
-        </w:pBdr>
-        <w:jc w:val="left"/>
-        <w:rPr>
-          <w:rFonts w:ascii="Arial" w:eastAsia="Arial" w:hAnsi="Arial" w:cs="Arial"/>
-          <w:color w:val="000000"/>
-          <w:sz w:val="22"/>
-          <w:szCs w:val="22"/>
-        </w:rPr>
-      </w:pPr>
-    </w:p>
-    <w:p ns2:paraId="0000003C" ns2:textId="52C06159">
+    <w:p>
+      <w:pPr>
+        <w:widowControl/>
+        <w:pBdr>
+          <w:top w:val="nil"/>
+          <w:left w:val="nil"/>
+          <w:bottom w:val="nil"/>
+          <w:right w:val="nil"/>
+          <w:between w:val="nil"/>
+        </w:pBdr>
+        <w:jc w:val="left"/>
+        <w:rPr>
+          <w:rFonts w:ascii="Arial" w:eastAsia="Arial" w:hAnsi="Arial" w:cs="Arial"/>
+          <w:color w:val="000000"/>
+          <w:sz w:val="22"/>
+          <w:szCs w:val="22"/>
+        </w:rPr>
+      </w:pPr>
+    </w:p>
+    <w:p>
       <w:pPr>
         <w:rPr>
           <w:rFonts w:ascii="Arial" w:eastAsia="Arial" w:hAnsi="Arial" w:cs="Arial"/>
@@ -1538,7 +1535,7 @@
         <w:t>KV-SC: KV-Based Semantic Collaboration for Distributed Embodied Intelligence Networks</w:t>
       </w:r>
     </w:p>
-    <w:p ns2:paraId="0000003E" ns2:textId="3BCD884C">
+    <w:p>
       <w:pPr>
         <w:rPr>
           <w:rFonts w:ascii="Arial" w:eastAsia="Arial" w:hAnsi="Arial" w:cs="Arial"/>
@@ -1555,26 +1552,26 @@
         <w:t>Baoxia Du and Ruidong Li (Kanazawa University, Japan); Yinfeng Cao (The Hong Kong Polytechnic University, Hong Kong); Dusit Niyato (Nanyang Technological University, Singapore)</w:t>
       </w:r>
     </w:p>
-    <w:p ns2:paraId="00000002" ns2:textId="77777777">
-      <w:pPr>
-        <w:widowControl/>
-        <w:pBdr>
-          <w:top w:val="nil"/>
-          <w:left w:val="nil"/>
-          <w:bottom w:val="nil"/>
-          <w:right w:val="nil"/>
-          <w:between w:val="nil"/>
-        </w:pBdr>
-        <w:jc w:val="left"/>
-        <w:rPr>
-          <w:rFonts w:ascii="Arial" w:eastAsia="Arial" w:hAnsi="Arial" w:cs="Arial"/>
-          <w:color w:val="000000"/>
-          <w:sz w:val="22"/>
-          <w:szCs w:val="22"/>
-        </w:rPr>
-      </w:pPr>
-    </w:p>
-    <w:p ns2:paraId="00000035" ns2:textId="601DE829">
+    <w:p>
+      <w:pPr>
+        <w:widowControl/>
+        <w:pBdr>
+          <w:top w:val="nil"/>
+          <w:left w:val="nil"/>
+          <w:bottom w:val="nil"/>
+          <w:right w:val="nil"/>
+          <w:between w:val="nil"/>
+        </w:pBdr>
+        <w:jc w:val="left"/>
+        <w:rPr>
+          <w:rFonts w:ascii="Arial" w:eastAsia="Arial" w:hAnsi="Arial" w:cs="Arial"/>
+          <w:color w:val="000000"/>
+          <w:sz w:val="22"/>
+          <w:szCs w:val="22"/>
+        </w:rPr>
+      </w:pPr>
+    </w:p>
+    <w:p>
       <w:pPr>
         <w:widowControl/>
         <w:pBdr>
@@ -1604,7 +1601,7 @@
         <w:t>4:55 p.m. - 5:10 p.m.</w:t>
       </w:r>
     </w:p>
-    <w:p ns2:paraId="00000036" ns2:textId="77777777">
+    <w:p>
       <w:pPr>
         <w:widowControl/>
         <w:pBdr>
@@ -1634,26 +1631,26 @@
         <w:t>Coffee and tea break</w:t>
       </w:r>
     </w:p>
-    <w:p ns2:paraId="00000002" ns2:textId="77777777">
-      <w:pPr>
-        <w:widowControl/>
-        <w:pBdr>
-          <w:top w:val="nil"/>
-          <w:left w:val="nil"/>
-          <w:bottom w:val="nil"/>
-          <w:right w:val="nil"/>
-          <w:between w:val="nil"/>
-        </w:pBdr>
-        <w:jc w:val="left"/>
-        <w:rPr>
-          <w:rFonts w:ascii="Arial" w:eastAsia="Arial" w:hAnsi="Arial" w:cs="Arial"/>
-          <w:color w:val="000000"/>
-          <w:sz w:val="22"/>
-          <w:szCs w:val="22"/>
-        </w:rPr>
-      </w:pPr>
-    </w:p>
-    <w:p ns2:paraId="00000035" ns2:textId="601DE829">
+    <w:p>
+      <w:pPr>
+        <w:widowControl/>
+        <w:pBdr>
+          <w:top w:val="nil"/>
+          <w:left w:val="nil"/>
+          <w:bottom w:val="nil"/>
+          <w:right w:val="nil"/>
+          <w:between w:val="nil"/>
+        </w:pBdr>
+        <w:jc w:val="left"/>
+        <w:rPr>
+          <w:rFonts w:ascii="Arial" w:eastAsia="Arial" w:hAnsi="Arial" w:cs="Arial"/>
+          <w:color w:val="000000"/>
+          <w:sz w:val="22"/>
+          <w:szCs w:val="22"/>
+        </w:rPr>
+      </w:pPr>
+    </w:p>
+    <w:p>
       <w:pPr>
         <w:widowControl/>
         <w:pBdr>
@@ -1683,7 +1680,7 @@
         <w:t>5:10 p.m. - 5:50 p.m.</w:t>
       </w:r>
     </w:p>
-    <w:p ns2:paraId="0000003A" ns2:textId="7E66E165">
+    <w:p>
       <w:pPr>
         <w:widowControl/>
         <w:pBdr>
@@ -1713,26 +1710,26 @@
         <w:t>Session II: Systems, Security, and Optimization for Embodied AI Infrastructure</w:t>
       </w:r>
     </w:p>
-    <w:p ns2:paraId="00000002" ns2:textId="77777777">
-      <w:pPr>
-        <w:widowControl/>
-        <w:pBdr>
-          <w:top w:val="nil"/>
-          <w:left w:val="nil"/>
-          <w:bottom w:val="nil"/>
-          <w:right w:val="nil"/>
-          <w:between w:val="nil"/>
-        </w:pBdr>
-        <w:jc w:val="left"/>
-        <w:rPr>
-          <w:rFonts w:ascii="Arial" w:eastAsia="Arial" w:hAnsi="Arial" w:cs="Arial"/>
-          <w:color w:val="000000"/>
-          <w:sz w:val="22"/>
-          <w:szCs w:val="22"/>
-        </w:rPr>
-      </w:pPr>
-    </w:p>
-    <w:p ns2:paraId="0000003C" ns2:textId="52C06159">
+    <w:p>
+      <w:pPr>
+        <w:widowControl/>
+        <w:pBdr>
+          <w:top w:val="nil"/>
+          <w:left w:val="nil"/>
+          <w:bottom w:val="nil"/>
+          <w:right w:val="nil"/>
+          <w:between w:val="nil"/>
+        </w:pBdr>
+        <w:jc w:val="left"/>
+        <w:rPr>
+          <w:rFonts w:ascii="Arial" w:eastAsia="Arial" w:hAnsi="Arial" w:cs="Arial"/>
+          <w:color w:val="000000"/>
+          <w:sz w:val="22"/>
+          <w:szCs w:val="22"/>
+        </w:rPr>
+      </w:pPr>
+    </w:p>
+    <w:p>
       <w:pPr>
         <w:rPr>
           <w:rFonts w:ascii="Arial" w:eastAsia="Arial" w:hAnsi="Arial" w:cs="Arial"/>
@@ -1753,7 +1750,7 @@
         <w:t>Jiao: Bridging Isolation and Customization in Mixed Criticality Robotics</w:t>
       </w:r>
     </w:p>
-    <w:p ns2:paraId="0000003E" ns2:textId="3BCD884C">
+    <w:p>
       <w:pPr>
         <w:rPr>
           <w:rFonts w:ascii="Arial" w:eastAsia="Arial" w:hAnsi="Arial" w:cs="Arial"/>
@@ -1770,26 +1767,26 @@
         <w:t>James Yen, ZhiBai Huang and Zhixiang Wei (Shanghai Jiaotong University, China); Tinghao Yi, Shupeng Zeng and Liang Pang (Openmind, China); Songtao Xue (Shanghai Jiaotong University, China); Zhengwei Qi (Shanghai Jiao Tong University, China)</w:t>
       </w:r>
     </w:p>
-    <w:p ns2:paraId="00000002" ns2:textId="77777777">
-      <w:pPr>
-        <w:widowControl/>
-        <w:pBdr>
-          <w:top w:val="nil"/>
-          <w:left w:val="nil"/>
-          <w:bottom w:val="nil"/>
-          <w:right w:val="nil"/>
-          <w:between w:val="nil"/>
-        </w:pBdr>
-        <w:jc w:val="left"/>
-        <w:rPr>
-          <w:rFonts w:ascii="Arial" w:eastAsia="Arial" w:hAnsi="Arial" w:cs="Arial"/>
-          <w:color w:val="000000"/>
-          <w:sz w:val="22"/>
-          <w:szCs w:val="22"/>
-        </w:rPr>
-      </w:pPr>
-    </w:p>
-    <w:p ns2:paraId="0000003C" ns2:textId="52C06159">
+    <w:p>
+      <w:pPr>
+        <w:widowControl/>
+        <w:pBdr>
+          <w:top w:val="nil"/>
+          <w:left w:val="nil"/>
+          <w:bottom w:val="nil"/>
+          <w:right w:val="nil"/>
+          <w:between w:val="nil"/>
+        </w:pBdr>
+        <w:jc w:val="left"/>
+        <w:rPr>
+          <w:rFonts w:ascii="Arial" w:eastAsia="Arial" w:hAnsi="Arial" w:cs="Arial"/>
+          <w:color w:val="000000"/>
+          <w:sz w:val="22"/>
+          <w:szCs w:val="22"/>
+        </w:rPr>
+      </w:pPr>
+    </w:p>
+    <w:p>
       <w:pPr>
         <w:rPr>
           <w:rFonts w:ascii="Arial" w:eastAsia="Arial" w:hAnsi="Arial" w:cs="Arial"/>
@@ -1810,7 +1807,7 @@
         <w:t>MEC-based HFL: A Fair Aggregation Approach for Non-IID Data via Minimum Enclosing Circle</w:t>
       </w:r>
     </w:p>
-    <w:p ns2:paraId="0000003E" ns2:textId="3BCD884C">
+    <w:p>
       <w:pPr>
         <w:rPr>
           <w:rFonts w:ascii="Arial" w:eastAsia="Arial" w:hAnsi="Arial" w:cs="Arial"/>
@@ -1827,26 +1824,26 @@
         <w:t>Fan-Hsun Tseng, Jiang-Yi Zeng and Yu-Teng Lai (National Cheng Kung University, Taiwan); Hsin-Hung Cho and Chi-Yuan Chen (National Ilan University, Taiwan)</w:t>
       </w:r>
     </w:p>
-    <w:p ns2:paraId="00000002" ns2:textId="77777777">
-      <w:pPr>
-        <w:widowControl/>
-        <w:pBdr>
-          <w:top w:val="nil"/>
-          <w:left w:val="nil"/>
-          <w:bottom w:val="nil"/>
-          <w:right w:val="nil"/>
-          <w:between w:val="nil"/>
-        </w:pBdr>
-        <w:jc w:val="left"/>
-        <w:rPr>
-          <w:rFonts w:ascii="Arial" w:eastAsia="Arial" w:hAnsi="Arial" w:cs="Arial"/>
-          <w:color w:val="000000"/>
-          <w:sz w:val="22"/>
-          <w:szCs w:val="22"/>
-        </w:rPr>
-      </w:pPr>
-    </w:p>
-    <w:p ns2:paraId="0000003C" ns2:textId="52C06159">
+    <w:p>
+      <w:pPr>
+        <w:widowControl/>
+        <w:pBdr>
+          <w:top w:val="nil"/>
+          <w:left w:val="nil"/>
+          <w:bottom w:val="nil"/>
+          <w:right w:val="nil"/>
+          <w:between w:val="nil"/>
+        </w:pBdr>
+        <w:jc w:val="left"/>
+        <w:rPr>
+          <w:rFonts w:ascii="Arial" w:eastAsia="Arial" w:hAnsi="Arial" w:cs="Arial"/>
+          <w:color w:val="000000"/>
+          <w:sz w:val="22"/>
+          <w:szCs w:val="22"/>
+        </w:rPr>
+      </w:pPr>
+    </w:p>
+    <w:p>
       <w:pPr>
         <w:rPr>
           <w:rFonts w:ascii="Arial" w:eastAsia="Arial" w:hAnsi="Arial" w:cs="Arial"/>
@@ -1867,7 +1864,7 @@
         <w:t>Towards Operating System Automated Optimization via System Knowledge and Tunability Embedding</w:t>
       </w:r>
     </w:p>
-    <w:p ns2:paraId="0000003E" ns2:textId="3BCD884C">
+    <w:p>
       <w:pPr>
         <w:rPr>
           <w:rFonts w:ascii="Arial" w:eastAsia="Arial" w:hAnsi="Arial" w:cs="Arial"/>
@@ -1884,26 +1881,26 @@
         <w:t>Yuxin Ren, Donghui Chen, Yun Hao, Nan Zhang, Zhipeng Xie, Yanqiang Liu, Bo Wan, Bo Zhang, Xu Wang, Wanming Hu, Haili Bai, Ning Jia and Xinwei Hu (Huawei Technologies, China)</w:t>
       </w:r>
     </w:p>
-    <w:p ns2:paraId="00000002" ns2:textId="77777777">
-      <w:pPr>
-        <w:widowControl/>
-        <w:pBdr>
-          <w:top w:val="nil"/>
-          <w:left w:val="nil"/>
-          <w:bottom w:val="nil"/>
-          <w:right w:val="nil"/>
-          <w:between w:val="nil"/>
-        </w:pBdr>
-        <w:jc w:val="left"/>
-        <w:rPr>
-          <w:rFonts w:ascii="Arial" w:eastAsia="Arial" w:hAnsi="Arial" w:cs="Arial"/>
-          <w:color w:val="000000"/>
-          <w:sz w:val="22"/>
-          <w:szCs w:val="22"/>
-        </w:rPr>
-      </w:pPr>
-    </w:p>
-    <w:p ns2:paraId="0000003C" ns2:textId="52C06159">
+    <w:p>
+      <w:pPr>
+        <w:widowControl/>
+        <w:pBdr>
+          <w:top w:val="nil"/>
+          <w:left w:val="nil"/>
+          <w:bottom w:val="nil"/>
+          <w:right w:val="nil"/>
+          <w:between w:val="nil"/>
+        </w:pBdr>
+        <w:jc w:val="left"/>
+        <w:rPr>
+          <w:rFonts w:ascii="Arial" w:eastAsia="Arial" w:hAnsi="Arial" w:cs="Arial"/>
+          <w:color w:val="000000"/>
+          <w:sz w:val="22"/>
+          <w:szCs w:val="22"/>
+        </w:rPr>
+      </w:pPr>
+    </w:p>
+    <w:p>
       <w:pPr>
         <w:rPr>
           <w:rFonts w:ascii="Arial" w:eastAsia="Arial" w:hAnsi="Arial" w:cs="Arial"/>
@@ -1924,43 +1921,44 @@
         <w:t>Multimodal Behavioral PUF Authentication for Physical AI Robots Combining Electromechanical Actuation and Computational Load Signatures</w:t>
       </w:r>
     </w:p>
-    <w:p ns2:paraId="0000003E" ns2:textId="3BCD884C">
-      <w:pPr>
-        <w:rPr>
-          <w:rFonts w:ascii="Arial" w:eastAsia="Arial" w:hAnsi="Arial" w:cs="Arial"/>
-          <w:sz w:val="22"/>
-          <w:szCs w:val="22"/>
-        </w:rPr>
-      </w:pPr>
-      <w:r>
-        <w:rPr>
-          <w:rFonts w:ascii="Arial" w:eastAsia="Arial" w:hAnsi="Arial" w:cs="Arial"/>
-          <w:sz w:val="22"/>
-          <w:szCs w:val="22"/>
-        </w:rPr>
+    <w:p>
+      <w:pPr>
+        <w:rPr>
+          <w:rFonts w:ascii="Arial" w:eastAsia="Arial" w:hAnsi="Arial" w:cs="Arial"/>
+          <w:sz w:val="22"/>
+          <w:szCs w:val="22"/>
+        </w:rPr>
+      </w:pPr>
+      <w:r>
+        <w:rPr>
+          <w:rFonts w:ascii="Arial" w:eastAsia="Arial" w:hAnsi="Arial" w:cs="Arial"/>
+          <w:sz w:val="22"/>
+          <w:szCs w:val="22"/>
+        </w:rPr>
+        <w:lastRenderedPageBreak/>
         <w:t>Jiho Lee, Jaehyung Jeong, Jayeon Pyo and JaeSeung Song (Sejong University, Korea (South))</w:t>
       </w:r>
     </w:p>
-    <w:p ns2:paraId="00000002" ns2:textId="77777777">
-      <w:pPr>
-        <w:widowControl/>
-        <w:pBdr>
-          <w:top w:val="nil"/>
-          <w:left w:val="nil"/>
-          <w:bottom w:val="nil"/>
-          <w:right w:val="nil"/>
-          <w:between w:val="nil"/>
-        </w:pBdr>
-        <w:jc w:val="left"/>
-        <w:rPr>
-          <w:rFonts w:ascii="Arial" w:eastAsia="Arial" w:hAnsi="Arial" w:cs="Arial"/>
-          <w:color w:val="000000"/>
-          <w:sz w:val="22"/>
-          <w:szCs w:val="22"/>
-        </w:rPr>
-      </w:pPr>
-    </w:p>
-    <w:p ns2:paraId="00000035" ns2:textId="601DE829">
+    <w:p>
+      <w:pPr>
+        <w:widowControl/>
+        <w:pBdr>
+          <w:top w:val="nil"/>
+          <w:left w:val="nil"/>
+          <w:bottom w:val="nil"/>
+          <w:right w:val="nil"/>
+          <w:between w:val="nil"/>
+        </w:pBdr>
+        <w:jc w:val="left"/>
+        <w:rPr>
+          <w:rFonts w:ascii="Arial" w:eastAsia="Arial" w:hAnsi="Arial" w:cs="Arial"/>
+          <w:color w:val="000000"/>
+          <w:sz w:val="22"/>
+          <w:szCs w:val="22"/>
+        </w:rPr>
+      </w:pPr>
+    </w:p>
+    <w:p>
       <w:pPr>
         <w:widowControl/>
         <w:pBdr>
@@ -1990,7 +1988,7 @@
         <w:t>5:50 p.m. - 6:00 p.m.</w:t>
       </w:r>
     </w:p>
-    <w:p ns2:paraId="00000036" ns2:textId="77777777">
+    <w:p>
       <w:pPr>
         <w:widowControl/>
         <w:pBdr>
@@ -2020,7 +2018,7 @@
         <w:t>Closing remarks</w:t>
       </w:r>
     </w:p>
-    <w:p ns2:paraId="00000005" ns2:textId="5320E81A">
+    <w:p>
       <w:pPr>
         <w:widowControl/>
         <w:spacing w:before="280" w:after="280"/>
@@ -2039,7 +2037,7 @@
         <w:t>Baochun Li, General Chair, will conclude the workshop and thank participants, speakers, and organizers.</w:t>
       </w:r>
     </w:p>
-    <w:p ns2:paraId="00000002" ns2:textId="77777777">
+    <w:p>
       <w:pPr>
         <w:widowControl/>
         <w:pBdr>
@@ -2073,7 +2071,7 @@
   <w:docDefaults>
     <w:rPrDefault>
       <w:rPr>
-        <w:rFonts w:ascii="等线" w:eastAsia="等线" w:hAnsi="等线" w:cs="等线"/>
+        <w:rFonts w:ascii="DengXian" w:eastAsia="DengXian" w:hAnsi="DengXian" w:cs="DengXian"/>
         <w:sz w:val="21"/>
         <w:szCs w:val="21"/>
         <w:lang w:val="en-US" w:eastAsia="zh-CN" w:bidi="ar-SA"/>
@@ -2597,6 +2595,7 @@
   <w:style w:type="character" w:default="1" w:styleId="DefaultParagraphFont">
     <w:name w:val="Default Paragraph Font"/>
     <w:uiPriority w:val="1"/>
+    <w:semiHidden/>
     <w:unhideWhenUsed/>
   </w:style>
   <w:style w:type="table" w:default="1" w:styleId="TableNormal">
@@ -2665,7 +2664,7 @@
       <w:jc w:val="left"/>
     </w:pPr>
     <w:rPr>
-      <w:rFonts w:ascii="宋体" w:eastAsia="宋体" w:hAnsi="宋体" w:cs="宋体"/>
+      <w:rFonts w:ascii="SimSun" w:eastAsia="SimSun" w:hAnsi="SimSun" w:cs="SimSun"/>
       <w:sz w:val="24"/>
       <w:szCs w:val="24"/>
     </w:rPr>

</xml_diff>

<commit_message>
Adjusted the conference program to coincide with the 3:30-4pm coffee break.
</commit_message>
<xml_diff>
--- a/assets/files/ein26-program.docx
+++ b/assets/files/ein26-program.docx
@@ -1,8 +1,8 @@
 
 <file path=word/document.xml><?xml version="1.0" encoding="utf-8"?>
-<w:document xmlns:wpc="http://schemas.microsoft.com/office/word/2010/wordprocessingCanvas" xmlns:cx="http://schemas.microsoft.com/office/drawing/2014/chartex" xmlns:cx1="http://schemas.microsoft.com/office/drawing/2015/9/8/chartex" xmlns:cx2="http://schemas.microsoft.com/office/drawing/2015/10/21/chartex" xmlns:cx3="http://schemas.microsoft.com/office/drawing/2016/5/9/chartex" xmlns:cx4="http://schemas.microsoft.com/office/drawing/2016/5/10/chartex" xmlns:cx5="http://schemas.microsoft.com/office/drawing/2016/5/11/chartex" xmlns:cx6="http://schemas.microsoft.com/office/drawing/2016/5/12/chartex" xmlns:cx7="http://schemas.microsoft.com/office/drawing/2016/5/13/chartex" xmlns:cx8="http://schemas.microsoft.com/office/drawing/2016/5/14/chartex" xmlns:mc="http://schemas.openxmlformats.org/markup-compatibility/2006" xmlns:aink="http://schemas.microsoft.com/office/drawing/2016/ink" xmlns:am3d="http://schemas.microsoft.com/office/drawing/2017/model3d" xmlns:o="urn:schemas-microsoft-com:office:office" xmlns:oel="http://schemas.microsoft.com/office/2019/extlst" xmlns:r="http://schemas.openxmlformats.org/officeDocument/2006/relationships" xmlns:m="http://schemas.openxmlformats.org/officeDocument/2006/math" xmlns:v="urn:schemas-microsoft-com:vml" xmlns:wp14="http://schemas.microsoft.com/office/word/2010/wordprocessingDrawing" xmlns:wp="http://schemas.openxmlformats.org/drawingml/2006/wordprocessingDrawing" xmlns:w10="urn:schemas-microsoft-com:office:word" xmlns:w="http://schemas.openxmlformats.org/wordprocessingml/2006/main" xmlns:w14="http://schemas.microsoft.com/office/word/2010/wordml" xmlns:w15="http://schemas.microsoft.com/office/word/2012/wordml" xmlns:w16cex="http://schemas.microsoft.com/office/word/2018/wordml/cex" xmlns:w16cid="http://schemas.microsoft.com/office/word/2016/wordml/cid" xmlns:w16="http://schemas.microsoft.com/office/word/2018/wordml" xmlns:w16du="http://schemas.microsoft.com/office/word/2023/wordml/word16du" xmlns:w16sdtdh="http://schemas.microsoft.com/office/word/2020/wordml/sdtdatahash" xmlns:w16sdtfl="http://schemas.microsoft.com/office/word/2024/wordml/sdtformatlock" xmlns:w16se="http://schemas.microsoft.com/office/word/2015/wordml/symex" xmlns:wpg="http://schemas.microsoft.com/office/word/2010/wordprocessingGroup" xmlns:wpi="http://schemas.microsoft.com/office/word/2010/wordprocessingInk" xmlns:wne="http://schemas.microsoft.com/office/word/2006/wordml" xmlns:wps="http://schemas.microsoft.com/office/word/2010/wordprocessingShape" mc:Ignorable="w14 w15 w16se w16cid w16 w16cex w16sdtdh w16sdtfl w16du wp14">
+<w:document xmlns:ns1="http://schemas.openxmlformats.org/markup-compatibility/2006" xmlns:ns2="http://schemas.microsoft.com/office/word/2010/wordml" xmlns:w="http://schemas.openxmlformats.org/wordprocessingml/2006/main" ns1:Ignorable="w14 w15 w16se w16cid w16 w16cex w16sdtdh w16sdtfl w16du wp14">
   <w:body>
-    <w:p>
+    <w:p ns2:paraId="00000001" ns2:textId="16B9ACF3">
       <w:pPr>
         <w:widowControl/>
         <w:pBdr>
@@ -32,26 +32,26 @@
         <w:t>INFOCOM 2026 Workshop on Embodied Intelligence Networks (EIN)</w:t>
       </w:r>
     </w:p>
-    <w:p>
-      <w:pPr>
-        <w:widowControl/>
-        <w:pBdr>
-          <w:top w:val="nil"/>
-          <w:left w:val="nil"/>
-          <w:bottom w:val="nil"/>
-          <w:right w:val="nil"/>
-          <w:between w:val="nil"/>
-        </w:pBdr>
-        <w:jc w:val="left"/>
-        <w:rPr>
-          <w:rFonts w:ascii="Arial" w:eastAsia="Arial" w:hAnsi="Arial" w:cs="Arial"/>
-          <w:color w:val="000000"/>
-          <w:sz w:val="22"/>
-          <w:szCs w:val="22"/>
-        </w:rPr>
-      </w:pPr>
-    </w:p>
-    <w:p>
+    <w:p ns2:paraId="00000002" ns2:textId="77777777">
+      <w:pPr>
+        <w:widowControl/>
+        <w:pBdr>
+          <w:top w:val="nil"/>
+          <w:left w:val="nil"/>
+          <w:bottom w:val="nil"/>
+          <w:right w:val="nil"/>
+          <w:between w:val="nil"/>
+        </w:pBdr>
+        <w:jc w:val="left"/>
+        <w:rPr>
+          <w:rFonts w:ascii="Arial" w:eastAsia="Arial" w:hAnsi="Arial" w:cs="Arial"/>
+          <w:color w:val="000000"/>
+          <w:sz w:val="22"/>
+          <w:szCs w:val="22"/>
+        </w:rPr>
+      </w:pPr>
+    </w:p>
+    <w:p ns2:paraId="00000003" ns2:textId="6F8E2F02">
       <w:pPr>
         <w:jc w:val="center"/>
         <w:rPr>
@@ -60,6 +60,10 @@
           <w:szCs w:val="22"/>
         </w:rPr>
       </w:pPr>
+      <w:proofErr w:type="gramStart"/>
+      <w:proofErr w:type="gramEnd"/>
+      <w:proofErr w:type="gramStart"/>
+      <w:proofErr w:type="gramEnd"/>
       <w:r>
         <w:rPr>
           <w:rFonts w:ascii="Arial" w:eastAsia="Arial" w:hAnsi="Arial" w:cs="Arial"/>
@@ -69,7 +73,7 @@
         <w:t>Monday, May 18, 2026 ● 14:00 – 18:00 ● Room: Fuyo ● IEEE INFOCOM 2026, Tokyo, Japan</w:t>
       </w:r>
     </w:p>
-    <w:p>
+    <w:p ns2:paraId="00000005" ns2:textId="5320E81A">
       <w:pPr>
         <w:widowControl/>
         <w:spacing w:before="280" w:after="280"/>
@@ -88,7 +92,7 @@
         <w:t>A half-day workshop on networking for embodied and agentic intelligence, bringing together researchers working on perception, reasoning, and action across virtual and physical environments.</w:t>
       </w:r>
     </w:p>
-    <w:p>
+    <w:p ns2:paraId="00000006" ns2:textId="0C2C310E">
       <w:pPr>
         <w:widowControl/>
         <w:pBdr>
@@ -118,7 +122,7 @@
         <w:t>Committee</w:t>
       </w:r>
     </w:p>
-    <w:p>
+    <w:p ns2:paraId="00000007" ns2:textId="6AC48496">
       <w:pPr>
         <w:widowControl/>
         <w:pBdr>
@@ -146,7 +150,7 @@
         <w:t>Yusheng Ji (National Institute of Informatics, Japan)</w:t>
       </w:r>
     </w:p>
-    <w:p>
+    <w:p ns2:paraId="3729399B" ns2:textId="77777777">
       <w:pPr>
         <w:widowControl/>
         <w:pBdr>
@@ -174,7 +178,7 @@
         <w:t>Baochun Li (University of Toronto)</w:t>
       </w:r>
     </w:p>
-    <w:p>
+    <w:p ns2:paraId="00000014" ns2:textId="5B626318">
       <w:pPr>
         <w:widowControl/>
         <w:pBdr>
@@ -204,7 +208,7 @@
         <w:t>Ruidong Li (Kanazawa University, Japan)</w:t>
       </w:r>
     </w:p>
-    <w:p>
+    <w:p ns2:paraId="00000014" ns2:textId="5B626318">
       <w:pPr>
         <w:widowControl/>
         <w:pBdr>
@@ -234,7 +238,7 @@
         <w:t>Min Song (Stevens Institute of Technology)</w:t>
       </w:r>
     </w:p>
-    <w:p>
+    <w:p ns2:paraId="00000014" ns2:textId="5B626318">
       <w:pPr>
         <w:widowControl/>
         <w:pBdr>
@@ -264,7 +268,7 @@
         <w:t>Teruo Higashino (Kyoto Tachibana University)</w:t>
       </w:r>
     </w:p>
-    <w:p>
+    <w:p ns2:paraId="00000014" ns2:textId="5B626318">
       <w:pPr>
         <w:widowControl/>
         <w:pBdr>
@@ -294,7 +298,7 @@
         <w:t>Krishna Kant (Temple University)</w:t>
       </w:r>
     </w:p>
-    <w:p>
+    <w:p ns2:paraId="00000014" ns2:textId="5B626318">
       <w:pPr>
         <w:widowControl/>
         <w:pBdr>
@@ -324,7 +328,7 @@
         <w:t>Zhenjiang Li (City University of Hong Kong)</w:t>
       </w:r>
     </w:p>
-    <w:p>
+    <w:p ns2:paraId="00000014" ns2:textId="5B626318">
       <w:pPr>
         <w:widowControl/>
         <w:pBdr>
@@ -354,7 +358,7 @@
         <w:t>Seung-Jong Park (Missouri University of Science &amp; Technology)</w:t>
       </w:r>
     </w:p>
-    <w:p>
+    <w:p ns2:paraId="00000014" ns2:textId="5B626318">
       <w:pPr>
         <w:widowControl/>
         <w:pBdr>
@@ -384,7 +388,7 @@
         <w:t>Corrado Puligheddu (Politecnico di Torino)</w:t>
       </w:r>
     </w:p>
-    <w:p>
+    <w:p ns2:paraId="00000014" ns2:textId="5B626318">
       <w:pPr>
         <w:widowControl/>
         <w:pBdr>
@@ -414,7 +418,7 @@
         <w:t>Siping Shi (The Hong Kong Polytechnic University)</w:t>
       </w:r>
     </w:p>
-    <w:p>
+    <w:p ns2:paraId="00000014" ns2:textId="5B626318">
       <w:pPr>
         <w:widowControl/>
         <w:pBdr>
@@ -444,7 +448,7 @@
         <w:t>JaeSeung Song (Sejong University)</w:t>
       </w:r>
     </w:p>
-    <w:p>
+    <w:p ns2:paraId="00000014" ns2:textId="5B626318">
       <w:pPr>
         <w:widowControl/>
         <w:pBdr>
@@ -474,7 +478,7 @@
         <w:t>Tao Song (Shanghai Jiao Tong University)</w:t>
       </w:r>
     </w:p>
-    <w:p>
+    <w:p ns2:paraId="00000014" ns2:textId="5B626318">
       <w:pPr>
         <w:widowControl/>
         <w:pBdr>
@@ -504,7 +508,7 @@
         <w:t>Feng Wang (University of Mississippi)</w:t>
       </w:r>
     </w:p>
-    <w:p>
+    <w:p ns2:paraId="00000014" ns2:textId="5B626318">
       <w:pPr>
         <w:widowControl/>
         <w:pBdr>
@@ -534,7 +538,7 @@
         <w:t>Guiling Wang (New Jersey Institute of Technology)</w:t>
       </w:r>
     </w:p>
-    <w:p>
+    <w:p ns2:paraId="00000014" ns2:textId="5B626318">
       <w:pPr>
         <w:widowControl/>
         <w:pBdr>
@@ -564,7 +568,7 @@
         <w:t>Poonam Yadav (University of York)</w:t>
       </w:r>
     </w:p>
-    <w:p>
+    <w:p ns2:paraId="00000014" ns2:textId="5B626318">
       <w:pPr>
         <w:widowControl/>
         <w:pBdr>
@@ -594,7 +598,7 @@
         <w:t>Rongfei Zeng (Northeastern University)</w:t>
       </w:r>
     </w:p>
-    <w:p>
+    <w:p ns2:paraId="00000014" ns2:textId="5B626318">
       <w:pPr>
         <w:widowControl/>
         <w:pBdr>
@@ -624,7 +628,7 @@
         <w:t>Sai Qian Zhang (New York University)</w:t>
       </w:r>
     </w:p>
-    <w:p>
+    <w:p ns2:paraId="00000014" ns2:textId="5B626318">
       <w:pPr>
         <w:widowControl/>
         <w:pBdr>
@@ -654,7 +658,7 @@
         <w:t>Xiaoxi Zhang (Sun Yat-sen University)</w:t>
       </w:r>
     </w:p>
-    <w:p>
+    <w:p ns2:paraId="00000014" ns2:textId="5B626318">
       <w:pPr>
         <w:widowControl/>
         <w:pBdr>
@@ -684,26 +688,26 @@
         <w:t>Yuanqing Zheng (Hong Kong Polytechnic University)</w:t>
       </w:r>
     </w:p>
-    <w:p>
-      <w:pPr>
-        <w:widowControl/>
-        <w:pBdr>
-          <w:top w:val="nil"/>
-          <w:left w:val="nil"/>
-          <w:bottom w:val="nil"/>
-          <w:right w:val="nil"/>
-          <w:between w:val="nil"/>
-        </w:pBdr>
-        <w:jc w:val="left"/>
-        <w:rPr>
-          <w:rFonts w:ascii="Arial" w:eastAsia="Arial" w:hAnsi="Arial" w:cs="Arial"/>
-          <w:color w:val="000000"/>
-          <w:sz w:val="22"/>
-          <w:szCs w:val="22"/>
-        </w:rPr>
-      </w:pPr>
-    </w:p>
-    <w:p>
+    <w:p ns2:paraId="00000002" ns2:textId="77777777">
+      <w:pPr>
+        <w:widowControl/>
+        <w:pBdr>
+          <w:top w:val="nil"/>
+          <w:left w:val="nil"/>
+          <w:bottom w:val="nil"/>
+          <w:right w:val="nil"/>
+          <w:between w:val="nil"/>
+        </w:pBdr>
+        <w:jc w:val="left"/>
+        <w:rPr>
+          <w:rFonts w:ascii="Arial" w:eastAsia="Arial" w:hAnsi="Arial" w:cs="Arial"/>
+          <w:color w:val="000000"/>
+          <w:sz w:val="22"/>
+          <w:szCs w:val="22"/>
+        </w:rPr>
+      </w:pPr>
+    </w:p>
+    <w:p ns2:paraId="0000001D" ns2:textId="1CC8D5F9">
       <w:pPr>
         <w:widowControl/>
         <w:pBdr>
@@ -733,7 +737,7 @@
         <w:t>Chairs:</w:t>
       </w:r>
     </w:p>
-    <w:p>
+    <w:p ns2:paraId="3F6BB205" ns2:textId="77777777">
       <w:pPr>
         <w:widowControl/>
         <w:pBdr>
@@ -761,7 +765,7 @@
         <w:t>Baochun Li (University of Toronto)</w:t>
       </w:r>
     </w:p>
-    <w:p>
+    <w:p ns2:paraId="3F6BB205" ns2:textId="77777777">
       <w:pPr>
         <w:widowControl/>
         <w:pBdr>
@@ -789,7 +793,7 @@
         <w:t>Edith C. H. Ngai (University of Hong Kong)</w:t>
       </w:r>
     </w:p>
-    <w:p>
+    <w:p ns2:paraId="3F6BB205" ns2:textId="77777777">
       <w:pPr>
         <w:widowControl/>
         <w:pBdr>
@@ -817,7 +821,7 @@
         <w:t>Ningxin Su (The Hong Kong University of Science and Technology (Guangzhou))</w:t>
       </w:r>
     </w:p>
-    <w:p>
+    <w:p ns2:paraId="3F6BB205" ns2:textId="77777777">
       <w:pPr>
         <w:widowControl/>
         <w:pBdr>
@@ -845,75 +849,75 @@
         <w:t>Hao Wang (Stevens Institute of Technology)</w:t>
       </w:r>
     </w:p>
-    <w:p>
-      <w:pPr>
-        <w:widowControl/>
-        <w:pBdr>
-          <w:top w:val="nil"/>
-          <w:left w:val="nil"/>
-          <w:bottom w:val="nil"/>
-          <w:right w:val="nil"/>
-          <w:between w:val="nil"/>
-        </w:pBdr>
-        <w:jc w:val="left"/>
-        <w:rPr>
-          <w:rFonts w:ascii="Arial" w:eastAsia="Arial" w:hAnsi="Arial" w:cs="Arial"/>
-          <w:color w:val="000000"/>
-          <w:sz w:val="22"/>
-          <w:szCs w:val="22"/>
-        </w:rPr>
-      </w:pPr>
-    </w:p>
-    <w:p>
-      <w:pPr>
-        <w:widowControl/>
-        <w:pBdr>
-          <w:top w:val="nil"/>
-          <w:left w:val="nil"/>
-          <w:bottom w:val="nil"/>
-          <w:right w:val="nil"/>
-          <w:between w:val="nil"/>
-        </w:pBdr>
-        <w:jc w:val="left"/>
-        <w:rPr>
-          <w:rFonts w:ascii="Arial" w:eastAsia="Arial" w:hAnsi="Arial" w:cs="Arial"/>
-          <w:color w:val="000000"/>
-          <w:sz w:val="22"/>
-          <w:szCs w:val="22"/>
-        </w:rPr>
-      </w:pPr>
-    </w:p>
-    <w:p>
-      <w:pPr>
-        <w:widowControl/>
-        <w:pBdr>
-          <w:top w:val="nil"/>
-          <w:left w:val="nil"/>
-          <w:bottom w:val="nil"/>
-          <w:right w:val="nil"/>
-          <w:between w:val="nil"/>
-        </w:pBdr>
-        <w:jc w:val="left"/>
-        <w:rPr>
-          <w:rFonts w:ascii="Arial" w:eastAsia="Arial" w:hAnsi="Arial" w:cs="Arial"/>
-          <w:b/>
-          <w:color w:val="000000"/>
-          <w:sz w:val="22"/>
-          <w:szCs w:val="22"/>
-        </w:rPr>
-      </w:pPr>
-      <w:r>
-        <w:rPr>
-          <w:rFonts w:ascii="Arial" w:eastAsia="Arial" w:hAnsi="Arial" w:cs="Arial"/>
-          <w:b/>
-          <w:color w:val="000000"/>
-          <w:sz w:val="22"/>
-          <w:szCs w:val="22"/>
-        </w:rPr>
-        <w:t>2:00 p.m. - 2:10 p.m.</w:t>
-      </w:r>
-    </w:p>
-    <w:p>
+    <w:p ns2:paraId="00000002" ns2:textId="77777777">
+      <w:pPr>
+        <w:widowControl/>
+        <w:pBdr>
+          <w:top w:val="nil"/>
+          <w:left w:val="nil"/>
+          <w:bottom w:val="nil"/>
+          <w:right w:val="nil"/>
+          <w:between w:val="nil"/>
+        </w:pBdr>
+        <w:jc w:val="left"/>
+        <w:rPr>
+          <w:rFonts w:ascii="Arial" w:eastAsia="Arial" w:hAnsi="Arial" w:cs="Arial"/>
+          <w:color w:val="000000"/>
+          <w:sz w:val="22"/>
+          <w:szCs w:val="22"/>
+        </w:rPr>
+      </w:pPr>
+    </w:p>
+    <w:p ns2:paraId="00000002" ns2:textId="77777777">
+      <w:pPr>
+        <w:widowControl/>
+        <w:pBdr>
+          <w:top w:val="nil"/>
+          <w:left w:val="nil"/>
+          <w:bottom w:val="nil"/>
+          <w:right w:val="nil"/>
+          <w:between w:val="nil"/>
+        </w:pBdr>
+        <w:jc w:val="left"/>
+        <w:rPr>
+          <w:rFonts w:ascii="Arial" w:eastAsia="Arial" w:hAnsi="Arial" w:cs="Arial"/>
+          <w:color w:val="000000"/>
+          <w:sz w:val="22"/>
+          <w:szCs w:val="22"/>
+        </w:rPr>
+      </w:pPr>
+    </w:p>
+    <w:p ns2:paraId="00000035" ns2:textId="601DE829">
+      <w:pPr>
+        <w:widowControl/>
+        <w:pBdr>
+          <w:top w:val="nil"/>
+          <w:left w:val="nil"/>
+          <w:bottom w:val="nil"/>
+          <w:right w:val="nil"/>
+          <w:between w:val="nil"/>
+        </w:pBdr>
+        <w:jc w:val="left"/>
+        <w:rPr>
+          <w:rFonts w:ascii="Arial" w:eastAsia="Arial" w:hAnsi="Arial" w:cs="Arial"/>
+          <w:b/>
+          <w:color w:val="000000"/>
+          <w:sz w:val="22"/>
+          <w:szCs w:val="22"/>
+        </w:rPr>
+      </w:pPr>
+      <w:r>
+        <w:rPr>
+          <w:rFonts w:ascii="Arial" w:eastAsia="Arial" w:hAnsi="Arial" w:cs="Arial"/>
+          <w:b/>
+          <w:color w:val="000000"/>
+          <w:sz w:val="22"/>
+          <w:szCs w:val="22"/>
+        </w:rPr>
+        <w:t>2:00 p.m. - 2:05 p.m.</w:t>
+      </w:r>
+    </w:p>
+    <w:p ns2:paraId="00000036" ns2:textId="77777777">
       <w:pPr>
         <w:widowControl/>
         <w:pBdr>
@@ -943,7 +947,7 @@
         <w:t>Welcome and workshop introduction</w:t>
       </w:r>
     </w:p>
-    <w:p>
+    <w:p ns2:paraId="00000005" ns2:textId="5320E81A">
       <w:pPr>
         <w:widowControl/>
         <w:spacing w:before="280" w:after="280"/>
@@ -962,56 +966,56 @@
         <w:t>Baochun Li, General Chair, together with Program Co-Chairs Edith C. H. Ngai, Ningxin Su, and Hao Wang, will introduce the workshop and the day’s program.</w:t>
       </w:r>
     </w:p>
-    <w:p>
-      <w:pPr>
-        <w:widowControl/>
-        <w:pBdr>
-          <w:top w:val="nil"/>
-          <w:left w:val="nil"/>
-          <w:bottom w:val="nil"/>
-          <w:right w:val="nil"/>
-          <w:between w:val="nil"/>
-        </w:pBdr>
-        <w:jc w:val="left"/>
-        <w:rPr>
-          <w:rFonts w:ascii="Arial" w:eastAsia="Arial" w:hAnsi="Arial" w:cs="Arial"/>
-          <w:color w:val="000000"/>
-          <w:sz w:val="22"/>
-          <w:szCs w:val="22"/>
-        </w:rPr>
-      </w:pPr>
-    </w:p>
-    <w:p>
-      <w:pPr>
-        <w:widowControl/>
-        <w:pBdr>
-          <w:top w:val="nil"/>
-          <w:left w:val="nil"/>
-          <w:bottom w:val="nil"/>
-          <w:right w:val="nil"/>
-          <w:between w:val="nil"/>
-        </w:pBdr>
-        <w:jc w:val="left"/>
-        <w:rPr>
-          <w:rFonts w:ascii="Arial" w:eastAsia="Arial" w:hAnsi="Arial" w:cs="Arial"/>
-          <w:b/>
-          <w:color w:val="000000"/>
-          <w:sz w:val="22"/>
-          <w:szCs w:val="22"/>
-        </w:rPr>
-      </w:pPr>
-      <w:r>
-        <w:rPr>
-          <w:rFonts w:ascii="Arial" w:eastAsia="Arial" w:hAnsi="Arial" w:cs="Arial"/>
-          <w:b/>
-          <w:color w:val="000000"/>
-          <w:sz w:val="22"/>
-          <w:szCs w:val="22"/>
-        </w:rPr>
-        <w:t>2:10 p.m. - 3:10 p.m.</w:t>
-      </w:r>
-    </w:p>
-    <w:p>
+    <w:p ns2:paraId="00000002" ns2:textId="77777777">
+      <w:pPr>
+        <w:widowControl/>
+        <w:pBdr>
+          <w:top w:val="nil"/>
+          <w:left w:val="nil"/>
+          <w:bottom w:val="nil"/>
+          <w:right w:val="nil"/>
+          <w:between w:val="nil"/>
+        </w:pBdr>
+        <w:jc w:val="left"/>
+        <w:rPr>
+          <w:rFonts w:ascii="Arial" w:eastAsia="Arial" w:hAnsi="Arial" w:cs="Arial"/>
+          <w:color w:val="000000"/>
+          <w:sz w:val="22"/>
+          <w:szCs w:val="22"/>
+        </w:rPr>
+      </w:pPr>
+    </w:p>
+    <w:p ns2:paraId="00000035" ns2:textId="601DE829">
+      <w:pPr>
+        <w:widowControl/>
+        <w:pBdr>
+          <w:top w:val="nil"/>
+          <w:left w:val="nil"/>
+          <w:bottom w:val="nil"/>
+          <w:right w:val="nil"/>
+          <w:between w:val="nil"/>
+        </w:pBdr>
+        <w:jc w:val="left"/>
+        <w:rPr>
+          <w:rFonts w:ascii="Arial" w:eastAsia="Arial" w:hAnsi="Arial" w:cs="Arial"/>
+          <w:b/>
+          <w:color w:val="000000"/>
+          <w:sz w:val="22"/>
+          <w:szCs w:val="22"/>
+        </w:rPr>
+      </w:pPr>
+      <w:r>
+        <w:rPr>
+          <w:rFonts w:ascii="Arial" w:eastAsia="Arial" w:hAnsi="Arial" w:cs="Arial"/>
+          <w:b/>
+          <w:color w:val="000000"/>
+          <w:sz w:val="22"/>
+          <w:szCs w:val="22"/>
+        </w:rPr>
+        <w:t>2:05 p.m. - 3:00 p.m.</w:t>
+      </w:r>
+    </w:p>
+    <w:p ns2:paraId="272B3ADD" ns2:textId="3BD4AEDE">
       <w:pPr>
         <w:rPr>
           <w:rFonts w:ascii="Arial" w:eastAsia="Arial" w:hAnsi="Arial" w:cs="Arial"/>
@@ -1032,7 +1036,7 @@
         <w:t>Keynote: Keynote talk</w:t>
       </w:r>
     </w:p>
-    <w:p>
+    <w:p ns2:paraId="0D3E61B0" ns2:textId="55EA08C1">
       <w:pPr>
         <w:rPr>
           <w:rFonts w:ascii="Arial" w:eastAsia="Arial" w:hAnsi="Arial" w:cs="Arial"/>
@@ -1051,184 +1055,105 @@
         <w:t>Speaker: TBD | Title: TBD</w:t>
       </w:r>
     </w:p>
-    <w:p>
-      <w:pPr>
-        <w:widowControl/>
-        <w:pBdr>
-          <w:top w:val="nil"/>
-          <w:left w:val="nil"/>
-          <w:bottom w:val="nil"/>
-          <w:right w:val="nil"/>
-          <w:between w:val="nil"/>
-        </w:pBdr>
-        <w:jc w:val="left"/>
-        <w:rPr>
-          <w:rFonts w:ascii="Arial" w:eastAsia="Arial" w:hAnsi="Arial" w:cs="Arial"/>
-          <w:color w:val="000000"/>
-          <w:sz w:val="22"/>
-          <w:szCs w:val="22"/>
-        </w:rPr>
-      </w:pPr>
-    </w:p>
-    <w:p>
-      <w:pPr>
-        <w:widowControl/>
-        <w:pBdr>
-          <w:top w:val="nil"/>
-          <w:left w:val="nil"/>
-          <w:bottom w:val="nil"/>
-          <w:right w:val="nil"/>
-          <w:between w:val="nil"/>
-        </w:pBdr>
-        <w:jc w:val="left"/>
-        <w:rPr>
-          <w:rFonts w:ascii="Arial" w:eastAsia="Arial" w:hAnsi="Arial" w:cs="Arial"/>
-          <w:b/>
-          <w:color w:val="000000"/>
-          <w:sz w:val="22"/>
-          <w:szCs w:val="22"/>
-        </w:rPr>
-      </w:pPr>
-      <w:r>
-        <w:rPr>
-          <w:rFonts w:ascii="Arial" w:eastAsia="Arial" w:hAnsi="Arial" w:cs="Arial"/>
-          <w:b/>
-          <w:color w:val="000000"/>
-          <w:sz w:val="22"/>
-          <w:szCs w:val="22"/>
-        </w:rPr>
-        <w:t>3:10 p.m. - 3:25 p.m.</w:t>
-      </w:r>
-    </w:p>
-    <w:p>
-      <w:pPr>
-        <w:widowControl/>
-        <w:pBdr>
-          <w:top w:val="nil"/>
-          <w:left w:val="nil"/>
-          <w:bottom w:val="nil"/>
-          <w:right w:val="nil"/>
-          <w:between w:val="nil"/>
-        </w:pBdr>
-        <w:jc w:val="left"/>
-        <w:rPr>
-          <w:rFonts w:ascii="Arial" w:eastAsia="Arial" w:hAnsi="Arial" w:cs="Arial"/>
-          <w:b/>
-          <w:color w:val="000000"/>
-          <w:sz w:val="22"/>
-          <w:szCs w:val="22"/>
-        </w:rPr>
-      </w:pPr>
-      <w:r>
-        <w:rPr>
-          <w:rFonts w:ascii="Arial" w:eastAsia="Arial" w:hAnsi="Arial" w:cs="Arial"/>
-          <w:b/>
-          <w:color w:val="000000"/>
-          <w:sz w:val="22"/>
-          <w:szCs w:val="22"/>
-        </w:rPr>
-        <w:t>Short coffee break</w:t>
-      </w:r>
-    </w:p>
-    <w:p>
-      <w:pPr>
-        <w:widowControl/>
-        <w:pBdr>
-          <w:top w:val="nil"/>
-          <w:left w:val="nil"/>
-          <w:bottom w:val="nil"/>
-          <w:right w:val="nil"/>
-          <w:between w:val="nil"/>
-        </w:pBdr>
-        <w:jc w:val="left"/>
-        <w:rPr>
-          <w:rFonts w:ascii="Arial" w:eastAsia="Arial" w:hAnsi="Arial" w:cs="Arial"/>
-          <w:color w:val="000000"/>
-          <w:sz w:val="22"/>
-          <w:szCs w:val="22"/>
-        </w:rPr>
-      </w:pPr>
-    </w:p>
-    <w:p>
-      <w:pPr>
-        <w:widowControl/>
-        <w:pBdr>
-          <w:top w:val="nil"/>
-          <w:left w:val="nil"/>
-          <w:bottom w:val="nil"/>
-          <w:right w:val="nil"/>
-          <w:between w:val="nil"/>
-        </w:pBdr>
-        <w:jc w:val="left"/>
-        <w:rPr>
-          <w:rFonts w:ascii="Arial" w:eastAsia="Arial" w:hAnsi="Arial" w:cs="Arial"/>
-          <w:b/>
-          <w:color w:val="000000"/>
-          <w:sz w:val="22"/>
-          <w:szCs w:val="22"/>
-        </w:rPr>
-      </w:pPr>
-      <w:r>
-        <w:rPr>
-          <w:rFonts w:ascii="Arial" w:eastAsia="Arial" w:hAnsi="Arial" w:cs="Arial"/>
-          <w:b/>
-          <w:color w:val="000000"/>
-          <w:sz w:val="22"/>
-          <w:szCs w:val="22"/>
-        </w:rPr>
-        <w:t>3:25 p.m. - 4:55 p.m.</w:t>
-      </w:r>
-    </w:p>
-    <w:p>
-      <w:pPr>
-        <w:widowControl/>
-        <w:pBdr>
-          <w:top w:val="nil"/>
-          <w:left w:val="nil"/>
-          <w:bottom w:val="nil"/>
-          <w:right w:val="nil"/>
-          <w:between w:val="nil"/>
-        </w:pBdr>
-        <w:jc w:val="left"/>
-        <w:rPr>
-          <w:rFonts w:ascii="Arial" w:eastAsia="Arial" w:hAnsi="Arial" w:cs="Arial"/>
-          <w:b/>
-          <w:color w:val="000000"/>
-          <w:sz w:val="22"/>
-          <w:szCs w:val="22"/>
-        </w:rPr>
-      </w:pPr>
-      <w:r>
-        <w:rPr>
-          <w:rFonts w:ascii="Arial" w:eastAsia="Arial" w:hAnsi="Arial" w:cs="Arial"/>
-          <w:b/>
-          <w:color w:val="000000"/>
-          <w:sz w:val="22"/>
-          <w:szCs w:val="22"/>
-        </w:rPr>
-        <w:t>Session I: Adaptive and Collaborative Embodied Intelligence</w:t>
-      </w:r>
-    </w:p>
-    <w:p>
-      <w:pPr>
-        <w:widowControl/>
-        <w:pBdr>
-          <w:top w:val="nil"/>
-          <w:left w:val="nil"/>
-          <w:bottom w:val="nil"/>
-          <w:right w:val="nil"/>
-          <w:between w:val="nil"/>
-        </w:pBdr>
-        <w:jc w:val="left"/>
-        <w:rPr>
-          <w:rFonts w:ascii="Arial" w:eastAsia="Arial" w:hAnsi="Arial" w:cs="Arial"/>
-          <w:color w:val="000000"/>
-          <w:sz w:val="22"/>
-          <w:szCs w:val="22"/>
-        </w:rPr>
-      </w:pPr>
-    </w:p>
-    <w:p>
+    <w:p ns2:paraId="00000002" ns2:textId="77777777">
+      <w:pPr>
+        <w:widowControl/>
+        <w:pBdr>
+          <w:top w:val="nil"/>
+          <w:left w:val="nil"/>
+          <w:bottom w:val="nil"/>
+          <w:right w:val="nil"/>
+          <w:between w:val="nil"/>
+        </w:pBdr>
+        <w:jc w:val="left"/>
+        <w:rPr>
+          <w:rFonts w:ascii="Arial" w:eastAsia="Arial" w:hAnsi="Arial" w:cs="Arial"/>
+          <w:color w:val="000000"/>
+          <w:sz w:val="22"/>
+          <w:szCs w:val="22"/>
+        </w:rPr>
+      </w:pPr>
+    </w:p>
+    <w:p ns2:paraId="00000035" ns2:textId="601DE829">
+      <w:pPr>
+        <w:widowControl/>
+        <w:pBdr>
+          <w:top w:val="nil"/>
+          <w:left w:val="nil"/>
+          <w:bottom w:val="nil"/>
+          <w:right w:val="nil"/>
+          <w:between w:val="nil"/>
+        </w:pBdr>
+        <w:jc w:val="left"/>
+        <w:rPr>
+          <w:rFonts w:ascii="Arial" w:eastAsia="Arial" w:hAnsi="Arial" w:cs="Arial"/>
+          <w:b/>
+          <w:color w:val="000000"/>
+          <w:sz w:val="22"/>
+          <w:szCs w:val="22"/>
+        </w:rPr>
+      </w:pPr>
+      <w:r>
+        <w:rPr>
+          <w:rFonts w:ascii="Arial" w:eastAsia="Arial" w:hAnsi="Arial" w:cs="Arial"/>
+          <w:b/>
+          <w:color w:val="000000"/>
+          <w:sz w:val="22"/>
+          <w:szCs w:val="22"/>
+        </w:rPr>
+        <w:t>3:00 p.m. - 3:30 p.m.</w:t>
+      </w:r>
+    </w:p>
+    <w:p ns2:paraId="0000003A" ns2:textId="7E66E165">
+      <w:pPr>
+        <w:widowControl/>
+        <w:pBdr>
+          <w:top w:val="nil"/>
+          <w:left w:val="nil"/>
+          <w:bottom w:val="nil"/>
+          <w:right w:val="nil"/>
+          <w:between w:val="nil"/>
+        </w:pBdr>
+        <w:jc w:val="left"/>
+        <w:rPr>
+          <w:rFonts w:ascii="Arial" w:eastAsia="Arial" w:hAnsi="Arial" w:cs="Arial"/>
+          <w:b/>
+          <w:color w:val="000000"/>
+          <w:sz w:val="22"/>
+          <w:szCs w:val="22"/>
+        </w:rPr>
+      </w:pPr>
+      <w:r>
+        <w:rPr>
+          <w:rFonts w:ascii="Arial" w:eastAsia="Arial" w:hAnsi="Arial" w:cs="Arial"/>
+          <w:b/>
+          <w:color w:val="000000"/>
+          <w:sz w:val="22"/>
+          <w:szCs w:val="22"/>
+        </w:rPr>
+        <w:t>Session I: Federated Learning for Embodied Intelligence</w:t>
+      </w:r>
+    </w:p>
+    <w:p ns2:paraId="00000002" ns2:textId="77777777">
+      <w:pPr>
+        <w:widowControl/>
+        <w:pBdr>
+          <w:top w:val="nil"/>
+          <w:left w:val="nil"/>
+          <w:bottom w:val="nil"/>
+          <w:right w:val="nil"/>
+          <w:between w:val="nil"/>
+        </w:pBdr>
+        <w:jc w:val="left"/>
+        <w:rPr>
+          <w:rFonts w:ascii="Arial" w:eastAsia="Arial" w:hAnsi="Arial" w:cs="Arial"/>
+          <w:color w:val="000000"/>
+          <w:sz w:val="22"/>
+          <w:szCs w:val="22"/>
+        </w:rPr>
+      </w:pPr>
+    </w:p>
+    <w:p ns2:paraId="0000003C" ns2:textId="52C06159">
       <w:pPr>
         <w:rPr>
           <w:rFonts w:ascii="Arial" w:eastAsia="Arial" w:hAnsi="Arial" w:cs="Arial"/>
@@ -1246,11 +1171,67 @@
           <w:sz w:val="22"/>
           <w:szCs w:val="22"/>
         </w:rPr>
-        <w:lastRenderedPageBreak/>
+        <w:t>Federated Self-Evolving Embodied AI Agents</w:t>
+      </w:r>
+    </w:p>
+    <w:p ns2:paraId="0000003E" ns2:textId="3BCD884C">
+      <w:pPr>
+        <w:rPr>
+          <w:rFonts w:ascii="Arial" w:eastAsia="Arial" w:hAnsi="Arial" w:cs="Arial"/>
+          <w:sz w:val="22"/>
+          <w:szCs w:val="22"/>
+        </w:rPr>
+      </w:pPr>
+      <w:r>
+        <w:rPr>
+          <w:rFonts w:ascii="Arial" w:eastAsia="Arial" w:hAnsi="Arial" w:cs="Arial"/>
+          <w:sz w:val="22"/>
+          <w:szCs w:val="22"/>
+        </w:rPr>
+        <w:t>Leming Shen and Yuanqing Zheng (The Hong Kong Polytechnic University, Hong Kong)</w:t>
+      </w:r>
+    </w:p>
+    <w:p ns2:paraId="00000002" ns2:textId="77777777">
+      <w:pPr>
+        <w:widowControl/>
+        <w:pBdr>
+          <w:top w:val="nil"/>
+          <w:left w:val="nil"/>
+          <w:bottom w:val="nil"/>
+          <w:right w:val="nil"/>
+          <w:between w:val="nil"/>
+        </w:pBdr>
+        <w:jc w:val="left"/>
+        <w:rPr>
+          <w:rFonts w:ascii="Arial" w:eastAsia="Arial" w:hAnsi="Arial" w:cs="Arial"/>
+          <w:color w:val="000000"/>
+          <w:sz w:val="22"/>
+          <w:szCs w:val="22"/>
+        </w:rPr>
+      </w:pPr>
+    </w:p>
+    <w:p ns2:paraId="0000003C" ns2:textId="52C06159">
+      <w:pPr>
+        <w:rPr>
+          <w:rFonts w:ascii="Arial" w:eastAsia="Arial" w:hAnsi="Arial" w:cs="Arial"/>
+          <w:b/>
+          <w:i/>
+          <w:sz w:val="22"/>
+          <w:szCs w:val="22"/>
+        </w:rPr>
+      </w:pPr>
+      <w:r>
+        <w:rPr>
+          <w:rFonts w:ascii="Arial" w:eastAsia="Arial" w:hAnsi="Arial" w:cs="Arial"/>
+          <w:b/>
+          <w:i/>
+          <w:sz w:val="22"/>
+          <w:szCs w:val="22"/>
+        </w:rPr>
         <w:t>pFedNavi: Structure-Aware Personalized Federated Vision-Language Navigation for Embodied AI</w:t>
       </w:r>
     </w:p>
-    <w:p>
+    <w:p ns2:paraId="0000003E" ns2:textId="3BCD884C">
       <w:pPr>
         <w:rPr>
           <w:rFonts w:ascii="Arial" w:eastAsia="Arial" w:hAnsi="Arial" w:cs="Arial"/>
@@ -1267,26 +1248,184 @@
         <w:t>Qingqian Yang and Hao Wang (Stevens Institute of Technology, USA); Sai Qian Zhang (Meta/New York University, USA); Jian Li (Stony Brook University, USA); Yang Hua (Queen's University Belfast, United Kingdom (Great Britain)); Miao Pan (University of Houston, USA); Tao Song, Zhengwei Qi and Haibing Guan (Shanghai Jiao Tong University, China)</w:t>
       </w:r>
     </w:p>
-    <w:p>
-      <w:pPr>
-        <w:widowControl/>
-        <w:pBdr>
-          <w:top w:val="nil"/>
-          <w:left w:val="nil"/>
-          <w:bottom w:val="nil"/>
-          <w:right w:val="nil"/>
-          <w:between w:val="nil"/>
-        </w:pBdr>
-        <w:jc w:val="left"/>
-        <w:rPr>
-          <w:rFonts w:ascii="Arial" w:eastAsia="Arial" w:hAnsi="Arial" w:cs="Arial"/>
-          <w:color w:val="000000"/>
-          <w:sz w:val="22"/>
-          <w:szCs w:val="22"/>
-        </w:rPr>
-      </w:pPr>
-    </w:p>
-    <w:p>
+    <w:p ns2:paraId="00000002" ns2:textId="77777777">
+      <w:pPr>
+        <w:widowControl/>
+        <w:pBdr>
+          <w:top w:val="nil"/>
+          <w:left w:val="nil"/>
+          <w:bottom w:val="nil"/>
+          <w:right w:val="nil"/>
+          <w:between w:val="nil"/>
+        </w:pBdr>
+        <w:jc w:val="left"/>
+        <w:rPr>
+          <w:rFonts w:ascii="Arial" w:eastAsia="Arial" w:hAnsi="Arial" w:cs="Arial"/>
+          <w:color w:val="000000"/>
+          <w:sz w:val="22"/>
+          <w:szCs w:val="22"/>
+        </w:rPr>
+      </w:pPr>
+    </w:p>
+    <w:p ns2:paraId="00000035" ns2:textId="601DE829">
+      <w:pPr>
+        <w:widowControl/>
+        <w:pBdr>
+          <w:top w:val="nil"/>
+          <w:left w:val="nil"/>
+          <w:bottom w:val="nil"/>
+          <w:right w:val="nil"/>
+          <w:between w:val="nil"/>
+        </w:pBdr>
+        <w:jc w:val="left"/>
+        <w:rPr>
+          <w:rFonts w:ascii="Arial" w:eastAsia="Arial" w:hAnsi="Arial" w:cs="Arial"/>
+          <w:b/>
+          <w:color w:val="000000"/>
+          <w:sz w:val="22"/>
+          <w:szCs w:val="22"/>
+        </w:rPr>
+      </w:pPr>
+      <w:r>
+        <w:rPr>
+          <w:rFonts w:ascii="Arial" w:eastAsia="Arial" w:hAnsi="Arial" w:cs="Arial"/>
+          <w:b/>
+          <w:color w:val="000000"/>
+          <w:sz w:val="22"/>
+          <w:szCs w:val="22"/>
+        </w:rPr>
+        <w:t>3:30 p.m. - 4:00 p.m.</w:t>
+      </w:r>
+    </w:p>
+    <w:p ns2:paraId="00000036" ns2:textId="77777777">
+      <w:pPr>
+        <w:widowControl/>
+        <w:pBdr>
+          <w:top w:val="nil"/>
+          <w:left w:val="nil"/>
+          <w:bottom w:val="nil"/>
+          <w:right w:val="nil"/>
+          <w:between w:val="nil"/>
+        </w:pBdr>
+        <w:jc w:val="left"/>
+        <w:rPr>
+          <w:rFonts w:ascii="Arial" w:eastAsia="Arial" w:hAnsi="Arial" w:cs="Arial"/>
+          <w:b/>
+          <w:color w:val="000000"/>
+          <w:sz w:val="22"/>
+          <w:szCs w:val="22"/>
+        </w:rPr>
+      </w:pPr>
+      <w:r>
+        <w:rPr>
+          <w:rFonts w:ascii="Arial" w:eastAsia="Arial" w:hAnsi="Arial" w:cs="Arial"/>
+          <w:b/>
+          <w:color w:val="000000"/>
+          <w:sz w:val="22"/>
+          <w:szCs w:val="22"/>
+        </w:rPr>
+        <w:t>Coffee break</w:t>
+      </w:r>
+    </w:p>
+    <w:p ns2:paraId="00000002" ns2:textId="77777777">
+      <w:pPr>
+        <w:widowControl/>
+        <w:pBdr>
+          <w:top w:val="nil"/>
+          <w:left w:val="nil"/>
+          <w:bottom w:val="nil"/>
+          <w:right w:val="nil"/>
+          <w:between w:val="nil"/>
+        </w:pBdr>
+        <w:jc w:val="left"/>
+        <w:rPr>
+          <w:rFonts w:ascii="Arial" w:eastAsia="Arial" w:hAnsi="Arial" w:cs="Arial"/>
+          <w:color w:val="000000"/>
+          <w:sz w:val="22"/>
+          <w:szCs w:val="22"/>
+        </w:rPr>
+      </w:pPr>
+    </w:p>
+    <w:p ns2:paraId="00000035" ns2:textId="601DE829">
+      <w:pPr>
+        <w:widowControl/>
+        <w:pBdr>
+          <w:top w:val="nil"/>
+          <w:left w:val="nil"/>
+          <w:bottom w:val="nil"/>
+          <w:right w:val="nil"/>
+          <w:between w:val="nil"/>
+        </w:pBdr>
+        <w:jc w:val="left"/>
+        <w:rPr>
+          <w:rFonts w:ascii="Arial" w:eastAsia="Arial" w:hAnsi="Arial" w:cs="Arial"/>
+          <w:b/>
+          <w:color w:val="000000"/>
+          <w:sz w:val="22"/>
+          <w:szCs w:val="22"/>
+        </w:rPr>
+      </w:pPr>
+      <w:r>
+        <w:rPr>
+          <w:rFonts w:ascii="Arial" w:eastAsia="Arial" w:hAnsi="Arial" w:cs="Arial"/>
+          <w:b/>
+          <w:color w:val="000000"/>
+          <w:sz w:val="22"/>
+          <w:szCs w:val="22"/>
+        </w:rPr>
+        <w:t>4:00 p.m. - 5:00 p.m.</w:t>
+      </w:r>
+    </w:p>
+    <w:p ns2:paraId="0000003A" ns2:textId="7E66E165">
+      <w:pPr>
+        <w:widowControl/>
+        <w:pBdr>
+          <w:top w:val="nil"/>
+          <w:left w:val="nil"/>
+          <w:bottom w:val="nil"/>
+          <w:right w:val="nil"/>
+          <w:between w:val="nil"/>
+        </w:pBdr>
+        <w:jc w:val="left"/>
+        <w:rPr>
+          <w:rFonts w:ascii="Arial" w:eastAsia="Arial" w:hAnsi="Arial" w:cs="Arial"/>
+          <w:b/>
+          <w:color w:val="000000"/>
+          <w:sz w:val="22"/>
+          <w:szCs w:val="22"/>
+        </w:rPr>
+      </w:pPr>
+      <w:r>
+        <w:rPr>
+          <w:rFonts w:ascii="Arial" w:eastAsia="Arial" w:hAnsi="Arial" w:cs="Arial"/>
+          <w:b/>
+          <w:color w:val="000000"/>
+          <w:sz w:val="22"/>
+          <w:szCs w:val="22"/>
+        </w:rPr>
+        <w:t>Session II: Adaptive and Collaborative Embodied Intelligence</w:t>
+      </w:r>
+    </w:p>
+    <w:p ns2:paraId="00000002" ns2:textId="77777777">
+      <w:pPr>
+        <w:widowControl/>
+        <w:pBdr>
+          <w:top w:val="nil"/>
+          <w:left w:val="nil"/>
+          <w:bottom w:val="nil"/>
+          <w:right w:val="nil"/>
+          <w:between w:val="nil"/>
+        </w:pBdr>
+        <w:jc w:val="left"/>
+        <w:rPr>
+          <w:rFonts w:ascii="Arial" w:eastAsia="Arial" w:hAnsi="Arial" w:cs="Arial"/>
+          <w:color w:val="000000"/>
+          <w:sz w:val="22"/>
+          <w:szCs w:val="22"/>
+        </w:rPr>
+      </w:pPr>
+    </w:p>
+    <w:p ns2:paraId="0000003C" ns2:textId="52C06159">
       <w:pPr>
         <w:rPr>
           <w:rFonts w:ascii="Arial" w:eastAsia="Arial" w:hAnsi="Arial" w:cs="Arial"/>
@@ -1304,46 +1443,46 @@
           <w:sz w:val="22"/>
           <w:szCs w:val="22"/>
         </w:rPr>
-        <w:t>Federated Self-Evolving Embodied AI Agents</w:t>
-      </w:r>
-    </w:p>
-    <w:p>
-      <w:pPr>
-        <w:rPr>
-          <w:rFonts w:ascii="Arial" w:eastAsia="Arial" w:hAnsi="Arial" w:cs="Arial"/>
-          <w:sz w:val="22"/>
-          <w:szCs w:val="22"/>
-        </w:rPr>
-      </w:pPr>
-      <w:r>
-        <w:rPr>
-          <w:rFonts w:ascii="Arial" w:eastAsia="Arial" w:hAnsi="Arial" w:cs="Arial"/>
-          <w:sz w:val="22"/>
-          <w:szCs w:val="22"/>
-        </w:rPr>
-        <w:t>Leming Shen and Yuanqing Zheng (The Hong Kong Polytechnic University, Hong Kong)</w:t>
-      </w:r>
-    </w:p>
-    <w:p>
-      <w:pPr>
-        <w:widowControl/>
-        <w:pBdr>
-          <w:top w:val="nil"/>
-          <w:left w:val="nil"/>
-          <w:bottom w:val="nil"/>
-          <w:right w:val="nil"/>
-          <w:between w:val="nil"/>
-        </w:pBdr>
-        <w:jc w:val="left"/>
-        <w:rPr>
-          <w:rFonts w:ascii="Arial" w:eastAsia="Arial" w:hAnsi="Arial" w:cs="Arial"/>
-          <w:color w:val="000000"/>
-          <w:sz w:val="22"/>
-          <w:szCs w:val="22"/>
-        </w:rPr>
-      </w:pPr>
-    </w:p>
-    <w:p>
+        <w:t>E-RECAP: Embodied REplanning with Cost-Aware Pruning</w:t>
+      </w:r>
+    </w:p>
+    <w:p ns2:paraId="0000003E" ns2:textId="3BCD884C">
+      <w:pPr>
+        <w:rPr>
+          <w:rFonts w:ascii="Arial" w:eastAsia="Arial" w:hAnsi="Arial" w:cs="Arial"/>
+          <w:sz w:val="22"/>
+          <w:szCs w:val="22"/>
+        </w:rPr>
+      </w:pPr>
+      <w:r>
+        <w:rPr>
+          <w:rFonts w:ascii="Arial" w:eastAsia="Arial" w:hAnsi="Arial" w:cs="Arial"/>
+          <w:sz w:val="22"/>
+          <w:szCs w:val="22"/>
+        </w:rPr>
+        <w:t>Shuaijun Liu and Ningxin Su (The Hong Kong University of Science and Technology (Guangzhou), China)</w:t>
+      </w:r>
+    </w:p>
+    <w:p ns2:paraId="00000002" ns2:textId="77777777">
+      <w:pPr>
+        <w:widowControl/>
+        <w:pBdr>
+          <w:top w:val="nil"/>
+          <w:left w:val="nil"/>
+          <w:bottom w:val="nil"/>
+          <w:right w:val="nil"/>
+          <w:between w:val="nil"/>
+        </w:pBdr>
+        <w:jc w:val="left"/>
+        <w:rPr>
+          <w:rFonts w:ascii="Arial" w:eastAsia="Arial" w:hAnsi="Arial" w:cs="Arial"/>
+          <w:color w:val="000000"/>
+          <w:sz w:val="22"/>
+          <w:szCs w:val="22"/>
+        </w:rPr>
+      </w:pPr>
+    </w:p>
+    <w:p ns2:paraId="0000003C" ns2:textId="52C06159">
       <w:pPr>
         <w:rPr>
           <w:rFonts w:ascii="Arial" w:eastAsia="Arial" w:hAnsi="Arial" w:cs="Arial"/>
@@ -1361,46 +1500,46 @@
           <w:sz w:val="22"/>
           <w:szCs w:val="22"/>
         </w:rPr>
-        <w:t>E-RECAP: Embodied REplanning with Cost-Aware Pruning</w:t>
-      </w:r>
-    </w:p>
-    <w:p>
-      <w:pPr>
-        <w:rPr>
-          <w:rFonts w:ascii="Arial" w:eastAsia="Arial" w:hAnsi="Arial" w:cs="Arial"/>
-          <w:sz w:val="22"/>
-          <w:szCs w:val="22"/>
-        </w:rPr>
-      </w:pPr>
-      <w:r>
-        <w:rPr>
-          <w:rFonts w:ascii="Arial" w:eastAsia="Arial" w:hAnsi="Arial" w:cs="Arial"/>
-          <w:sz w:val="22"/>
-          <w:szCs w:val="22"/>
-        </w:rPr>
-        <w:t>Shuaijun Liu and Ningxin Su (The Hong Kong University of Science and Technology (Guangzhou), China)</w:t>
-      </w:r>
-    </w:p>
-    <w:p>
-      <w:pPr>
-        <w:widowControl/>
-        <w:pBdr>
-          <w:top w:val="nil"/>
-          <w:left w:val="nil"/>
-          <w:bottom w:val="nil"/>
-          <w:right w:val="nil"/>
-          <w:between w:val="nil"/>
-        </w:pBdr>
-        <w:jc w:val="left"/>
-        <w:rPr>
-          <w:rFonts w:ascii="Arial" w:eastAsia="Arial" w:hAnsi="Arial" w:cs="Arial"/>
-          <w:color w:val="000000"/>
-          <w:sz w:val="22"/>
-          <w:szCs w:val="22"/>
-        </w:rPr>
-      </w:pPr>
-    </w:p>
-    <w:p>
+        <w:t>VULCAN: Vision-Language-Model Enhanced Multi-Agent Cooperative Navigation for Indoor Fire-Disaster Response</w:t>
+      </w:r>
+    </w:p>
+    <w:p ns2:paraId="0000003E" ns2:textId="3BCD884C">
+      <w:pPr>
+        <w:rPr>
+          <w:rFonts w:ascii="Arial" w:eastAsia="Arial" w:hAnsi="Arial" w:cs="Arial"/>
+          <w:sz w:val="22"/>
+          <w:szCs w:val="22"/>
+        </w:rPr>
+      </w:pPr>
+      <w:r>
+        <w:rPr>
+          <w:rFonts w:ascii="Arial" w:eastAsia="Arial" w:hAnsi="Arial" w:cs="Arial"/>
+          <w:sz w:val="22"/>
+          <w:szCs w:val="22"/>
+        </w:rPr>
+        <w:t>Shengding Liu and Qiben Yan (Michigan State University, USA)</w:t>
+      </w:r>
+    </w:p>
+    <w:p ns2:paraId="00000002" ns2:textId="77777777">
+      <w:pPr>
+        <w:widowControl/>
+        <w:pBdr>
+          <w:top w:val="nil"/>
+          <w:left w:val="nil"/>
+          <w:bottom w:val="nil"/>
+          <w:right w:val="nil"/>
+          <w:between w:val="nil"/>
+        </w:pBdr>
+        <w:jc w:val="left"/>
+        <w:rPr>
+          <w:rFonts w:ascii="Arial" w:eastAsia="Arial" w:hAnsi="Arial" w:cs="Arial"/>
+          <w:color w:val="000000"/>
+          <w:sz w:val="22"/>
+          <w:szCs w:val="22"/>
+        </w:rPr>
+      </w:pPr>
+    </w:p>
+    <w:p ns2:paraId="0000003C" ns2:textId="52C06159">
       <w:pPr>
         <w:rPr>
           <w:rFonts w:ascii="Arial" w:eastAsia="Arial" w:hAnsi="Arial" w:cs="Arial"/>
@@ -1418,46 +1557,46 @@
           <w:sz w:val="22"/>
           <w:szCs w:val="22"/>
         </w:rPr>
-        <w:t>VULCAN: Vision-Language-Model Enhanced Multi-Agent Cooperative Navigation for Indoor Fire-Disaster Response</w:t>
-      </w:r>
-    </w:p>
-    <w:p>
-      <w:pPr>
-        <w:rPr>
-          <w:rFonts w:ascii="Arial" w:eastAsia="Arial" w:hAnsi="Arial" w:cs="Arial"/>
-          <w:sz w:val="22"/>
-          <w:szCs w:val="22"/>
-        </w:rPr>
-      </w:pPr>
-      <w:r>
-        <w:rPr>
-          <w:rFonts w:ascii="Arial" w:eastAsia="Arial" w:hAnsi="Arial" w:cs="Arial"/>
-          <w:sz w:val="22"/>
-          <w:szCs w:val="22"/>
-        </w:rPr>
-        <w:t>Shengding Liu and Qiben Yan (Michigan State University, USA)</w:t>
-      </w:r>
-    </w:p>
-    <w:p>
-      <w:pPr>
-        <w:widowControl/>
-        <w:pBdr>
-          <w:top w:val="nil"/>
-          <w:left w:val="nil"/>
-          <w:bottom w:val="nil"/>
-          <w:right w:val="nil"/>
-          <w:between w:val="nil"/>
-        </w:pBdr>
-        <w:jc w:val="left"/>
-        <w:rPr>
-          <w:rFonts w:ascii="Arial" w:eastAsia="Arial" w:hAnsi="Arial" w:cs="Arial"/>
-          <w:color w:val="000000"/>
-          <w:sz w:val="22"/>
-          <w:szCs w:val="22"/>
-        </w:rPr>
-      </w:pPr>
-    </w:p>
-    <w:p>
+        <w:t>Rethinking IoT for Embodied AI: From Data Infrastructure to Intelligence Infrastructure</w:t>
+      </w:r>
+    </w:p>
+    <w:p ns2:paraId="0000003E" ns2:textId="3BCD884C">
+      <w:pPr>
+        <w:rPr>
+          <w:rFonts w:ascii="Arial" w:eastAsia="Arial" w:hAnsi="Arial" w:cs="Arial"/>
+          <w:sz w:val="22"/>
+          <w:szCs w:val="22"/>
+        </w:rPr>
+      </w:pPr>
+      <w:r>
+        <w:rPr>
+          <w:rFonts w:ascii="Arial" w:eastAsia="Arial" w:hAnsi="Arial" w:cs="Arial"/>
+          <w:sz w:val="22"/>
+          <w:szCs w:val="22"/>
+        </w:rPr>
+        <w:t>Shuai Tong and Jiliang Wang (Tsinghua University, China)</w:t>
+      </w:r>
+    </w:p>
+    <w:p ns2:paraId="00000002" ns2:textId="77777777">
+      <w:pPr>
+        <w:widowControl/>
+        <w:pBdr>
+          <w:top w:val="nil"/>
+          <w:left w:val="nil"/>
+          <w:bottom w:val="nil"/>
+          <w:right w:val="nil"/>
+          <w:between w:val="nil"/>
+        </w:pBdr>
+        <w:jc w:val="left"/>
+        <w:rPr>
+          <w:rFonts w:ascii="Arial" w:eastAsia="Arial" w:hAnsi="Arial" w:cs="Arial"/>
+          <w:color w:val="000000"/>
+          <w:sz w:val="22"/>
+          <w:szCs w:val="22"/>
+        </w:rPr>
+      </w:pPr>
+    </w:p>
+    <w:p ns2:paraId="0000003C" ns2:textId="52C06159">
       <w:pPr>
         <w:rPr>
           <w:rFonts w:ascii="Arial" w:eastAsia="Arial" w:hAnsi="Arial" w:cs="Arial"/>
@@ -1475,46 +1614,204 @@
           <w:sz w:val="22"/>
           <w:szCs w:val="22"/>
         </w:rPr>
-        <w:t>Rethinking IoT for Embodied AI: From Data Infrastructure to Intelligence Infrastructure</w:t>
-      </w:r>
-    </w:p>
-    <w:p>
-      <w:pPr>
-        <w:rPr>
-          <w:rFonts w:ascii="Arial" w:eastAsia="Arial" w:hAnsi="Arial" w:cs="Arial"/>
-          <w:sz w:val="22"/>
-          <w:szCs w:val="22"/>
-        </w:rPr>
-      </w:pPr>
-      <w:r>
-        <w:rPr>
-          <w:rFonts w:ascii="Arial" w:eastAsia="Arial" w:hAnsi="Arial" w:cs="Arial"/>
-          <w:sz w:val="22"/>
-          <w:szCs w:val="22"/>
-        </w:rPr>
-        <w:t>Shuai Tong and Jiliang Wang (Tsinghua University, China)</w:t>
-      </w:r>
-    </w:p>
-    <w:p>
-      <w:pPr>
-        <w:widowControl/>
-        <w:pBdr>
-          <w:top w:val="nil"/>
-          <w:left w:val="nil"/>
-          <w:bottom w:val="nil"/>
-          <w:right w:val="nil"/>
-          <w:between w:val="nil"/>
-        </w:pBdr>
-        <w:jc w:val="left"/>
-        <w:rPr>
-          <w:rFonts w:ascii="Arial" w:eastAsia="Arial" w:hAnsi="Arial" w:cs="Arial"/>
-          <w:color w:val="000000"/>
-          <w:sz w:val="22"/>
-          <w:szCs w:val="22"/>
-        </w:rPr>
-      </w:pPr>
-    </w:p>
-    <w:p>
+        <w:t>KV-SC: KV-Based Semantic Collaboration for Distributed Embodied Intelligence Networks</w:t>
+      </w:r>
+    </w:p>
+    <w:p ns2:paraId="0000003E" ns2:textId="3BCD884C">
+      <w:pPr>
+        <w:rPr>
+          <w:rFonts w:ascii="Arial" w:eastAsia="Arial" w:hAnsi="Arial" w:cs="Arial"/>
+          <w:sz w:val="22"/>
+          <w:szCs w:val="22"/>
+        </w:rPr>
+      </w:pPr>
+      <w:r>
+        <w:rPr>
+          <w:rFonts w:ascii="Arial" w:eastAsia="Arial" w:hAnsi="Arial" w:cs="Arial"/>
+          <w:sz w:val="22"/>
+          <w:szCs w:val="22"/>
+        </w:rPr>
+        <w:t>Baoxia Du and Ruidong Li (Kanazawa University, Japan); Yinfeng Cao (The Hong Kong Polytechnic University, Hong Kong); Dusit Niyato (Nanyang Technological University, Singapore)</w:t>
+      </w:r>
+    </w:p>
+    <w:p ns2:paraId="00000002" ns2:textId="77777777">
+      <w:pPr>
+        <w:widowControl/>
+        <w:pBdr>
+          <w:top w:val="nil"/>
+          <w:left w:val="nil"/>
+          <w:bottom w:val="nil"/>
+          <w:right w:val="nil"/>
+          <w:between w:val="nil"/>
+        </w:pBdr>
+        <w:jc w:val="left"/>
+        <w:rPr>
+          <w:rFonts w:ascii="Arial" w:eastAsia="Arial" w:hAnsi="Arial" w:cs="Arial"/>
+          <w:color w:val="000000"/>
+          <w:sz w:val="22"/>
+          <w:szCs w:val="22"/>
+        </w:rPr>
+      </w:pPr>
+    </w:p>
+    <w:p ns2:paraId="00000035" ns2:textId="601DE829">
+      <w:pPr>
+        <w:widowControl/>
+        <w:pBdr>
+          <w:top w:val="nil"/>
+          <w:left w:val="nil"/>
+          <w:bottom w:val="nil"/>
+          <w:right w:val="nil"/>
+          <w:between w:val="nil"/>
+        </w:pBdr>
+        <w:jc w:val="left"/>
+        <w:rPr>
+          <w:rFonts w:ascii="Arial" w:eastAsia="Arial" w:hAnsi="Arial" w:cs="Arial"/>
+          <w:b/>
+          <w:color w:val="000000"/>
+          <w:sz w:val="22"/>
+          <w:szCs w:val="22"/>
+        </w:rPr>
+      </w:pPr>
+      <w:r>
+        <w:rPr>
+          <w:rFonts w:ascii="Arial" w:eastAsia="Arial" w:hAnsi="Arial" w:cs="Arial"/>
+          <w:b/>
+          <w:color w:val="000000"/>
+          <w:sz w:val="22"/>
+          <w:szCs w:val="22"/>
+        </w:rPr>
+        <w:t>5:00 p.m. - 5:15 p.m.</w:t>
+      </w:r>
+    </w:p>
+    <w:p ns2:paraId="00000036" ns2:textId="77777777">
+      <w:pPr>
+        <w:widowControl/>
+        <w:pBdr>
+          <w:top w:val="nil"/>
+          <w:left w:val="nil"/>
+          <w:bottom w:val="nil"/>
+          <w:right w:val="nil"/>
+          <w:between w:val="nil"/>
+        </w:pBdr>
+        <w:jc w:val="left"/>
+        <w:rPr>
+          <w:rFonts w:ascii="Arial" w:eastAsia="Arial" w:hAnsi="Arial" w:cs="Arial"/>
+          <w:b/>
+          <w:color w:val="000000"/>
+          <w:sz w:val="22"/>
+          <w:szCs w:val="22"/>
+        </w:rPr>
+      </w:pPr>
+      <w:r>
+        <w:rPr>
+          <w:rFonts w:ascii="Arial" w:eastAsia="Arial" w:hAnsi="Arial" w:cs="Arial"/>
+          <w:b/>
+          <w:color w:val="000000"/>
+          <w:sz w:val="22"/>
+          <w:szCs w:val="22"/>
+        </w:rPr>
+        <w:t>Coffee and tea break</w:t>
+      </w:r>
+    </w:p>
+    <w:p ns2:paraId="00000002" ns2:textId="77777777">
+      <w:pPr>
+        <w:widowControl/>
+        <w:pBdr>
+          <w:top w:val="nil"/>
+          <w:left w:val="nil"/>
+          <w:bottom w:val="nil"/>
+          <w:right w:val="nil"/>
+          <w:between w:val="nil"/>
+        </w:pBdr>
+        <w:jc w:val="left"/>
+        <w:rPr>
+          <w:rFonts w:ascii="Arial" w:eastAsia="Arial" w:hAnsi="Arial" w:cs="Arial"/>
+          <w:color w:val="000000"/>
+          <w:sz w:val="22"/>
+          <w:szCs w:val="22"/>
+        </w:rPr>
+      </w:pPr>
+    </w:p>
+    <w:p ns2:paraId="00000035" ns2:textId="601DE829">
+      <w:pPr>
+        <w:widowControl/>
+        <w:pBdr>
+          <w:top w:val="nil"/>
+          <w:left w:val="nil"/>
+          <w:bottom w:val="nil"/>
+          <w:right w:val="nil"/>
+          <w:between w:val="nil"/>
+        </w:pBdr>
+        <w:jc w:val="left"/>
+        <w:rPr>
+          <w:rFonts w:ascii="Arial" w:eastAsia="Arial" w:hAnsi="Arial" w:cs="Arial"/>
+          <w:b/>
+          <w:color w:val="000000"/>
+          <w:sz w:val="22"/>
+          <w:szCs w:val="22"/>
+        </w:rPr>
+      </w:pPr>
+      <w:r>
+        <w:rPr>
+          <w:rFonts w:ascii="Arial" w:eastAsia="Arial" w:hAnsi="Arial" w:cs="Arial"/>
+          <w:b/>
+          <w:color w:val="000000"/>
+          <w:sz w:val="22"/>
+          <w:szCs w:val="22"/>
+        </w:rPr>
+        <w:t>5:15 p.m. - 5:55 p.m.</w:t>
+      </w:r>
+    </w:p>
+    <w:p ns2:paraId="0000003A" ns2:textId="7E66E165">
+      <w:pPr>
+        <w:widowControl/>
+        <w:pBdr>
+          <w:top w:val="nil"/>
+          <w:left w:val="nil"/>
+          <w:bottom w:val="nil"/>
+          <w:right w:val="nil"/>
+          <w:between w:val="nil"/>
+        </w:pBdr>
+        <w:jc w:val="left"/>
+        <w:rPr>
+          <w:rFonts w:ascii="Arial" w:eastAsia="Arial" w:hAnsi="Arial" w:cs="Arial"/>
+          <w:b/>
+          <w:color w:val="000000"/>
+          <w:sz w:val="22"/>
+          <w:szCs w:val="22"/>
+        </w:rPr>
+      </w:pPr>
+      <w:r>
+        <w:rPr>
+          <w:rFonts w:ascii="Arial" w:eastAsia="Arial" w:hAnsi="Arial" w:cs="Arial"/>
+          <w:b/>
+          <w:color w:val="000000"/>
+          <w:sz w:val="22"/>
+          <w:szCs w:val="22"/>
+        </w:rPr>
+        <w:t>Session III: Systems, Security, and Optimization for Embodied AI Infrastructure</w:t>
+      </w:r>
+    </w:p>
+    <w:p ns2:paraId="00000002" ns2:textId="77777777">
+      <w:pPr>
+        <w:widowControl/>
+        <w:pBdr>
+          <w:top w:val="nil"/>
+          <w:left w:val="nil"/>
+          <w:bottom w:val="nil"/>
+          <w:right w:val="nil"/>
+          <w:between w:val="nil"/>
+        </w:pBdr>
+        <w:jc w:val="left"/>
+        <w:rPr>
+          <w:rFonts w:ascii="Arial" w:eastAsia="Arial" w:hAnsi="Arial" w:cs="Arial"/>
+          <w:color w:val="000000"/>
+          <w:sz w:val="22"/>
+          <w:szCs w:val="22"/>
+        </w:rPr>
+      </w:pPr>
+    </w:p>
+    <w:p ns2:paraId="0000003C" ns2:textId="52C06159">
       <w:pPr>
         <w:rPr>
           <w:rFonts w:ascii="Arial" w:eastAsia="Arial" w:hAnsi="Arial" w:cs="Arial"/>
@@ -1532,204 +1829,46 @@
           <w:sz w:val="22"/>
           <w:szCs w:val="22"/>
         </w:rPr>
-        <w:t>KV-SC: KV-Based Semantic Collaboration for Distributed Embodied Intelligence Networks</w:t>
-      </w:r>
-    </w:p>
-    <w:p>
-      <w:pPr>
-        <w:rPr>
-          <w:rFonts w:ascii="Arial" w:eastAsia="Arial" w:hAnsi="Arial" w:cs="Arial"/>
-          <w:sz w:val="22"/>
-          <w:szCs w:val="22"/>
-        </w:rPr>
-      </w:pPr>
-      <w:r>
-        <w:rPr>
-          <w:rFonts w:ascii="Arial" w:eastAsia="Arial" w:hAnsi="Arial" w:cs="Arial"/>
-          <w:sz w:val="22"/>
-          <w:szCs w:val="22"/>
-        </w:rPr>
-        <w:t>Baoxia Du and Ruidong Li (Kanazawa University, Japan); Yinfeng Cao (The Hong Kong Polytechnic University, Hong Kong); Dusit Niyato (Nanyang Technological University, Singapore)</w:t>
-      </w:r>
-    </w:p>
-    <w:p>
-      <w:pPr>
-        <w:widowControl/>
-        <w:pBdr>
-          <w:top w:val="nil"/>
-          <w:left w:val="nil"/>
-          <w:bottom w:val="nil"/>
-          <w:right w:val="nil"/>
-          <w:between w:val="nil"/>
-        </w:pBdr>
-        <w:jc w:val="left"/>
-        <w:rPr>
-          <w:rFonts w:ascii="Arial" w:eastAsia="Arial" w:hAnsi="Arial" w:cs="Arial"/>
-          <w:color w:val="000000"/>
-          <w:sz w:val="22"/>
-          <w:szCs w:val="22"/>
-        </w:rPr>
-      </w:pPr>
-    </w:p>
-    <w:p>
-      <w:pPr>
-        <w:widowControl/>
-        <w:pBdr>
-          <w:top w:val="nil"/>
-          <w:left w:val="nil"/>
-          <w:bottom w:val="nil"/>
-          <w:right w:val="nil"/>
-          <w:between w:val="nil"/>
-        </w:pBdr>
-        <w:jc w:val="left"/>
-        <w:rPr>
-          <w:rFonts w:ascii="Arial" w:eastAsia="Arial" w:hAnsi="Arial" w:cs="Arial"/>
-          <w:b/>
-          <w:color w:val="000000"/>
-          <w:sz w:val="22"/>
-          <w:szCs w:val="22"/>
-        </w:rPr>
-      </w:pPr>
-      <w:r>
-        <w:rPr>
-          <w:rFonts w:ascii="Arial" w:eastAsia="Arial" w:hAnsi="Arial" w:cs="Arial"/>
-          <w:b/>
-          <w:color w:val="000000"/>
-          <w:sz w:val="22"/>
-          <w:szCs w:val="22"/>
-        </w:rPr>
-        <w:t>4:55 p.m. - 5:10 p.m.</w:t>
-      </w:r>
-    </w:p>
-    <w:p>
-      <w:pPr>
-        <w:widowControl/>
-        <w:pBdr>
-          <w:top w:val="nil"/>
-          <w:left w:val="nil"/>
-          <w:bottom w:val="nil"/>
-          <w:right w:val="nil"/>
-          <w:between w:val="nil"/>
-        </w:pBdr>
-        <w:jc w:val="left"/>
-        <w:rPr>
-          <w:rFonts w:ascii="Arial" w:eastAsia="Arial" w:hAnsi="Arial" w:cs="Arial"/>
-          <w:b/>
-          <w:color w:val="000000"/>
-          <w:sz w:val="22"/>
-          <w:szCs w:val="22"/>
-        </w:rPr>
-      </w:pPr>
-      <w:r>
-        <w:rPr>
-          <w:rFonts w:ascii="Arial" w:eastAsia="Arial" w:hAnsi="Arial" w:cs="Arial"/>
-          <w:b/>
-          <w:color w:val="000000"/>
-          <w:sz w:val="22"/>
-          <w:szCs w:val="22"/>
-        </w:rPr>
-        <w:t>Coffee and tea break</w:t>
-      </w:r>
-    </w:p>
-    <w:p>
-      <w:pPr>
-        <w:widowControl/>
-        <w:pBdr>
-          <w:top w:val="nil"/>
-          <w:left w:val="nil"/>
-          <w:bottom w:val="nil"/>
-          <w:right w:val="nil"/>
-          <w:between w:val="nil"/>
-        </w:pBdr>
-        <w:jc w:val="left"/>
-        <w:rPr>
-          <w:rFonts w:ascii="Arial" w:eastAsia="Arial" w:hAnsi="Arial" w:cs="Arial"/>
-          <w:color w:val="000000"/>
-          <w:sz w:val="22"/>
-          <w:szCs w:val="22"/>
-        </w:rPr>
-      </w:pPr>
-    </w:p>
-    <w:p>
-      <w:pPr>
-        <w:widowControl/>
-        <w:pBdr>
-          <w:top w:val="nil"/>
-          <w:left w:val="nil"/>
-          <w:bottom w:val="nil"/>
-          <w:right w:val="nil"/>
-          <w:between w:val="nil"/>
-        </w:pBdr>
-        <w:jc w:val="left"/>
-        <w:rPr>
-          <w:rFonts w:ascii="Arial" w:eastAsia="Arial" w:hAnsi="Arial" w:cs="Arial"/>
-          <w:b/>
-          <w:color w:val="000000"/>
-          <w:sz w:val="22"/>
-          <w:szCs w:val="22"/>
-        </w:rPr>
-      </w:pPr>
-      <w:r>
-        <w:rPr>
-          <w:rFonts w:ascii="Arial" w:eastAsia="Arial" w:hAnsi="Arial" w:cs="Arial"/>
-          <w:b/>
-          <w:color w:val="000000"/>
-          <w:sz w:val="22"/>
-          <w:szCs w:val="22"/>
-        </w:rPr>
-        <w:t>5:10 p.m. - 5:50 p.m.</w:t>
-      </w:r>
-    </w:p>
-    <w:p>
-      <w:pPr>
-        <w:widowControl/>
-        <w:pBdr>
-          <w:top w:val="nil"/>
-          <w:left w:val="nil"/>
-          <w:bottom w:val="nil"/>
-          <w:right w:val="nil"/>
-          <w:between w:val="nil"/>
-        </w:pBdr>
-        <w:jc w:val="left"/>
-        <w:rPr>
-          <w:rFonts w:ascii="Arial" w:eastAsia="Arial" w:hAnsi="Arial" w:cs="Arial"/>
-          <w:b/>
-          <w:color w:val="000000"/>
-          <w:sz w:val="22"/>
-          <w:szCs w:val="22"/>
-        </w:rPr>
-      </w:pPr>
-      <w:r>
-        <w:rPr>
-          <w:rFonts w:ascii="Arial" w:eastAsia="Arial" w:hAnsi="Arial" w:cs="Arial"/>
-          <w:b/>
-          <w:color w:val="000000"/>
-          <w:sz w:val="22"/>
-          <w:szCs w:val="22"/>
-        </w:rPr>
-        <w:t>Session II: Systems, Security, and Optimization for Embodied AI Infrastructure</w:t>
-      </w:r>
-    </w:p>
-    <w:p>
-      <w:pPr>
-        <w:widowControl/>
-        <w:pBdr>
-          <w:top w:val="nil"/>
-          <w:left w:val="nil"/>
-          <w:bottom w:val="nil"/>
-          <w:right w:val="nil"/>
-          <w:between w:val="nil"/>
-        </w:pBdr>
-        <w:jc w:val="left"/>
-        <w:rPr>
-          <w:rFonts w:ascii="Arial" w:eastAsia="Arial" w:hAnsi="Arial" w:cs="Arial"/>
-          <w:color w:val="000000"/>
-          <w:sz w:val="22"/>
-          <w:szCs w:val="22"/>
-        </w:rPr>
-      </w:pPr>
-    </w:p>
-    <w:p>
+        <w:t>Jiao: Bridging Isolation and Customization in Mixed Criticality Robotics</w:t>
+      </w:r>
+    </w:p>
+    <w:p ns2:paraId="0000003E" ns2:textId="3BCD884C">
+      <w:pPr>
+        <w:rPr>
+          <w:rFonts w:ascii="Arial" w:eastAsia="Arial" w:hAnsi="Arial" w:cs="Arial"/>
+          <w:sz w:val="22"/>
+          <w:szCs w:val="22"/>
+        </w:rPr>
+      </w:pPr>
+      <w:r>
+        <w:rPr>
+          <w:rFonts w:ascii="Arial" w:eastAsia="Arial" w:hAnsi="Arial" w:cs="Arial"/>
+          <w:sz w:val="22"/>
+          <w:szCs w:val="22"/>
+        </w:rPr>
+        <w:t>James Yen, ZhiBai Huang and Zhixiang Wei (Shanghai Jiaotong University, China); Tinghao Yi, Shupeng Zeng and Liang Pang (Openmind, China); Songtao Xue (Shanghai Jiaotong University, China); Zhengwei Qi (Shanghai Jiao Tong University, China)</w:t>
+      </w:r>
+    </w:p>
+    <w:p ns2:paraId="00000002" ns2:textId="77777777">
+      <w:pPr>
+        <w:widowControl/>
+        <w:pBdr>
+          <w:top w:val="nil"/>
+          <w:left w:val="nil"/>
+          <w:bottom w:val="nil"/>
+          <w:right w:val="nil"/>
+          <w:between w:val="nil"/>
+        </w:pBdr>
+        <w:jc w:val="left"/>
+        <w:rPr>
+          <w:rFonts w:ascii="Arial" w:eastAsia="Arial" w:hAnsi="Arial" w:cs="Arial"/>
+          <w:color w:val="000000"/>
+          <w:sz w:val="22"/>
+          <w:szCs w:val="22"/>
+        </w:rPr>
+      </w:pPr>
+    </w:p>
+    <w:p ns2:paraId="0000003C" ns2:textId="52C06159">
       <w:pPr>
         <w:rPr>
           <w:rFonts w:ascii="Arial" w:eastAsia="Arial" w:hAnsi="Arial" w:cs="Arial"/>
@@ -1747,46 +1886,46 @@
           <w:sz w:val="22"/>
           <w:szCs w:val="22"/>
         </w:rPr>
-        <w:t>Jiao: Bridging Isolation and Customization in Mixed Criticality Robotics</w:t>
-      </w:r>
-    </w:p>
-    <w:p>
-      <w:pPr>
-        <w:rPr>
-          <w:rFonts w:ascii="Arial" w:eastAsia="Arial" w:hAnsi="Arial" w:cs="Arial"/>
-          <w:sz w:val="22"/>
-          <w:szCs w:val="22"/>
-        </w:rPr>
-      </w:pPr>
-      <w:r>
-        <w:rPr>
-          <w:rFonts w:ascii="Arial" w:eastAsia="Arial" w:hAnsi="Arial" w:cs="Arial"/>
-          <w:sz w:val="22"/>
-          <w:szCs w:val="22"/>
-        </w:rPr>
-        <w:t>James Yen, ZhiBai Huang and Zhixiang Wei (Shanghai Jiaotong University, China); Tinghao Yi, Shupeng Zeng and Liang Pang (Openmind, China); Songtao Xue (Shanghai Jiaotong University, China); Zhengwei Qi (Shanghai Jiao Tong University, China)</w:t>
-      </w:r>
-    </w:p>
-    <w:p>
-      <w:pPr>
-        <w:widowControl/>
-        <w:pBdr>
-          <w:top w:val="nil"/>
-          <w:left w:val="nil"/>
-          <w:bottom w:val="nil"/>
-          <w:right w:val="nil"/>
-          <w:between w:val="nil"/>
-        </w:pBdr>
-        <w:jc w:val="left"/>
-        <w:rPr>
-          <w:rFonts w:ascii="Arial" w:eastAsia="Arial" w:hAnsi="Arial" w:cs="Arial"/>
-          <w:color w:val="000000"/>
-          <w:sz w:val="22"/>
-          <w:szCs w:val="22"/>
-        </w:rPr>
-      </w:pPr>
-    </w:p>
-    <w:p>
+        <w:t>MEC-based HFL: A Fair Aggregation Approach for Non-IID Data via Minimum Enclosing Circle</w:t>
+      </w:r>
+    </w:p>
+    <w:p ns2:paraId="0000003E" ns2:textId="3BCD884C">
+      <w:pPr>
+        <w:rPr>
+          <w:rFonts w:ascii="Arial" w:eastAsia="Arial" w:hAnsi="Arial" w:cs="Arial"/>
+          <w:sz w:val="22"/>
+          <w:szCs w:val="22"/>
+        </w:rPr>
+      </w:pPr>
+      <w:r>
+        <w:rPr>
+          <w:rFonts w:ascii="Arial" w:eastAsia="Arial" w:hAnsi="Arial" w:cs="Arial"/>
+          <w:sz w:val="22"/>
+          <w:szCs w:val="22"/>
+        </w:rPr>
+        <w:t>Fan-Hsun Tseng, Jiang-Yi Zeng and Yu-Teng Lai (National Cheng Kung University, Taiwan); Hsin-Hung Cho and Chi-Yuan Chen (National Ilan University, Taiwan)</w:t>
+      </w:r>
+    </w:p>
+    <w:p ns2:paraId="00000002" ns2:textId="77777777">
+      <w:pPr>
+        <w:widowControl/>
+        <w:pBdr>
+          <w:top w:val="nil"/>
+          <w:left w:val="nil"/>
+          <w:bottom w:val="nil"/>
+          <w:right w:val="nil"/>
+          <w:between w:val="nil"/>
+        </w:pBdr>
+        <w:jc w:val="left"/>
+        <w:rPr>
+          <w:rFonts w:ascii="Arial" w:eastAsia="Arial" w:hAnsi="Arial" w:cs="Arial"/>
+          <w:color w:val="000000"/>
+          <w:sz w:val="22"/>
+          <w:szCs w:val="22"/>
+        </w:rPr>
+      </w:pPr>
+    </w:p>
+    <w:p ns2:paraId="0000003C" ns2:textId="52C06159">
       <w:pPr>
         <w:rPr>
           <w:rFonts w:ascii="Arial" w:eastAsia="Arial" w:hAnsi="Arial" w:cs="Arial"/>
@@ -1804,46 +1943,46 @@
           <w:sz w:val="22"/>
           <w:szCs w:val="22"/>
         </w:rPr>
-        <w:t>MEC-based HFL: A Fair Aggregation Approach for Non-IID Data via Minimum Enclosing Circle</w:t>
-      </w:r>
-    </w:p>
-    <w:p>
-      <w:pPr>
-        <w:rPr>
-          <w:rFonts w:ascii="Arial" w:eastAsia="Arial" w:hAnsi="Arial" w:cs="Arial"/>
-          <w:sz w:val="22"/>
-          <w:szCs w:val="22"/>
-        </w:rPr>
-      </w:pPr>
-      <w:r>
-        <w:rPr>
-          <w:rFonts w:ascii="Arial" w:eastAsia="Arial" w:hAnsi="Arial" w:cs="Arial"/>
-          <w:sz w:val="22"/>
-          <w:szCs w:val="22"/>
-        </w:rPr>
-        <w:t>Fan-Hsun Tseng, Jiang-Yi Zeng and Yu-Teng Lai (National Cheng Kung University, Taiwan); Hsin-Hung Cho and Chi-Yuan Chen (National Ilan University, Taiwan)</w:t>
-      </w:r>
-    </w:p>
-    <w:p>
-      <w:pPr>
-        <w:widowControl/>
-        <w:pBdr>
-          <w:top w:val="nil"/>
-          <w:left w:val="nil"/>
-          <w:bottom w:val="nil"/>
-          <w:right w:val="nil"/>
-          <w:between w:val="nil"/>
-        </w:pBdr>
-        <w:jc w:val="left"/>
-        <w:rPr>
-          <w:rFonts w:ascii="Arial" w:eastAsia="Arial" w:hAnsi="Arial" w:cs="Arial"/>
-          <w:color w:val="000000"/>
-          <w:sz w:val="22"/>
-          <w:szCs w:val="22"/>
-        </w:rPr>
-      </w:pPr>
-    </w:p>
-    <w:p>
+        <w:t>Towards Operating System Automated Optimization via System Knowledge and Tunability Embedding</w:t>
+      </w:r>
+    </w:p>
+    <w:p ns2:paraId="0000003E" ns2:textId="3BCD884C">
+      <w:pPr>
+        <w:rPr>
+          <w:rFonts w:ascii="Arial" w:eastAsia="Arial" w:hAnsi="Arial" w:cs="Arial"/>
+          <w:sz w:val="22"/>
+          <w:szCs w:val="22"/>
+        </w:rPr>
+      </w:pPr>
+      <w:r>
+        <w:rPr>
+          <w:rFonts w:ascii="Arial" w:eastAsia="Arial" w:hAnsi="Arial" w:cs="Arial"/>
+          <w:sz w:val="22"/>
+          <w:szCs w:val="22"/>
+        </w:rPr>
+        <w:t>Yuxin Ren, Donghui Chen, Yun Hao, Nan Zhang, Zhipeng Xie, Yanqiang Liu, Bo Wan, Bo Zhang, Xu Wang, Wanming Hu, Haili Bai, Ning Jia and Xinwei Hu (Huawei Technologies, China)</w:t>
+      </w:r>
+    </w:p>
+    <w:p ns2:paraId="00000002" ns2:textId="77777777">
+      <w:pPr>
+        <w:widowControl/>
+        <w:pBdr>
+          <w:top w:val="nil"/>
+          <w:left w:val="nil"/>
+          <w:bottom w:val="nil"/>
+          <w:right w:val="nil"/>
+          <w:between w:val="nil"/>
+        </w:pBdr>
+        <w:jc w:val="left"/>
+        <w:rPr>
+          <w:rFonts w:ascii="Arial" w:eastAsia="Arial" w:hAnsi="Arial" w:cs="Arial"/>
+          <w:color w:val="000000"/>
+          <w:sz w:val="22"/>
+          <w:szCs w:val="22"/>
+        </w:rPr>
+      </w:pPr>
+    </w:p>
+    <w:p ns2:paraId="0000003C" ns2:textId="52C06159">
       <w:pPr>
         <w:rPr>
           <w:rFonts w:ascii="Arial" w:eastAsia="Arial" w:hAnsi="Arial" w:cs="Arial"/>
@@ -1861,134 +2000,76 @@
           <w:sz w:val="22"/>
           <w:szCs w:val="22"/>
         </w:rPr>
-        <w:t>Towards Operating System Automated Optimization via System Knowledge and Tunability Embedding</w:t>
-      </w:r>
-    </w:p>
-    <w:p>
-      <w:pPr>
-        <w:rPr>
-          <w:rFonts w:ascii="Arial" w:eastAsia="Arial" w:hAnsi="Arial" w:cs="Arial"/>
-          <w:sz w:val="22"/>
-          <w:szCs w:val="22"/>
-        </w:rPr>
-      </w:pPr>
-      <w:r>
-        <w:rPr>
-          <w:rFonts w:ascii="Arial" w:eastAsia="Arial" w:hAnsi="Arial" w:cs="Arial"/>
-          <w:sz w:val="22"/>
-          <w:szCs w:val="22"/>
-        </w:rPr>
-        <w:t>Yuxin Ren, Donghui Chen, Yun Hao, Nan Zhang, Zhipeng Xie, Yanqiang Liu, Bo Wan, Bo Zhang, Xu Wang, Wanming Hu, Haili Bai, Ning Jia and Xinwei Hu (Huawei Technologies, China)</w:t>
-      </w:r>
-    </w:p>
-    <w:p>
-      <w:pPr>
-        <w:widowControl/>
-        <w:pBdr>
-          <w:top w:val="nil"/>
-          <w:left w:val="nil"/>
-          <w:bottom w:val="nil"/>
-          <w:right w:val="nil"/>
-          <w:between w:val="nil"/>
-        </w:pBdr>
-        <w:jc w:val="left"/>
-        <w:rPr>
-          <w:rFonts w:ascii="Arial" w:eastAsia="Arial" w:hAnsi="Arial" w:cs="Arial"/>
-          <w:color w:val="000000"/>
-          <w:sz w:val="22"/>
-          <w:szCs w:val="22"/>
-        </w:rPr>
-      </w:pPr>
-    </w:p>
-    <w:p>
-      <w:pPr>
-        <w:rPr>
-          <w:rFonts w:ascii="Arial" w:eastAsia="Arial" w:hAnsi="Arial" w:cs="Arial"/>
-          <w:b/>
-          <w:i/>
-          <w:sz w:val="22"/>
-          <w:szCs w:val="22"/>
-        </w:rPr>
-      </w:pPr>
-      <w:r>
-        <w:rPr>
-          <w:rFonts w:ascii="Arial" w:eastAsia="Arial" w:hAnsi="Arial" w:cs="Arial"/>
-          <w:b/>
-          <w:i/>
-          <w:sz w:val="22"/>
-          <w:szCs w:val="22"/>
-        </w:rPr>
         <w:t>Multimodal Behavioral PUF Authentication for Physical AI Robots Combining Electromechanical Actuation and Computational Load Signatures</w:t>
       </w:r>
     </w:p>
-    <w:p>
-      <w:pPr>
-        <w:rPr>
-          <w:rFonts w:ascii="Arial" w:eastAsia="Arial" w:hAnsi="Arial" w:cs="Arial"/>
-          <w:sz w:val="22"/>
-          <w:szCs w:val="22"/>
-        </w:rPr>
-      </w:pPr>
-      <w:r>
-        <w:rPr>
-          <w:rFonts w:ascii="Arial" w:eastAsia="Arial" w:hAnsi="Arial" w:cs="Arial"/>
-          <w:sz w:val="22"/>
-          <w:szCs w:val="22"/>
-        </w:rPr>
-        <w:lastRenderedPageBreak/>
+    <w:p ns2:paraId="0000003E" ns2:textId="3BCD884C">
+      <w:pPr>
+        <w:rPr>
+          <w:rFonts w:ascii="Arial" w:eastAsia="Arial" w:hAnsi="Arial" w:cs="Arial"/>
+          <w:sz w:val="22"/>
+          <w:szCs w:val="22"/>
+        </w:rPr>
+      </w:pPr>
+      <w:r>
+        <w:rPr>
+          <w:rFonts w:ascii="Arial" w:eastAsia="Arial" w:hAnsi="Arial" w:cs="Arial"/>
+          <w:sz w:val="22"/>
+          <w:szCs w:val="22"/>
+        </w:rPr>
         <w:t>Jiho Lee, Jaehyung Jeong, Jayeon Pyo and JaeSeung Song (Sejong University, Korea (South))</w:t>
       </w:r>
     </w:p>
-    <w:p>
-      <w:pPr>
-        <w:widowControl/>
-        <w:pBdr>
-          <w:top w:val="nil"/>
-          <w:left w:val="nil"/>
-          <w:bottom w:val="nil"/>
-          <w:right w:val="nil"/>
-          <w:between w:val="nil"/>
-        </w:pBdr>
-        <w:jc w:val="left"/>
-        <w:rPr>
-          <w:rFonts w:ascii="Arial" w:eastAsia="Arial" w:hAnsi="Arial" w:cs="Arial"/>
-          <w:color w:val="000000"/>
-          <w:sz w:val="22"/>
-          <w:szCs w:val="22"/>
-        </w:rPr>
-      </w:pPr>
-    </w:p>
-    <w:p>
-      <w:pPr>
-        <w:widowControl/>
-        <w:pBdr>
-          <w:top w:val="nil"/>
-          <w:left w:val="nil"/>
-          <w:bottom w:val="nil"/>
-          <w:right w:val="nil"/>
-          <w:between w:val="nil"/>
-        </w:pBdr>
-        <w:jc w:val="left"/>
-        <w:rPr>
-          <w:rFonts w:ascii="Arial" w:eastAsia="Arial" w:hAnsi="Arial" w:cs="Arial"/>
-          <w:b/>
-          <w:color w:val="000000"/>
-          <w:sz w:val="22"/>
-          <w:szCs w:val="22"/>
-        </w:rPr>
-      </w:pPr>
-      <w:r>
-        <w:rPr>
-          <w:rFonts w:ascii="Arial" w:eastAsia="Arial" w:hAnsi="Arial" w:cs="Arial"/>
-          <w:b/>
-          <w:color w:val="000000"/>
-          <w:sz w:val="22"/>
-          <w:szCs w:val="22"/>
-        </w:rPr>
-        <w:t>5:50 p.m. - 6:00 p.m.</w:t>
-      </w:r>
-    </w:p>
-    <w:p>
+    <w:p ns2:paraId="00000002" ns2:textId="77777777">
+      <w:pPr>
+        <w:widowControl/>
+        <w:pBdr>
+          <w:top w:val="nil"/>
+          <w:left w:val="nil"/>
+          <w:bottom w:val="nil"/>
+          <w:right w:val="nil"/>
+          <w:between w:val="nil"/>
+        </w:pBdr>
+        <w:jc w:val="left"/>
+        <w:rPr>
+          <w:rFonts w:ascii="Arial" w:eastAsia="Arial" w:hAnsi="Arial" w:cs="Arial"/>
+          <w:color w:val="000000"/>
+          <w:sz w:val="22"/>
+          <w:szCs w:val="22"/>
+        </w:rPr>
+      </w:pPr>
+    </w:p>
+    <w:p ns2:paraId="00000035" ns2:textId="601DE829">
+      <w:pPr>
+        <w:widowControl/>
+        <w:pBdr>
+          <w:top w:val="nil"/>
+          <w:left w:val="nil"/>
+          <w:bottom w:val="nil"/>
+          <w:right w:val="nil"/>
+          <w:between w:val="nil"/>
+        </w:pBdr>
+        <w:jc w:val="left"/>
+        <w:rPr>
+          <w:rFonts w:ascii="Arial" w:eastAsia="Arial" w:hAnsi="Arial" w:cs="Arial"/>
+          <w:b/>
+          <w:color w:val="000000"/>
+          <w:sz w:val="22"/>
+          <w:szCs w:val="22"/>
+        </w:rPr>
+      </w:pPr>
+      <w:r>
+        <w:rPr>
+          <w:rFonts w:ascii="Arial" w:eastAsia="Arial" w:hAnsi="Arial" w:cs="Arial"/>
+          <w:b/>
+          <w:color w:val="000000"/>
+          <w:sz w:val="22"/>
+          <w:szCs w:val="22"/>
+        </w:rPr>
+        <w:t>5:55 p.m. - 6:00 p.m.</w:t>
+      </w:r>
+    </w:p>
+    <w:p ns2:paraId="00000036" ns2:textId="77777777">
       <w:pPr>
         <w:widowControl/>
         <w:pBdr>
@@ -2018,7 +2099,7 @@
         <w:t>Closing remarks</w:t>
       </w:r>
     </w:p>
-    <w:p>
+    <w:p ns2:paraId="00000005" ns2:textId="5320E81A">
       <w:pPr>
         <w:widowControl/>
         <w:spacing w:before="280" w:after="280"/>
@@ -2037,7 +2118,7 @@
         <w:t>Baochun Li, General Chair, will conclude the workshop and thank participants, speakers, and organizers.</w:t>
       </w:r>
     </w:p>
-    <w:p>
+    <w:p ns2:paraId="00000002" ns2:textId="77777777">
       <w:pPr>
         <w:widowControl/>
         <w:pBdr>
@@ -2071,7 +2152,7 @@
   <w:docDefaults>
     <w:rPrDefault>
       <w:rPr>
-        <w:rFonts w:ascii="DengXian" w:eastAsia="DengXian" w:hAnsi="DengXian" w:cs="DengXian"/>
+        <w:rFonts w:ascii="等线" w:eastAsia="等线" w:hAnsi="等线" w:cs="等线"/>
         <w:sz w:val="21"/>
         <w:szCs w:val="21"/>
         <w:lang w:val="en-US" w:eastAsia="zh-CN" w:bidi="ar-SA"/>
@@ -2595,7 +2676,6 @@
   <w:style w:type="character" w:default="1" w:styleId="DefaultParagraphFont">
     <w:name w:val="Default Paragraph Font"/>
     <w:uiPriority w:val="1"/>
-    <w:semiHidden/>
     <w:unhideWhenUsed/>
   </w:style>
   <w:style w:type="table" w:default="1" w:styleId="TableNormal">
@@ -2664,7 +2744,7 @@
       <w:jc w:val="left"/>
     </w:pPr>
     <w:rPr>
-      <w:rFonts w:ascii="SimSun" w:eastAsia="SimSun" w:hAnsi="SimSun" w:cs="SimSun"/>
+      <w:rFonts w:ascii="宋体" w:eastAsia="宋体" w:hAnsi="宋体" w:cs="宋体"/>
       <w:sz w:val="24"/>
       <w:szCs w:val="24"/>
     </w:rPr>

</xml_diff>

<commit_message>
Updated the program again to remove the second coffee break.
</commit_message>
<xml_diff>
--- a/assets/files/ein26-program.docx
+++ b/assets/files/ein26-program.docx
@@ -1,8 +1,8 @@
 
 <file path=word/document.xml><?xml version="1.0" encoding="utf-8"?>
-<w:document xmlns:ns1="http://schemas.openxmlformats.org/markup-compatibility/2006" xmlns:ns2="http://schemas.microsoft.com/office/word/2010/wordml" xmlns:w="http://schemas.openxmlformats.org/wordprocessingml/2006/main" ns1:Ignorable="w14 w15 w16se w16cid w16 w16cex w16sdtdh w16sdtfl w16du wp14">
+<w:document xmlns:wpc="http://schemas.microsoft.com/office/word/2010/wordprocessingCanvas" xmlns:cx="http://schemas.microsoft.com/office/drawing/2014/chartex" xmlns:cx1="http://schemas.microsoft.com/office/drawing/2015/9/8/chartex" xmlns:cx2="http://schemas.microsoft.com/office/drawing/2015/10/21/chartex" xmlns:cx3="http://schemas.microsoft.com/office/drawing/2016/5/9/chartex" xmlns:cx4="http://schemas.microsoft.com/office/drawing/2016/5/10/chartex" xmlns:cx5="http://schemas.microsoft.com/office/drawing/2016/5/11/chartex" xmlns:cx6="http://schemas.microsoft.com/office/drawing/2016/5/12/chartex" xmlns:cx7="http://schemas.microsoft.com/office/drawing/2016/5/13/chartex" xmlns:cx8="http://schemas.microsoft.com/office/drawing/2016/5/14/chartex" xmlns:mc="http://schemas.openxmlformats.org/markup-compatibility/2006" xmlns:aink="http://schemas.microsoft.com/office/drawing/2016/ink" xmlns:am3d="http://schemas.microsoft.com/office/drawing/2017/model3d" xmlns:o="urn:schemas-microsoft-com:office:office" xmlns:oel="http://schemas.microsoft.com/office/2019/extlst" xmlns:r="http://schemas.openxmlformats.org/officeDocument/2006/relationships" xmlns:m="http://schemas.openxmlformats.org/officeDocument/2006/math" xmlns:v="urn:schemas-microsoft-com:vml" xmlns:wp14="http://schemas.microsoft.com/office/word/2010/wordprocessingDrawing" xmlns:wp="http://schemas.openxmlformats.org/drawingml/2006/wordprocessingDrawing" xmlns:w10="urn:schemas-microsoft-com:office:word" xmlns:w="http://schemas.openxmlformats.org/wordprocessingml/2006/main" xmlns:w14="http://schemas.microsoft.com/office/word/2010/wordml" xmlns:w15="http://schemas.microsoft.com/office/word/2012/wordml" xmlns:w16cex="http://schemas.microsoft.com/office/word/2018/wordml/cex" xmlns:w16cid="http://schemas.microsoft.com/office/word/2016/wordml/cid" xmlns:w16="http://schemas.microsoft.com/office/word/2018/wordml" xmlns:w16du="http://schemas.microsoft.com/office/word/2023/wordml/word16du" xmlns:w16sdtdh="http://schemas.microsoft.com/office/word/2020/wordml/sdtdatahash" xmlns:w16sdtfl="http://schemas.microsoft.com/office/word/2024/wordml/sdtformatlock" xmlns:w16se="http://schemas.microsoft.com/office/word/2015/wordml/symex" xmlns:wpg="http://schemas.microsoft.com/office/word/2010/wordprocessingGroup" xmlns:wpi="http://schemas.microsoft.com/office/word/2010/wordprocessingInk" xmlns:wne="http://schemas.microsoft.com/office/word/2006/wordml" xmlns:wps="http://schemas.microsoft.com/office/word/2010/wordprocessingShape" mc:Ignorable="w14 w15 w16se w16cid w16 w16cex w16sdtdh w16sdtfl w16du wp14">
   <w:body>
-    <w:p ns2:paraId="00000001" ns2:textId="16B9ACF3">
+    <w:p>
       <w:pPr>
         <w:widowControl/>
         <w:pBdr>
@@ -32,26 +32,26 @@
         <w:t>INFOCOM 2026 Workshop on Embodied Intelligence Networks (EIN)</w:t>
       </w:r>
     </w:p>
-    <w:p ns2:paraId="00000002" ns2:textId="77777777">
-      <w:pPr>
-        <w:widowControl/>
-        <w:pBdr>
-          <w:top w:val="nil"/>
-          <w:left w:val="nil"/>
-          <w:bottom w:val="nil"/>
-          <w:right w:val="nil"/>
-          <w:between w:val="nil"/>
-        </w:pBdr>
-        <w:jc w:val="left"/>
-        <w:rPr>
-          <w:rFonts w:ascii="Arial" w:eastAsia="Arial" w:hAnsi="Arial" w:cs="Arial"/>
-          <w:color w:val="000000"/>
-          <w:sz w:val="22"/>
-          <w:szCs w:val="22"/>
-        </w:rPr>
-      </w:pPr>
-    </w:p>
-    <w:p ns2:paraId="00000003" ns2:textId="6F8E2F02">
+    <w:p>
+      <w:pPr>
+        <w:widowControl/>
+        <w:pBdr>
+          <w:top w:val="nil"/>
+          <w:left w:val="nil"/>
+          <w:bottom w:val="nil"/>
+          <w:right w:val="nil"/>
+          <w:between w:val="nil"/>
+        </w:pBdr>
+        <w:jc w:val="left"/>
+        <w:rPr>
+          <w:rFonts w:ascii="Arial" w:eastAsia="Arial" w:hAnsi="Arial" w:cs="Arial"/>
+          <w:color w:val="000000"/>
+          <w:sz w:val="22"/>
+          <w:szCs w:val="22"/>
+        </w:rPr>
+      </w:pPr>
+    </w:p>
+    <w:p>
       <w:pPr>
         <w:jc w:val="center"/>
         <w:rPr>
@@ -60,10 +60,6 @@
           <w:szCs w:val="22"/>
         </w:rPr>
       </w:pPr>
-      <w:proofErr w:type="gramStart"/>
-      <w:proofErr w:type="gramEnd"/>
-      <w:proofErr w:type="gramStart"/>
-      <w:proofErr w:type="gramEnd"/>
       <w:r>
         <w:rPr>
           <w:rFonts w:ascii="Arial" w:eastAsia="Arial" w:hAnsi="Arial" w:cs="Arial"/>
@@ -73,7 +69,7 @@
         <w:t>Monday, May 18, 2026 ● 14:00 – 18:00 ● Room: Fuyo ● IEEE INFOCOM 2026, Tokyo, Japan</w:t>
       </w:r>
     </w:p>
-    <w:p ns2:paraId="00000005" ns2:textId="5320E81A">
+    <w:p>
       <w:pPr>
         <w:widowControl/>
         <w:spacing w:before="280" w:after="280"/>
@@ -92,7 +88,7 @@
         <w:t>A half-day workshop on networking for embodied and agentic intelligence, bringing together researchers working on perception, reasoning, and action across virtual and physical environments.</w:t>
       </w:r>
     </w:p>
-    <w:p ns2:paraId="00000006" ns2:textId="0C2C310E">
+    <w:p>
       <w:pPr>
         <w:widowControl/>
         <w:pBdr>
@@ -122,7 +118,7 @@
         <w:t>Committee</w:t>
       </w:r>
     </w:p>
-    <w:p ns2:paraId="00000007" ns2:textId="6AC48496">
+    <w:p>
       <w:pPr>
         <w:widowControl/>
         <w:pBdr>
@@ -150,7 +146,7 @@
         <w:t>Yusheng Ji (National Institute of Informatics, Japan)</w:t>
       </w:r>
     </w:p>
-    <w:p ns2:paraId="3729399B" ns2:textId="77777777">
+    <w:p>
       <w:pPr>
         <w:widowControl/>
         <w:pBdr>
@@ -178,7 +174,7 @@
         <w:t>Baochun Li (University of Toronto)</w:t>
       </w:r>
     </w:p>
-    <w:p ns2:paraId="00000014" ns2:textId="5B626318">
+    <w:p>
       <w:pPr>
         <w:widowControl/>
         <w:pBdr>
@@ -208,7 +204,7 @@
         <w:t>Ruidong Li (Kanazawa University, Japan)</w:t>
       </w:r>
     </w:p>
-    <w:p ns2:paraId="00000014" ns2:textId="5B626318">
+    <w:p>
       <w:pPr>
         <w:widowControl/>
         <w:pBdr>
@@ -238,7 +234,7 @@
         <w:t>Min Song (Stevens Institute of Technology)</w:t>
       </w:r>
     </w:p>
-    <w:p ns2:paraId="00000014" ns2:textId="5B626318">
+    <w:p>
       <w:pPr>
         <w:widowControl/>
         <w:pBdr>
@@ -268,7 +264,7 @@
         <w:t>Teruo Higashino (Kyoto Tachibana University)</w:t>
       </w:r>
     </w:p>
-    <w:p ns2:paraId="00000014" ns2:textId="5B626318">
+    <w:p>
       <w:pPr>
         <w:widowControl/>
         <w:pBdr>
@@ -298,7 +294,7 @@
         <w:t>Krishna Kant (Temple University)</w:t>
       </w:r>
     </w:p>
-    <w:p ns2:paraId="00000014" ns2:textId="5B626318">
+    <w:p>
       <w:pPr>
         <w:widowControl/>
         <w:pBdr>
@@ -328,7 +324,7 @@
         <w:t>Zhenjiang Li (City University of Hong Kong)</w:t>
       </w:r>
     </w:p>
-    <w:p ns2:paraId="00000014" ns2:textId="5B626318">
+    <w:p>
       <w:pPr>
         <w:widowControl/>
         <w:pBdr>
@@ -358,7 +354,7 @@
         <w:t>Seung-Jong Park (Missouri University of Science &amp; Technology)</w:t>
       </w:r>
     </w:p>
-    <w:p ns2:paraId="00000014" ns2:textId="5B626318">
+    <w:p>
       <w:pPr>
         <w:widowControl/>
         <w:pBdr>
@@ -388,7 +384,7 @@
         <w:t>Corrado Puligheddu (Politecnico di Torino)</w:t>
       </w:r>
     </w:p>
-    <w:p ns2:paraId="00000014" ns2:textId="5B626318">
+    <w:p>
       <w:pPr>
         <w:widowControl/>
         <w:pBdr>
@@ -418,7 +414,7 @@
         <w:t>Siping Shi (The Hong Kong Polytechnic University)</w:t>
       </w:r>
     </w:p>
-    <w:p ns2:paraId="00000014" ns2:textId="5B626318">
+    <w:p>
       <w:pPr>
         <w:widowControl/>
         <w:pBdr>
@@ -448,7 +444,7 @@
         <w:t>JaeSeung Song (Sejong University)</w:t>
       </w:r>
     </w:p>
-    <w:p ns2:paraId="00000014" ns2:textId="5B626318">
+    <w:p>
       <w:pPr>
         <w:widowControl/>
         <w:pBdr>
@@ -478,7 +474,7 @@
         <w:t>Tao Song (Shanghai Jiao Tong University)</w:t>
       </w:r>
     </w:p>
-    <w:p ns2:paraId="00000014" ns2:textId="5B626318">
+    <w:p>
       <w:pPr>
         <w:widowControl/>
         <w:pBdr>
@@ -508,7 +504,7 @@
         <w:t>Feng Wang (University of Mississippi)</w:t>
       </w:r>
     </w:p>
-    <w:p ns2:paraId="00000014" ns2:textId="5B626318">
+    <w:p>
       <w:pPr>
         <w:widowControl/>
         <w:pBdr>
@@ -538,7 +534,7 @@
         <w:t>Guiling Wang (New Jersey Institute of Technology)</w:t>
       </w:r>
     </w:p>
-    <w:p ns2:paraId="00000014" ns2:textId="5B626318">
+    <w:p>
       <w:pPr>
         <w:widowControl/>
         <w:pBdr>
@@ -568,7 +564,7 @@
         <w:t>Poonam Yadav (University of York)</w:t>
       </w:r>
     </w:p>
-    <w:p ns2:paraId="00000014" ns2:textId="5B626318">
+    <w:p>
       <w:pPr>
         <w:widowControl/>
         <w:pBdr>
@@ -598,7 +594,7 @@
         <w:t>Rongfei Zeng (Northeastern University)</w:t>
       </w:r>
     </w:p>
-    <w:p ns2:paraId="00000014" ns2:textId="5B626318">
+    <w:p>
       <w:pPr>
         <w:widowControl/>
         <w:pBdr>
@@ -628,7 +624,7 @@
         <w:t>Sai Qian Zhang (New York University)</w:t>
       </w:r>
     </w:p>
-    <w:p ns2:paraId="00000014" ns2:textId="5B626318">
+    <w:p>
       <w:pPr>
         <w:widowControl/>
         <w:pBdr>
@@ -658,7 +654,7 @@
         <w:t>Xiaoxi Zhang (Sun Yat-sen University)</w:t>
       </w:r>
     </w:p>
-    <w:p ns2:paraId="00000014" ns2:textId="5B626318">
+    <w:p>
       <w:pPr>
         <w:widowControl/>
         <w:pBdr>
@@ -688,26 +684,26 @@
         <w:t>Yuanqing Zheng (Hong Kong Polytechnic University)</w:t>
       </w:r>
     </w:p>
-    <w:p ns2:paraId="00000002" ns2:textId="77777777">
-      <w:pPr>
-        <w:widowControl/>
-        <w:pBdr>
-          <w:top w:val="nil"/>
-          <w:left w:val="nil"/>
-          <w:bottom w:val="nil"/>
-          <w:right w:val="nil"/>
-          <w:between w:val="nil"/>
-        </w:pBdr>
-        <w:jc w:val="left"/>
-        <w:rPr>
-          <w:rFonts w:ascii="Arial" w:eastAsia="Arial" w:hAnsi="Arial" w:cs="Arial"/>
-          <w:color w:val="000000"/>
-          <w:sz w:val="22"/>
-          <w:szCs w:val="22"/>
-        </w:rPr>
-      </w:pPr>
-    </w:p>
-    <w:p ns2:paraId="0000001D" ns2:textId="1CC8D5F9">
+    <w:p>
+      <w:pPr>
+        <w:widowControl/>
+        <w:pBdr>
+          <w:top w:val="nil"/>
+          <w:left w:val="nil"/>
+          <w:bottom w:val="nil"/>
+          <w:right w:val="nil"/>
+          <w:between w:val="nil"/>
+        </w:pBdr>
+        <w:jc w:val="left"/>
+        <w:rPr>
+          <w:rFonts w:ascii="Arial" w:eastAsia="Arial" w:hAnsi="Arial" w:cs="Arial"/>
+          <w:color w:val="000000"/>
+          <w:sz w:val="22"/>
+          <w:szCs w:val="22"/>
+        </w:rPr>
+      </w:pPr>
+    </w:p>
+    <w:p>
       <w:pPr>
         <w:widowControl/>
         <w:pBdr>
@@ -737,7 +733,7 @@
         <w:t>Chairs:</w:t>
       </w:r>
     </w:p>
-    <w:p ns2:paraId="3F6BB205" ns2:textId="77777777">
+    <w:p>
       <w:pPr>
         <w:widowControl/>
         <w:pBdr>
@@ -765,7 +761,7 @@
         <w:t>Baochun Li (University of Toronto)</w:t>
       </w:r>
     </w:p>
-    <w:p ns2:paraId="3F6BB205" ns2:textId="77777777">
+    <w:p>
       <w:pPr>
         <w:widowControl/>
         <w:pBdr>
@@ -793,7 +789,7 @@
         <w:t>Edith C. H. Ngai (University of Hong Kong)</w:t>
       </w:r>
     </w:p>
-    <w:p ns2:paraId="3F6BB205" ns2:textId="77777777">
+    <w:p>
       <w:pPr>
         <w:widowControl/>
         <w:pBdr>
@@ -821,7 +817,7 @@
         <w:t>Ningxin Su (The Hong Kong University of Science and Technology (Guangzhou))</w:t>
       </w:r>
     </w:p>
-    <w:p ns2:paraId="3F6BB205" ns2:textId="77777777">
+    <w:p>
       <w:pPr>
         <w:widowControl/>
         <w:pBdr>
@@ -849,45 +845,45 @@
         <w:t>Hao Wang (Stevens Institute of Technology)</w:t>
       </w:r>
     </w:p>
-    <w:p ns2:paraId="00000002" ns2:textId="77777777">
-      <w:pPr>
-        <w:widowControl/>
-        <w:pBdr>
-          <w:top w:val="nil"/>
-          <w:left w:val="nil"/>
-          <w:bottom w:val="nil"/>
-          <w:right w:val="nil"/>
-          <w:between w:val="nil"/>
-        </w:pBdr>
-        <w:jc w:val="left"/>
-        <w:rPr>
-          <w:rFonts w:ascii="Arial" w:eastAsia="Arial" w:hAnsi="Arial" w:cs="Arial"/>
-          <w:color w:val="000000"/>
-          <w:sz w:val="22"/>
-          <w:szCs w:val="22"/>
-        </w:rPr>
-      </w:pPr>
-    </w:p>
-    <w:p ns2:paraId="00000002" ns2:textId="77777777">
-      <w:pPr>
-        <w:widowControl/>
-        <w:pBdr>
-          <w:top w:val="nil"/>
-          <w:left w:val="nil"/>
-          <w:bottom w:val="nil"/>
-          <w:right w:val="nil"/>
-          <w:between w:val="nil"/>
-        </w:pBdr>
-        <w:jc w:val="left"/>
-        <w:rPr>
-          <w:rFonts w:ascii="Arial" w:eastAsia="Arial" w:hAnsi="Arial" w:cs="Arial"/>
-          <w:color w:val="000000"/>
-          <w:sz w:val="22"/>
-          <w:szCs w:val="22"/>
-        </w:rPr>
-      </w:pPr>
-    </w:p>
-    <w:p ns2:paraId="00000035" ns2:textId="601DE829">
+    <w:p>
+      <w:pPr>
+        <w:widowControl/>
+        <w:pBdr>
+          <w:top w:val="nil"/>
+          <w:left w:val="nil"/>
+          <w:bottom w:val="nil"/>
+          <w:right w:val="nil"/>
+          <w:between w:val="nil"/>
+        </w:pBdr>
+        <w:jc w:val="left"/>
+        <w:rPr>
+          <w:rFonts w:ascii="Arial" w:eastAsia="Arial" w:hAnsi="Arial" w:cs="Arial"/>
+          <w:color w:val="000000"/>
+          <w:sz w:val="22"/>
+          <w:szCs w:val="22"/>
+        </w:rPr>
+      </w:pPr>
+    </w:p>
+    <w:p>
+      <w:pPr>
+        <w:widowControl/>
+        <w:pBdr>
+          <w:top w:val="nil"/>
+          <w:left w:val="nil"/>
+          <w:bottom w:val="nil"/>
+          <w:right w:val="nil"/>
+          <w:between w:val="nil"/>
+        </w:pBdr>
+        <w:jc w:val="left"/>
+        <w:rPr>
+          <w:rFonts w:ascii="Arial" w:eastAsia="Arial" w:hAnsi="Arial" w:cs="Arial"/>
+          <w:color w:val="000000"/>
+          <w:sz w:val="22"/>
+          <w:szCs w:val="22"/>
+        </w:rPr>
+      </w:pPr>
+    </w:p>
+    <w:p>
       <w:pPr>
         <w:widowControl/>
         <w:pBdr>
@@ -917,37 +913,37 @@
         <w:t>2:00 p.m. - 2:05 p.m.</w:t>
       </w:r>
     </w:p>
-    <w:p ns2:paraId="00000036" ns2:textId="77777777">
-      <w:pPr>
-        <w:widowControl/>
-        <w:pBdr>
-          <w:top w:val="nil"/>
-          <w:left w:val="nil"/>
-          <w:bottom w:val="nil"/>
-          <w:right w:val="nil"/>
-          <w:between w:val="nil"/>
-        </w:pBdr>
-        <w:jc w:val="left"/>
-        <w:rPr>
-          <w:rFonts w:ascii="Arial" w:eastAsia="Arial" w:hAnsi="Arial" w:cs="Arial"/>
-          <w:b/>
-          <w:color w:val="000000"/>
-          <w:sz w:val="22"/>
-          <w:szCs w:val="22"/>
-        </w:rPr>
-      </w:pPr>
-      <w:r>
-        <w:rPr>
-          <w:rFonts w:ascii="Arial" w:eastAsia="Arial" w:hAnsi="Arial" w:cs="Arial"/>
-          <w:b/>
-          <w:color w:val="000000"/>
-          <w:sz w:val="22"/>
-          <w:szCs w:val="22"/>
-        </w:rPr>
-        <w:t>Welcome and workshop introduction</w:t>
-      </w:r>
-    </w:p>
-    <w:p ns2:paraId="00000005" ns2:textId="5320E81A">
+    <w:p>
+      <w:pPr>
+        <w:widowControl/>
+        <w:pBdr>
+          <w:top w:val="nil"/>
+          <w:left w:val="nil"/>
+          <w:bottom w:val="nil"/>
+          <w:right w:val="nil"/>
+          <w:between w:val="nil"/>
+        </w:pBdr>
+        <w:jc w:val="left"/>
+        <w:rPr>
+          <w:rFonts w:ascii="Arial" w:eastAsia="Arial" w:hAnsi="Arial" w:cs="Arial"/>
+          <w:b/>
+          <w:color w:val="000000"/>
+          <w:sz w:val="22"/>
+          <w:szCs w:val="22"/>
+        </w:rPr>
+      </w:pPr>
+      <w:r>
+        <w:rPr>
+          <w:rFonts w:ascii="Arial" w:eastAsia="Arial" w:hAnsi="Arial" w:cs="Arial"/>
+          <w:b/>
+          <w:color w:val="000000"/>
+          <w:sz w:val="22"/>
+          <w:szCs w:val="22"/>
+        </w:rPr>
+        <w:t>Welcome and Workshop Introduction</w:t>
+      </w:r>
+    </w:p>
+    <w:p>
       <w:pPr>
         <w:widowControl/>
         <w:spacing w:before="280" w:after="280"/>
@@ -963,29 +959,29 @@
           <w:sz w:val="22"/>
           <w:szCs w:val="22"/>
         </w:rPr>
-        <w:t>Baochun Li, General Chair, together with Program Co-Chairs Edith C. H. Ngai, Ningxin Su, and Hao Wang, will introduce the workshop and the day’s program.</w:t>
-      </w:r>
-    </w:p>
-    <w:p ns2:paraId="00000002" ns2:textId="77777777">
-      <w:pPr>
-        <w:widowControl/>
-        <w:pBdr>
-          <w:top w:val="nil"/>
-          <w:left w:val="nil"/>
-          <w:bottom w:val="nil"/>
-          <w:right w:val="nil"/>
-          <w:between w:val="nil"/>
-        </w:pBdr>
-        <w:jc w:val="left"/>
-        <w:rPr>
-          <w:rFonts w:ascii="Arial" w:eastAsia="Arial" w:hAnsi="Arial" w:cs="Arial"/>
-          <w:color w:val="000000"/>
-          <w:sz w:val="22"/>
-          <w:szCs w:val="22"/>
-        </w:rPr>
-      </w:pPr>
-    </w:p>
-    <w:p ns2:paraId="00000035" ns2:textId="601DE829">
+        <w:t>Baochun Li (General Chair), Edith C. H. Ngai, Ningxin Su, and Hao Wang (Program Co-Chairs)</w:t>
+      </w:r>
+    </w:p>
+    <w:p>
+      <w:pPr>
+        <w:widowControl/>
+        <w:pBdr>
+          <w:top w:val="nil"/>
+          <w:left w:val="nil"/>
+          <w:bottom w:val="nil"/>
+          <w:right w:val="nil"/>
+          <w:between w:val="nil"/>
+        </w:pBdr>
+        <w:jc w:val="left"/>
+        <w:rPr>
+          <w:rFonts w:ascii="Arial" w:eastAsia="Arial" w:hAnsi="Arial" w:cs="Arial"/>
+          <w:color w:val="000000"/>
+          <w:sz w:val="22"/>
+          <w:szCs w:val="22"/>
+        </w:rPr>
+      </w:pPr>
+    </w:p>
+    <w:p>
       <w:pPr>
         <w:widowControl/>
         <w:pBdr>
@@ -1015,7 +1011,7 @@
         <w:t>2:05 p.m. - 3:00 p.m.</w:t>
       </w:r>
     </w:p>
-    <w:p ns2:paraId="272B3ADD" ns2:textId="3BD4AEDE">
+    <w:p>
       <w:pPr>
         <w:rPr>
           <w:rFonts w:ascii="Arial" w:eastAsia="Arial" w:hAnsi="Arial" w:cs="Arial"/>
@@ -1036,7 +1032,7 @@
         <w:t>Keynote: Keynote talk</w:t>
       </w:r>
     </w:p>
-    <w:p ns2:paraId="0D3E61B0" ns2:textId="55EA08C1">
+    <w:p>
       <w:pPr>
         <w:rPr>
           <w:rFonts w:ascii="Arial" w:eastAsia="Arial" w:hAnsi="Arial" w:cs="Arial"/>
@@ -1055,26 +1051,26 @@
         <w:t>Speaker: TBD | Title: TBD</w:t>
       </w:r>
     </w:p>
-    <w:p ns2:paraId="00000002" ns2:textId="77777777">
-      <w:pPr>
-        <w:widowControl/>
-        <w:pBdr>
-          <w:top w:val="nil"/>
-          <w:left w:val="nil"/>
-          <w:bottom w:val="nil"/>
-          <w:right w:val="nil"/>
-          <w:between w:val="nil"/>
-        </w:pBdr>
-        <w:jc w:val="left"/>
-        <w:rPr>
-          <w:rFonts w:ascii="Arial" w:eastAsia="Arial" w:hAnsi="Arial" w:cs="Arial"/>
-          <w:color w:val="000000"/>
-          <w:sz w:val="22"/>
-          <w:szCs w:val="22"/>
-        </w:rPr>
-      </w:pPr>
-    </w:p>
-    <w:p ns2:paraId="00000035" ns2:textId="601DE829">
+    <w:p>
+      <w:pPr>
+        <w:widowControl/>
+        <w:pBdr>
+          <w:top w:val="nil"/>
+          <w:left w:val="nil"/>
+          <w:bottom w:val="nil"/>
+          <w:right w:val="nil"/>
+          <w:between w:val="nil"/>
+        </w:pBdr>
+        <w:jc w:val="left"/>
+        <w:rPr>
+          <w:rFonts w:ascii="Arial" w:eastAsia="Arial" w:hAnsi="Arial" w:cs="Arial"/>
+          <w:color w:val="000000"/>
+          <w:sz w:val="22"/>
+          <w:szCs w:val="22"/>
+        </w:rPr>
+      </w:pPr>
+    </w:p>
+    <w:p>
       <w:pPr>
         <w:widowControl/>
         <w:pBdr>
@@ -1104,7 +1100,7 @@
         <w:t>3:00 p.m. - 3:30 p.m.</w:t>
       </w:r>
     </w:p>
-    <w:p ns2:paraId="0000003A" ns2:textId="7E66E165">
+    <w:p>
       <w:pPr>
         <w:widowControl/>
         <w:pBdr>
@@ -1134,26 +1130,26 @@
         <w:t>Session I: Federated Learning for Embodied Intelligence</w:t>
       </w:r>
     </w:p>
-    <w:p ns2:paraId="00000002" ns2:textId="77777777">
-      <w:pPr>
-        <w:widowControl/>
-        <w:pBdr>
-          <w:top w:val="nil"/>
-          <w:left w:val="nil"/>
-          <w:bottom w:val="nil"/>
-          <w:right w:val="nil"/>
-          <w:between w:val="nil"/>
-        </w:pBdr>
-        <w:jc w:val="left"/>
-        <w:rPr>
-          <w:rFonts w:ascii="Arial" w:eastAsia="Arial" w:hAnsi="Arial" w:cs="Arial"/>
-          <w:color w:val="000000"/>
-          <w:sz w:val="22"/>
-          <w:szCs w:val="22"/>
-        </w:rPr>
-      </w:pPr>
-    </w:p>
-    <w:p ns2:paraId="0000003C" ns2:textId="52C06159">
+    <w:p>
+      <w:pPr>
+        <w:widowControl/>
+        <w:pBdr>
+          <w:top w:val="nil"/>
+          <w:left w:val="nil"/>
+          <w:bottom w:val="nil"/>
+          <w:right w:val="nil"/>
+          <w:between w:val="nil"/>
+        </w:pBdr>
+        <w:jc w:val="left"/>
+        <w:rPr>
+          <w:rFonts w:ascii="Arial" w:eastAsia="Arial" w:hAnsi="Arial" w:cs="Arial"/>
+          <w:color w:val="000000"/>
+          <w:sz w:val="22"/>
+          <w:szCs w:val="22"/>
+        </w:rPr>
+      </w:pPr>
+    </w:p>
+    <w:p>
       <w:pPr>
         <w:rPr>
           <w:rFonts w:ascii="Arial" w:eastAsia="Arial" w:hAnsi="Arial" w:cs="Arial"/>
@@ -1174,7 +1170,7 @@
         <w:t>Federated Self-Evolving Embodied AI Agents</w:t>
       </w:r>
     </w:p>
-    <w:p ns2:paraId="0000003E" ns2:textId="3BCD884C">
+    <w:p>
       <w:pPr>
         <w:rPr>
           <w:rFonts w:ascii="Arial" w:eastAsia="Arial" w:hAnsi="Arial" w:cs="Arial"/>
@@ -1191,26 +1187,26 @@
         <w:t>Leming Shen and Yuanqing Zheng (The Hong Kong Polytechnic University, Hong Kong)</w:t>
       </w:r>
     </w:p>
-    <w:p ns2:paraId="00000002" ns2:textId="77777777">
-      <w:pPr>
-        <w:widowControl/>
-        <w:pBdr>
-          <w:top w:val="nil"/>
-          <w:left w:val="nil"/>
-          <w:bottom w:val="nil"/>
-          <w:right w:val="nil"/>
-          <w:between w:val="nil"/>
-        </w:pBdr>
-        <w:jc w:val="left"/>
-        <w:rPr>
-          <w:rFonts w:ascii="Arial" w:eastAsia="Arial" w:hAnsi="Arial" w:cs="Arial"/>
-          <w:color w:val="000000"/>
-          <w:sz w:val="22"/>
-          <w:szCs w:val="22"/>
-        </w:rPr>
-      </w:pPr>
-    </w:p>
-    <w:p ns2:paraId="0000003C" ns2:textId="52C06159">
+    <w:p>
+      <w:pPr>
+        <w:widowControl/>
+        <w:pBdr>
+          <w:top w:val="nil"/>
+          <w:left w:val="nil"/>
+          <w:bottom w:val="nil"/>
+          <w:right w:val="nil"/>
+          <w:between w:val="nil"/>
+        </w:pBdr>
+        <w:jc w:val="left"/>
+        <w:rPr>
+          <w:rFonts w:ascii="Arial" w:eastAsia="Arial" w:hAnsi="Arial" w:cs="Arial"/>
+          <w:color w:val="000000"/>
+          <w:sz w:val="22"/>
+          <w:szCs w:val="22"/>
+        </w:rPr>
+      </w:pPr>
+    </w:p>
+    <w:p>
       <w:pPr>
         <w:rPr>
           <w:rFonts w:ascii="Arial" w:eastAsia="Arial" w:hAnsi="Arial" w:cs="Arial"/>
@@ -1231,7 +1227,7 @@
         <w:t>pFedNavi: Structure-Aware Personalized Federated Vision-Language Navigation for Embodied AI</w:t>
       </w:r>
     </w:p>
-    <w:p ns2:paraId="0000003E" ns2:textId="3BCD884C">
+    <w:p>
       <w:pPr>
         <w:rPr>
           <w:rFonts w:ascii="Arial" w:eastAsia="Arial" w:hAnsi="Arial" w:cs="Arial"/>
@@ -1248,26 +1244,26 @@
         <w:t>Qingqian Yang and Hao Wang (Stevens Institute of Technology, USA); Sai Qian Zhang (Meta/New York University, USA); Jian Li (Stony Brook University, USA); Yang Hua (Queen's University Belfast, United Kingdom (Great Britain)); Miao Pan (University of Houston, USA); Tao Song, Zhengwei Qi and Haibing Guan (Shanghai Jiao Tong University, China)</w:t>
       </w:r>
     </w:p>
-    <w:p ns2:paraId="00000002" ns2:textId="77777777">
-      <w:pPr>
-        <w:widowControl/>
-        <w:pBdr>
-          <w:top w:val="nil"/>
-          <w:left w:val="nil"/>
-          <w:bottom w:val="nil"/>
-          <w:right w:val="nil"/>
-          <w:between w:val="nil"/>
-        </w:pBdr>
-        <w:jc w:val="left"/>
-        <w:rPr>
-          <w:rFonts w:ascii="Arial" w:eastAsia="Arial" w:hAnsi="Arial" w:cs="Arial"/>
-          <w:color w:val="000000"/>
-          <w:sz w:val="22"/>
-          <w:szCs w:val="22"/>
-        </w:rPr>
-      </w:pPr>
-    </w:p>
-    <w:p ns2:paraId="00000035" ns2:textId="601DE829">
+    <w:p>
+      <w:pPr>
+        <w:widowControl/>
+        <w:pBdr>
+          <w:top w:val="nil"/>
+          <w:left w:val="nil"/>
+          <w:bottom w:val="nil"/>
+          <w:right w:val="nil"/>
+          <w:between w:val="nil"/>
+        </w:pBdr>
+        <w:jc w:val="left"/>
+        <w:rPr>
+          <w:rFonts w:ascii="Arial" w:eastAsia="Arial" w:hAnsi="Arial" w:cs="Arial"/>
+          <w:color w:val="000000"/>
+          <w:sz w:val="22"/>
+          <w:szCs w:val="22"/>
+        </w:rPr>
+      </w:pPr>
+    </w:p>
+    <w:p>
       <w:pPr>
         <w:widowControl/>
         <w:pBdr>
@@ -1297,7 +1293,7 @@
         <w:t>3:30 p.m. - 4:00 p.m.</w:t>
       </w:r>
     </w:p>
-    <w:p ns2:paraId="00000036" ns2:textId="77777777">
+    <w:p>
       <w:pPr>
         <w:widowControl/>
         <w:pBdr>
@@ -1327,26 +1323,26 @@
         <w:t>Coffee break</w:t>
       </w:r>
     </w:p>
-    <w:p ns2:paraId="00000002" ns2:textId="77777777">
-      <w:pPr>
-        <w:widowControl/>
-        <w:pBdr>
-          <w:top w:val="nil"/>
-          <w:left w:val="nil"/>
-          <w:bottom w:val="nil"/>
-          <w:right w:val="nil"/>
-          <w:between w:val="nil"/>
-        </w:pBdr>
-        <w:jc w:val="left"/>
-        <w:rPr>
-          <w:rFonts w:ascii="Arial" w:eastAsia="Arial" w:hAnsi="Arial" w:cs="Arial"/>
-          <w:color w:val="000000"/>
-          <w:sz w:val="22"/>
-          <w:szCs w:val="22"/>
-        </w:rPr>
-      </w:pPr>
-    </w:p>
-    <w:p ns2:paraId="00000035" ns2:textId="601DE829">
+    <w:p>
+      <w:pPr>
+        <w:widowControl/>
+        <w:pBdr>
+          <w:top w:val="nil"/>
+          <w:left w:val="nil"/>
+          <w:bottom w:val="nil"/>
+          <w:right w:val="nil"/>
+          <w:between w:val="nil"/>
+        </w:pBdr>
+        <w:jc w:val="left"/>
+        <w:rPr>
+          <w:rFonts w:ascii="Arial" w:eastAsia="Arial" w:hAnsi="Arial" w:cs="Arial"/>
+          <w:color w:val="000000"/>
+          <w:sz w:val="22"/>
+          <w:szCs w:val="22"/>
+        </w:rPr>
+      </w:pPr>
+    </w:p>
+    <w:p>
       <w:pPr>
         <w:widowControl/>
         <w:pBdr>
@@ -1376,7 +1372,7 @@
         <w:t>4:00 p.m. - 5:00 p.m.</w:t>
       </w:r>
     </w:p>
-    <w:p ns2:paraId="0000003A" ns2:textId="7E66E165">
+    <w:p>
       <w:pPr>
         <w:widowControl/>
         <w:pBdr>
@@ -1406,26 +1402,26 @@
         <w:t>Session II: Adaptive and Collaborative Embodied Intelligence</w:t>
       </w:r>
     </w:p>
-    <w:p ns2:paraId="00000002" ns2:textId="77777777">
-      <w:pPr>
-        <w:widowControl/>
-        <w:pBdr>
-          <w:top w:val="nil"/>
-          <w:left w:val="nil"/>
-          <w:bottom w:val="nil"/>
-          <w:right w:val="nil"/>
-          <w:between w:val="nil"/>
-        </w:pBdr>
-        <w:jc w:val="left"/>
-        <w:rPr>
-          <w:rFonts w:ascii="Arial" w:eastAsia="Arial" w:hAnsi="Arial" w:cs="Arial"/>
-          <w:color w:val="000000"/>
-          <w:sz w:val="22"/>
-          <w:szCs w:val="22"/>
-        </w:rPr>
-      </w:pPr>
-    </w:p>
-    <w:p ns2:paraId="0000003C" ns2:textId="52C06159">
+    <w:p>
+      <w:pPr>
+        <w:widowControl/>
+        <w:pBdr>
+          <w:top w:val="nil"/>
+          <w:left w:val="nil"/>
+          <w:bottom w:val="nil"/>
+          <w:right w:val="nil"/>
+          <w:between w:val="nil"/>
+        </w:pBdr>
+        <w:jc w:val="left"/>
+        <w:rPr>
+          <w:rFonts w:ascii="Arial" w:eastAsia="Arial" w:hAnsi="Arial" w:cs="Arial"/>
+          <w:color w:val="000000"/>
+          <w:sz w:val="22"/>
+          <w:szCs w:val="22"/>
+        </w:rPr>
+      </w:pPr>
+    </w:p>
+    <w:p>
       <w:pPr>
         <w:rPr>
           <w:rFonts w:ascii="Arial" w:eastAsia="Arial" w:hAnsi="Arial" w:cs="Arial"/>
@@ -1446,7 +1442,7 @@
         <w:t>E-RECAP: Embodied REplanning with Cost-Aware Pruning</w:t>
       </w:r>
     </w:p>
-    <w:p ns2:paraId="0000003E" ns2:textId="3BCD884C">
+    <w:p>
       <w:pPr>
         <w:rPr>
           <w:rFonts w:ascii="Arial" w:eastAsia="Arial" w:hAnsi="Arial" w:cs="Arial"/>
@@ -1463,26 +1459,26 @@
         <w:t>Shuaijun Liu and Ningxin Su (The Hong Kong University of Science and Technology (Guangzhou), China)</w:t>
       </w:r>
     </w:p>
-    <w:p ns2:paraId="00000002" ns2:textId="77777777">
-      <w:pPr>
-        <w:widowControl/>
-        <w:pBdr>
-          <w:top w:val="nil"/>
-          <w:left w:val="nil"/>
-          <w:bottom w:val="nil"/>
-          <w:right w:val="nil"/>
-          <w:between w:val="nil"/>
-        </w:pBdr>
-        <w:jc w:val="left"/>
-        <w:rPr>
-          <w:rFonts w:ascii="Arial" w:eastAsia="Arial" w:hAnsi="Arial" w:cs="Arial"/>
-          <w:color w:val="000000"/>
-          <w:sz w:val="22"/>
-          <w:szCs w:val="22"/>
-        </w:rPr>
-      </w:pPr>
-    </w:p>
-    <w:p ns2:paraId="0000003C" ns2:textId="52C06159">
+    <w:p>
+      <w:pPr>
+        <w:widowControl/>
+        <w:pBdr>
+          <w:top w:val="nil"/>
+          <w:left w:val="nil"/>
+          <w:bottom w:val="nil"/>
+          <w:right w:val="nil"/>
+          <w:between w:val="nil"/>
+        </w:pBdr>
+        <w:jc w:val="left"/>
+        <w:rPr>
+          <w:rFonts w:ascii="Arial" w:eastAsia="Arial" w:hAnsi="Arial" w:cs="Arial"/>
+          <w:color w:val="000000"/>
+          <w:sz w:val="22"/>
+          <w:szCs w:val="22"/>
+        </w:rPr>
+      </w:pPr>
+    </w:p>
+    <w:p>
       <w:pPr>
         <w:rPr>
           <w:rFonts w:ascii="Arial" w:eastAsia="Arial" w:hAnsi="Arial" w:cs="Arial"/>
@@ -1503,7 +1499,7 @@
         <w:t>VULCAN: Vision-Language-Model Enhanced Multi-Agent Cooperative Navigation for Indoor Fire-Disaster Response</w:t>
       </w:r>
     </w:p>
-    <w:p ns2:paraId="0000003E" ns2:textId="3BCD884C">
+    <w:p>
       <w:pPr>
         <w:rPr>
           <w:rFonts w:ascii="Arial" w:eastAsia="Arial" w:hAnsi="Arial" w:cs="Arial"/>
@@ -1520,26 +1516,26 @@
         <w:t>Shengding Liu and Qiben Yan (Michigan State University, USA)</w:t>
       </w:r>
     </w:p>
-    <w:p ns2:paraId="00000002" ns2:textId="77777777">
-      <w:pPr>
-        <w:widowControl/>
-        <w:pBdr>
-          <w:top w:val="nil"/>
-          <w:left w:val="nil"/>
-          <w:bottom w:val="nil"/>
-          <w:right w:val="nil"/>
-          <w:between w:val="nil"/>
-        </w:pBdr>
-        <w:jc w:val="left"/>
-        <w:rPr>
-          <w:rFonts w:ascii="Arial" w:eastAsia="Arial" w:hAnsi="Arial" w:cs="Arial"/>
-          <w:color w:val="000000"/>
-          <w:sz w:val="22"/>
-          <w:szCs w:val="22"/>
-        </w:rPr>
-      </w:pPr>
-    </w:p>
-    <w:p ns2:paraId="0000003C" ns2:textId="52C06159">
+    <w:p>
+      <w:pPr>
+        <w:widowControl/>
+        <w:pBdr>
+          <w:top w:val="nil"/>
+          <w:left w:val="nil"/>
+          <w:bottom w:val="nil"/>
+          <w:right w:val="nil"/>
+          <w:between w:val="nil"/>
+        </w:pBdr>
+        <w:jc w:val="left"/>
+        <w:rPr>
+          <w:rFonts w:ascii="Arial" w:eastAsia="Arial" w:hAnsi="Arial" w:cs="Arial"/>
+          <w:color w:val="000000"/>
+          <w:sz w:val="22"/>
+          <w:szCs w:val="22"/>
+        </w:rPr>
+      </w:pPr>
+    </w:p>
+    <w:p>
       <w:pPr>
         <w:rPr>
           <w:rFonts w:ascii="Arial" w:eastAsia="Arial" w:hAnsi="Arial" w:cs="Arial"/>
@@ -1560,7 +1556,7 @@
         <w:t>Rethinking IoT for Embodied AI: From Data Infrastructure to Intelligence Infrastructure</w:t>
       </w:r>
     </w:p>
-    <w:p ns2:paraId="0000003E" ns2:textId="3BCD884C">
+    <w:p>
       <w:pPr>
         <w:rPr>
           <w:rFonts w:ascii="Arial" w:eastAsia="Arial" w:hAnsi="Arial" w:cs="Arial"/>
@@ -1577,26 +1573,26 @@
         <w:t>Shuai Tong and Jiliang Wang (Tsinghua University, China)</w:t>
       </w:r>
     </w:p>
-    <w:p ns2:paraId="00000002" ns2:textId="77777777">
-      <w:pPr>
-        <w:widowControl/>
-        <w:pBdr>
-          <w:top w:val="nil"/>
-          <w:left w:val="nil"/>
-          <w:bottom w:val="nil"/>
-          <w:right w:val="nil"/>
-          <w:between w:val="nil"/>
-        </w:pBdr>
-        <w:jc w:val="left"/>
-        <w:rPr>
-          <w:rFonts w:ascii="Arial" w:eastAsia="Arial" w:hAnsi="Arial" w:cs="Arial"/>
-          <w:color w:val="000000"/>
-          <w:sz w:val="22"/>
-          <w:szCs w:val="22"/>
-        </w:rPr>
-      </w:pPr>
-    </w:p>
-    <w:p ns2:paraId="0000003C" ns2:textId="52C06159">
+    <w:p>
+      <w:pPr>
+        <w:widowControl/>
+        <w:pBdr>
+          <w:top w:val="nil"/>
+          <w:left w:val="nil"/>
+          <w:bottom w:val="nil"/>
+          <w:right w:val="nil"/>
+          <w:between w:val="nil"/>
+        </w:pBdr>
+        <w:jc w:val="left"/>
+        <w:rPr>
+          <w:rFonts w:ascii="Arial" w:eastAsia="Arial" w:hAnsi="Arial" w:cs="Arial"/>
+          <w:color w:val="000000"/>
+          <w:sz w:val="22"/>
+          <w:szCs w:val="22"/>
+        </w:rPr>
+      </w:pPr>
+    </w:p>
+    <w:p>
       <w:pPr>
         <w:rPr>
           <w:rFonts w:ascii="Arial" w:eastAsia="Arial" w:hAnsi="Arial" w:cs="Arial"/>
@@ -1617,7 +1613,7 @@
         <w:t>KV-SC: KV-Based Semantic Collaboration for Distributed Embodied Intelligence Networks</w:t>
       </w:r>
     </w:p>
-    <w:p ns2:paraId="0000003E" ns2:textId="3BCD884C">
+    <w:p>
       <w:pPr>
         <w:rPr>
           <w:rFonts w:ascii="Arial" w:eastAsia="Arial" w:hAnsi="Arial" w:cs="Arial"/>
@@ -1634,135 +1630,56 @@
         <w:t>Baoxia Du and Ruidong Li (Kanazawa University, Japan); Yinfeng Cao (The Hong Kong Polytechnic University, Hong Kong); Dusit Niyato (Nanyang Technological University, Singapore)</w:t>
       </w:r>
     </w:p>
-    <w:p ns2:paraId="00000002" ns2:textId="77777777">
-      <w:pPr>
-        <w:widowControl/>
-        <w:pBdr>
-          <w:top w:val="nil"/>
-          <w:left w:val="nil"/>
-          <w:bottom w:val="nil"/>
-          <w:right w:val="nil"/>
-          <w:between w:val="nil"/>
-        </w:pBdr>
-        <w:jc w:val="left"/>
-        <w:rPr>
-          <w:rFonts w:ascii="Arial" w:eastAsia="Arial" w:hAnsi="Arial" w:cs="Arial"/>
-          <w:color w:val="000000"/>
-          <w:sz w:val="22"/>
-          <w:szCs w:val="22"/>
-        </w:rPr>
-      </w:pPr>
-    </w:p>
-    <w:p ns2:paraId="00000035" ns2:textId="601DE829">
-      <w:pPr>
-        <w:widowControl/>
-        <w:pBdr>
-          <w:top w:val="nil"/>
-          <w:left w:val="nil"/>
-          <w:bottom w:val="nil"/>
-          <w:right w:val="nil"/>
-          <w:between w:val="nil"/>
-        </w:pBdr>
-        <w:jc w:val="left"/>
-        <w:rPr>
-          <w:rFonts w:ascii="Arial" w:eastAsia="Arial" w:hAnsi="Arial" w:cs="Arial"/>
-          <w:b/>
-          <w:color w:val="000000"/>
-          <w:sz w:val="22"/>
-          <w:szCs w:val="22"/>
-        </w:rPr>
-      </w:pPr>
-      <w:r>
-        <w:rPr>
-          <w:rFonts w:ascii="Arial" w:eastAsia="Arial" w:hAnsi="Arial" w:cs="Arial"/>
-          <w:b/>
-          <w:color w:val="000000"/>
-          <w:sz w:val="22"/>
-          <w:szCs w:val="22"/>
-        </w:rPr>
-        <w:t>5:00 p.m. - 5:15 p.m.</w:t>
-      </w:r>
-    </w:p>
-    <w:p ns2:paraId="00000036" ns2:textId="77777777">
-      <w:pPr>
-        <w:widowControl/>
-        <w:pBdr>
-          <w:top w:val="nil"/>
-          <w:left w:val="nil"/>
-          <w:bottom w:val="nil"/>
-          <w:right w:val="nil"/>
-          <w:between w:val="nil"/>
-        </w:pBdr>
-        <w:jc w:val="left"/>
-        <w:rPr>
-          <w:rFonts w:ascii="Arial" w:eastAsia="Arial" w:hAnsi="Arial" w:cs="Arial"/>
-          <w:b/>
-          <w:color w:val="000000"/>
-          <w:sz w:val="22"/>
-          <w:szCs w:val="22"/>
-        </w:rPr>
-      </w:pPr>
-      <w:r>
-        <w:rPr>
-          <w:rFonts w:ascii="Arial" w:eastAsia="Arial" w:hAnsi="Arial" w:cs="Arial"/>
-          <w:b/>
-          <w:color w:val="000000"/>
-          <w:sz w:val="22"/>
-          <w:szCs w:val="22"/>
-        </w:rPr>
-        <w:t>Coffee and tea break</w:t>
-      </w:r>
-    </w:p>
-    <w:p ns2:paraId="00000002" ns2:textId="77777777">
-      <w:pPr>
-        <w:widowControl/>
-        <w:pBdr>
-          <w:top w:val="nil"/>
-          <w:left w:val="nil"/>
-          <w:bottom w:val="nil"/>
-          <w:right w:val="nil"/>
-          <w:between w:val="nil"/>
-        </w:pBdr>
-        <w:jc w:val="left"/>
-        <w:rPr>
-          <w:rFonts w:ascii="Arial" w:eastAsia="Arial" w:hAnsi="Arial" w:cs="Arial"/>
-          <w:color w:val="000000"/>
-          <w:sz w:val="22"/>
-          <w:szCs w:val="22"/>
-        </w:rPr>
-      </w:pPr>
-    </w:p>
-    <w:p ns2:paraId="00000035" ns2:textId="601DE829">
-      <w:pPr>
-        <w:widowControl/>
-        <w:pBdr>
-          <w:top w:val="nil"/>
-          <w:left w:val="nil"/>
-          <w:bottom w:val="nil"/>
-          <w:right w:val="nil"/>
-          <w:between w:val="nil"/>
-        </w:pBdr>
-        <w:jc w:val="left"/>
-        <w:rPr>
-          <w:rFonts w:ascii="Arial" w:eastAsia="Arial" w:hAnsi="Arial" w:cs="Arial"/>
-          <w:b/>
-          <w:color w:val="000000"/>
-          <w:sz w:val="22"/>
-          <w:szCs w:val="22"/>
-        </w:rPr>
-      </w:pPr>
-      <w:r>
-        <w:rPr>
-          <w:rFonts w:ascii="Arial" w:eastAsia="Arial" w:hAnsi="Arial" w:cs="Arial"/>
-          <w:b/>
-          <w:color w:val="000000"/>
-          <w:sz w:val="22"/>
-          <w:szCs w:val="22"/>
-        </w:rPr>
-        <w:t>5:15 p.m. - 5:55 p.m.</w:t>
-      </w:r>
-    </w:p>
-    <w:p ns2:paraId="0000003A" ns2:textId="7E66E165">
+    <w:p>
+      <w:pPr>
+        <w:widowControl/>
+        <w:pBdr>
+          <w:top w:val="nil"/>
+          <w:left w:val="nil"/>
+          <w:bottom w:val="nil"/>
+          <w:right w:val="nil"/>
+          <w:between w:val="nil"/>
+        </w:pBdr>
+        <w:jc w:val="left"/>
+        <w:rPr>
+          <w:rFonts w:ascii="Arial" w:eastAsia="Arial" w:hAnsi="Arial" w:cs="Arial"/>
+          <w:color w:val="000000"/>
+          <w:sz w:val="22"/>
+          <w:szCs w:val="22"/>
+        </w:rPr>
+      </w:pPr>
+    </w:p>
+    <w:p>
+      <w:pPr>
+        <w:widowControl/>
+        <w:pBdr>
+          <w:top w:val="nil"/>
+          <w:left w:val="nil"/>
+          <w:bottom w:val="nil"/>
+          <w:right w:val="nil"/>
+          <w:between w:val="nil"/>
+        </w:pBdr>
+        <w:jc w:val="left"/>
+        <w:rPr>
+          <w:rFonts w:ascii="Arial" w:eastAsia="Arial" w:hAnsi="Arial" w:cs="Arial"/>
+          <w:b/>
+          <w:color w:val="000000"/>
+          <w:sz w:val="22"/>
+          <w:szCs w:val="22"/>
+        </w:rPr>
+      </w:pPr>
+      <w:r>
+        <w:rPr>
+          <w:rFonts w:ascii="Arial" w:eastAsia="Arial" w:hAnsi="Arial" w:cs="Arial"/>
+          <w:b/>
+          <w:color w:val="000000"/>
+          <w:sz w:val="22"/>
+          <w:szCs w:val="22"/>
+        </w:rPr>
+        <w:t>5:00 p.m. - 6:00 p.m.</w:t>
+      </w:r>
+    </w:p>
+    <w:p>
       <w:pPr>
         <w:widowControl/>
         <w:pBdr>
@@ -1792,26 +1709,26 @@
         <w:t>Session III: Systems, Security, and Optimization for Embodied AI Infrastructure</w:t>
       </w:r>
     </w:p>
-    <w:p ns2:paraId="00000002" ns2:textId="77777777">
-      <w:pPr>
-        <w:widowControl/>
-        <w:pBdr>
-          <w:top w:val="nil"/>
-          <w:left w:val="nil"/>
-          <w:bottom w:val="nil"/>
-          <w:right w:val="nil"/>
-          <w:between w:val="nil"/>
-        </w:pBdr>
-        <w:jc w:val="left"/>
-        <w:rPr>
-          <w:rFonts w:ascii="Arial" w:eastAsia="Arial" w:hAnsi="Arial" w:cs="Arial"/>
-          <w:color w:val="000000"/>
-          <w:sz w:val="22"/>
-          <w:szCs w:val="22"/>
-        </w:rPr>
-      </w:pPr>
-    </w:p>
-    <w:p ns2:paraId="0000003C" ns2:textId="52C06159">
+    <w:p>
+      <w:pPr>
+        <w:widowControl/>
+        <w:pBdr>
+          <w:top w:val="nil"/>
+          <w:left w:val="nil"/>
+          <w:bottom w:val="nil"/>
+          <w:right w:val="nil"/>
+          <w:between w:val="nil"/>
+        </w:pBdr>
+        <w:jc w:val="left"/>
+        <w:rPr>
+          <w:rFonts w:ascii="Arial" w:eastAsia="Arial" w:hAnsi="Arial" w:cs="Arial"/>
+          <w:color w:val="000000"/>
+          <w:sz w:val="22"/>
+          <w:szCs w:val="22"/>
+        </w:rPr>
+      </w:pPr>
+    </w:p>
+    <w:p>
       <w:pPr>
         <w:rPr>
           <w:rFonts w:ascii="Arial" w:eastAsia="Arial" w:hAnsi="Arial" w:cs="Arial"/>
@@ -1832,7 +1749,7 @@
         <w:t>Jiao: Bridging Isolation and Customization in Mixed Criticality Robotics</w:t>
       </w:r>
     </w:p>
-    <w:p ns2:paraId="0000003E" ns2:textId="3BCD884C">
+    <w:p>
       <w:pPr>
         <w:rPr>
           <w:rFonts w:ascii="Arial" w:eastAsia="Arial" w:hAnsi="Arial" w:cs="Arial"/>
@@ -1849,26 +1766,26 @@
         <w:t>James Yen, ZhiBai Huang and Zhixiang Wei (Shanghai Jiaotong University, China); Tinghao Yi, Shupeng Zeng and Liang Pang (Openmind, China); Songtao Xue (Shanghai Jiaotong University, China); Zhengwei Qi (Shanghai Jiao Tong University, China)</w:t>
       </w:r>
     </w:p>
-    <w:p ns2:paraId="00000002" ns2:textId="77777777">
-      <w:pPr>
-        <w:widowControl/>
-        <w:pBdr>
-          <w:top w:val="nil"/>
-          <w:left w:val="nil"/>
-          <w:bottom w:val="nil"/>
-          <w:right w:val="nil"/>
-          <w:between w:val="nil"/>
-        </w:pBdr>
-        <w:jc w:val="left"/>
-        <w:rPr>
-          <w:rFonts w:ascii="Arial" w:eastAsia="Arial" w:hAnsi="Arial" w:cs="Arial"/>
-          <w:color w:val="000000"/>
-          <w:sz w:val="22"/>
-          <w:szCs w:val="22"/>
-        </w:rPr>
-      </w:pPr>
-    </w:p>
-    <w:p ns2:paraId="0000003C" ns2:textId="52C06159">
+    <w:p>
+      <w:pPr>
+        <w:widowControl/>
+        <w:pBdr>
+          <w:top w:val="nil"/>
+          <w:left w:val="nil"/>
+          <w:bottom w:val="nil"/>
+          <w:right w:val="nil"/>
+          <w:between w:val="nil"/>
+        </w:pBdr>
+        <w:jc w:val="left"/>
+        <w:rPr>
+          <w:rFonts w:ascii="Arial" w:eastAsia="Arial" w:hAnsi="Arial" w:cs="Arial"/>
+          <w:color w:val="000000"/>
+          <w:sz w:val="22"/>
+          <w:szCs w:val="22"/>
+        </w:rPr>
+      </w:pPr>
+    </w:p>
+    <w:p>
       <w:pPr>
         <w:rPr>
           <w:rFonts w:ascii="Arial" w:eastAsia="Arial" w:hAnsi="Arial" w:cs="Arial"/>
@@ -1889,7 +1806,7 @@
         <w:t>MEC-based HFL: A Fair Aggregation Approach for Non-IID Data via Minimum Enclosing Circle</w:t>
       </w:r>
     </w:p>
-    <w:p ns2:paraId="0000003E" ns2:textId="3BCD884C">
+    <w:p>
       <w:pPr>
         <w:rPr>
           <w:rFonts w:ascii="Arial" w:eastAsia="Arial" w:hAnsi="Arial" w:cs="Arial"/>
@@ -1906,26 +1823,26 @@
         <w:t>Fan-Hsun Tseng, Jiang-Yi Zeng and Yu-Teng Lai (National Cheng Kung University, Taiwan); Hsin-Hung Cho and Chi-Yuan Chen (National Ilan University, Taiwan)</w:t>
       </w:r>
     </w:p>
-    <w:p ns2:paraId="00000002" ns2:textId="77777777">
-      <w:pPr>
-        <w:widowControl/>
-        <w:pBdr>
-          <w:top w:val="nil"/>
-          <w:left w:val="nil"/>
-          <w:bottom w:val="nil"/>
-          <w:right w:val="nil"/>
-          <w:between w:val="nil"/>
-        </w:pBdr>
-        <w:jc w:val="left"/>
-        <w:rPr>
-          <w:rFonts w:ascii="Arial" w:eastAsia="Arial" w:hAnsi="Arial" w:cs="Arial"/>
-          <w:color w:val="000000"/>
-          <w:sz w:val="22"/>
-          <w:szCs w:val="22"/>
-        </w:rPr>
-      </w:pPr>
-    </w:p>
-    <w:p ns2:paraId="0000003C" ns2:textId="52C06159">
+    <w:p>
+      <w:pPr>
+        <w:widowControl/>
+        <w:pBdr>
+          <w:top w:val="nil"/>
+          <w:left w:val="nil"/>
+          <w:bottom w:val="nil"/>
+          <w:right w:val="nil"/>
+          <w:between w:val="nil"/>
+        </w:pBdr>
+        <w:jc w:val="left"/>
+        <w:rPr>
+          <w:rFonts w:ascii="Arial" w:eastAsia="Arial" w:hAnsi="Arial" w:cs="Arial"/>
+          <w:color w:val="000000"/>
+          <w:sz w:val="22"/>
+          <w:szCs w:val="22"/>
+        </w:rPr>
+      </w:pPr>
+    </w:p>
+    <w:p>
       <w:pPr>
         <w:rPr>
           <w:rFonts w:ascii="Arial" w:eastAsia="Arial" w:hAnsi="Arial" w:cs="Arial"/>
@@ -1946,7 +1863,7 @@
         <w:t>Towards Operating System Automated Optimization via System Knowledge and Tunability Embedding</w:t>
       </w:r>
     </w:p>
-    <w:p ns2:paraId="0000003E" ns2:textId="3BCD884C">
+    <w:p>
       <w:pPr>
         <w:rPr>
           <w:rFonts w:ascii="Arial" w:eastAsia="Arial" w:hAnsi="Arial" w:cs="Arial"/>
@@ -1963,26 +1880,26 @@
         <w:t>Yuxin Ren, Donghui Chen, Yun Hao, Nan Zhang, Zhipeng Xie, Yanqiang Liu, Bo Wan, Bo Zhang, Xu Wang, Wanming Hu, Haili Bai, Ning Jia and Xinwei Hu (Huawei Technologies, China)</w:t>
       </w:r>
     </w:p>
-    <w:p ns2:paraId="00000002" ns2:textId="77777777">
-      <w:pPr>
-        <w:widowControl/>
-        <w:pBdr>
-          <w:top w:val="nil"/>
-          <w:left w:val="nil"/>
-          <w:bottom w:val="nil"/>
-          <w:right w:val="nil"/>
-          <w:between w:val="nil"/>
-        </w:pBdr>
-        <w:jc w:val="left"/>
-        <w:rPr>
-          <w:rFonts w:ascii="Arial" w:eastAsia="Arial" w:hAnsi="Arial" w:cs="Arial"/>
-          <w:color w:val="000000"/>
-          <w:sz w:val="22"/>
-          <w:szCs w:val="22"/>
-        </w:rPr>
-      </w:pPr>
-    </w:p>
-    <w:p ns2:paraId="0000003C" ns2:textId="52C06159">
+    <w:p>
+      <w:pPr>
+        <w:widowControl/>
+        <w:pBdr>
+          <w:top w:val="nil"/>
+          <w:left w:val="nil"/>
+          <w:bottom w:val="nil"/>
+          <w:right w:val="nil"/>
+          <w:between w:val="nil"/>
+        </w:pBdr>
+        <w:jc w:val="left"/>
+        <w:rPr>
+          <w:rFonts w:ascii="Arial" w:eastAsia="Arial" w:hAnsi="Arial" w:cs="Arial"/>
+          <w:color w:val="000000"/>
+          <w:sz w:val="22"/>
+          <w:szCs w:val="22"/>
+        </w:rPr>
+      </w:pPr>
+    </w:p>
+    <w:p>
       <w:pPr>
         <w:rPr>
           <w:rFonts w:ascii="Arial" w:eastAsia="Arial" w:hAnsi="Arial" w:cs="Arial"/>
@@ -2003,103 +1920,104 @@
         <w:t>Multimodal Behavioral PUF Authentication for Physical AI Robots Combining Electromechanical Actuation and Computational Load Signatures</w:t>
       </w:r>
     </w:p>
-    <w:p ns2:paraId="0000003E" ns2:textId="3BCD884C">
-      <w:pPr>
-        <w:rPr>
-          <w:rFonts w:ascii="Arial" w:eastAsia="Arial" w:hAnsi="Arial" w:cs="Arial"/>
-          <w:sz w:val="22"/>
-          <w:szCs w:val="22"/>
-        </w:rPr>
-      </w:pPr>
-      <w:r>
-        <w:rPr>
-          <w:rFonts w:ascii="Arial" w:eastAsia="Arial" w:hAnsi="Arial" w:cs="Arial"/>
-          <w:sz w:val="22"/>
-          <w:szCs w:val="22"/>
-        </w:rPr>
+    <w:p>
+      <w:pPr>
+        <w:rPr>
+          <w:rFonts w:ascii="Arial" w:eastAsia="Arial" w:hAnsi="Arial" w:cs="Arial"/>
+          <w:sz w:val="22"/>
+          <w:szCs w:val="22"/>
+        </w:rPr>
+      </w:pPr>
+      <w:r>
+        <w:rPr>
+          <w:rFonts w:ascii="Arial" w:eastAsia="Arial" w:hAnsi="Arial" w:cs="Arial"/>
+          <w:sz w:val="22"/>
+          <w:szCs w:val="22"/>
+        </w:rPr>
+        <w:lastRenderedPageBreak/>
         <w:t>Jiho Lee, Jaehyung Jeong, Jayeon Pyo and JaeSeung Song (Sejong University, Korea (South))</w:t>
       </w:r>
     </w:p>
-    <w:p ns2:paraId="00000002" ns2:textId="77777777">
-      <w:pPr>
-        <w:widowControl/>
-        <w:pBdr>
-          <w:top w:val="nil"/>
-          <w:left w:val="nil"/>
-          <w:bottom w:val="nil"/>
-          <w:right w:val="nil"/>
-          <w:between w:val="nil"/>
-        </w:pBdr>
-        <w:jc w:val="left"/>
-        <w:rPr>
-          <w:rFonts w:ascii="Arial" w:eastAsia="Arial" w:hAnsi="Arial" w:cs="Arial"/>
-          <w:color w:val="000000"/>
-          <w:sz w:val="22"/>
-          <w:szCs w:val="22"/>
-        </w:rPr>
-      </w:pPr>
-    </w:p>
-    <w:p ns2:paraId="00000035" ns2:textId="601DE829">
-      <w:pPr>
-        <w:widowControl/>
-        <w:pBdr>
-          <w:top w:val="nil"/>
-          <w:left w:val="nil"/>
-          <w:bottom w:val="nil"/>
-          <w:right w:val="nil"/>
-          <w:between w:val="nil"/>
-        </w:pBdr>
-        <w:jc w:val="left"/>
-        <w:rPr>
-          <w:rFonts w:ascii="Arial" w:eastAsia="Arial" w:hAnsi="Arial" w:cs="Arial"/>
-          <w:b/>
-          <w:color w:val="000000"/>
-          <w:sz w:val="22"/>
-          <w:szCs w:val="22"/>
-        </w:rPr>
-      </w:pPr>
-      <w:r>
-        <w:rPr>
-          <w:rFonts w:ascii="Arial" w:eastAsia="Arial" w:hAnsi="Arial" w:cs="Arial"/>
-          <w:b/>
-          <w:color w:val="000000"/>
-          <w:sz w:val="22"/>
-          <w:szCs w:val="22"/>
-        </w:rPr>
-        <w:t>5:55 p.m. - 6:00 p.m.</w:t>
-      </w:r>
-    </w:p>
-    <w:p ns2:paraId="00000036" ns2:textId="77777777">
-      <w:pPr>
-        <w:widowControl/>
-        <w:pBdr>
-          <w:top w:val="nil"/>
-          <w:left w:val="nil"/>
-          <w:bottom w:val="nil"/>
-          <w:right w:val="nil"/>
-          <w:between w:val="nil"/>
-        </w:pBdr>
-        <w:jc w:val="left"/>
-        <w:rPr>
-          <w:rFonts w:ascii="Arial" w:eastAsia="Arial" w:hAnsi="Arial" w:cs="Arial"/>
-          <w:b/>
-          <w:color w:val="000000"/>
-          <w:sz w:val="22"/>
-          <w:szCs w:val="22"/>
-        </w:rPr>
-      </w:pPr>
-      <w:r>
-        <w:rPr>
-          <w:rFonts w:ascii="Arial" w:eastAsia="Arial" w:hAnsi="Arial" w:cs="Arial"/>
-          <w:b/>
-          <w:color w:val="000000"/>
-          <w:sz w:val="22"/>
-          <w:szCs w:val="22"/>
-        </w:rPr>
-        <w:t>Closing remarks</w:t>
-      </w:r>
-    </w:p>
-    <w:p ns2:paraId="00000005" ns2:textId="5320E81A">
+    <w:p>
+      <w:pPr>
+        <w:widowControl/>
+        <w:pBdr>
+          <w:top w:val="nil"/>
+          <w:left w:val="nil"/>
+          <w:bottom w:val="nil"/>
+          <w:right w:val="nil"/>
+          <w:between w:val="nil"/>
+        </w:pBdr>
+        <w:jc w:val="left"/>
+        <w:rPr>
+          <w:rFonts w:ascii="Arial" w:eastAsia="Arial" w:hAnsi="Arial" w:cs="Arial"/>
+          <w:color w:val="000000"/>
+          <w:sz w:val="22"/>
+          <w:szCs w:val="22"/>
+        </w:rPr>
+      </w:pPr>
+    </w:p>
+    <w:p>
+      <w:pPr>
+        <w:widowControl/>
+        <w:pBdr>
+          <w:top w:val="nil"/>
+          <w:left w:val="nil"/>
+          <w:bottom w:val="nil"/>
+          <w:right w:val="nil"/>
+          <w:between w:val="nil"/>
+        </w:pBdr>
+        <w:jc w:val="left"/>
+        <w:rPr>
+          <w:rFonts w:ascii="Arial" w:eastAsia="Arial" w:hAnsi="Arial" w:cs="Arial"/>
+          <w:b/>
+          <w:color w:val="000000"/>
+          <w:sz w:val="22"/>
+          <w:szCs w:val="22"/>
+        </w:rPr>
+      </w:pPr>
+      <w:r>
+        <w:rPr>
+          <w:rFonts w:ascii="Arial" w:eastAsia="Arial" w:hAnsi="Arial" w:cs="Arial"/>
+          <w:b/>
+          <w:color w:val="000000"/>
+          <w:sz w:val="22"/>
+          <w:szCs w:val="22"/>
+        </w:rPr>
+        <w:t>6:00 p.m. - 6:05 p.m.</w:t>
+      </w:r>
+    </w:p>
+    <w:p>
+      <w:pPr>
+        <w:widowControl/>
+        <w:pBdr>
+          <w:top w:val="nil"/>
+          <w:left w:val="nil"/>
+          <w:bottom w:val="nil"/>
+          <w:right w:val="nil"/>
+          <w:between w:val="nil"/>
+        </w:pBdr>
+        <w:jc w:val="left"/>
+        <w:rPr>
+          <w:rFonts w:ascii="Arial" w:eastAsia="Arial" w:hAnsi="Arial" w:cs="Arial"/>
+          <w:b/>
+          <w:color w:val="000000"/>
+          <w:sz w:val="22"/>
+          <w:szCs w:val="22"/>
+        </w:rPr>
+      </w:pPr>
+      <w:r>
+        <w:rPr>
+          <w:rFonts w:ascii="Arial" w:eastAsia="Arial" w:hAnsi="Arial" w:cs="Arial"/>
+          <w:b/>
+          <w:color w:val="000000"/>
+          <w:sz w:val="22"/>
+          <w:szCs w:val="22"/>
+        </w:rPr>
+        <w:t>Closing Remarks</w:t>
+      </w:r>
+    </w:p>
+    <w:p>
       <w:pPr>
         <w:widowControl/>
         <w:spacing w:before="280" w:after="280"/>
@@ -2115,10 +2033,10 @@
           <w:sz w:val="22"/>
           <w:szCs w:val="22"/>
         </w:rPr>
-        <w:t>Baochun Li, General Chair, will conclude the workshop and thank participants, speakers, and organizers.</w:t>
-      </w:r>
-    </w:p>
-    <w:p ns2:paraId="00000002" ns2:textId="77777777">
+        <w:t>Baochun Li (University of Toronto, General Chair)</w:t>
+      </w:r>
+    </w:p>
+    <w:p>
       <w:pPr>
         <w:widowControl/>
         <w:pBdr>
@@ -2152,7 +2070,7 @@
   <w:docDefaults>
     <w:rPrDefault>
       <w:rPr>
-        <w:rFonts w:ascii="等线" w:eastAsia="等线" w:hAnsi="等线" w:cs="等线"/>
+        <w:rFonts w:ascii="DengXian" w:eastAsia="DengXian" w:hAnsi="DengXian" w:cs="DengXian"/>
         <w:sz w:val="21"/>
         <w:szCs w:val="21"/>
         <w:lang w:val="en-US" w:eastAsia="zh-CN" w:bidi="ar-SA"/>
@@ -2676,6 +2594,7 @@
   <w:style w:type="character" w:default="1" w:styleId="DefaultParagraphFont">
     <w:name w:val="Default Paragraph Font"/>
     <w:uiPriority w:val="1"/>
+    <w:semiHidden/>
     <w:unhideWhenUsed/>
   </w:style>
   <w:style w:type="table" w:default="1" w:styleId="TableNormal">
@@ -2744,7 +2663,7 @@
       <w:jc w:val="left"/>
     </w:pPr>
     <w:rPr>
-      <w:rFonts w:ascii="宋体" w:eastAsia="宋体" w:hAnsi="宋体" w:cs="宋体"/>
+      <w:rFonts w:ascii="SimSun" w:eastAsia="SimSun" w:hAnsi="SimSun" w:cs="SimSun"/>
       <w:sz w:val="24"/>
       <w:szCs w:val="24"/>
     </w:rPr>

</xml_diff>